<commit_message>
docs: duaas.docx regenere post-v1495 (jours 21,58,73,174,187,218,239 corriges)
Co-Authored-By: Claude Opus 4.6 (1M context) <noreply@anthropic.com>
</commit_message>
<xml_diff>
--- a/ECRITS_NIYYAH/duaas.docx
+++ b/ECRITS_NIYYAH/duaas.docx
@@ -1850,7 +1850,7 @@
           <w:sz w:val="20"/>
           <w:szCs w:val="20"/>
         </w:rPr>
-        <w:t xml:space="preserve">Sahih Bukhari 5743 / Sahih Muslim 2191 Sahih</w:t>
+        <w:t xml:space="preserve">Abu Dawud 3106, Tirmidhi 2083, Bukhari 5743 (visite des malades) Sahih Sahih</w:t>
       </w:r>
     </w:p>
     <w:p>
@@ -5269,7 +5269,7 @@
           <w:sz w:val="22"/>
           <w:szCs w:val="22"/>
         </w:rPr>
-        <w:t xml:space="preserve">At-tahiyyât est l’invocation centrale de chaque prière musulmane, récitée assis entre les unités. C’est le tashahhud rapporté par Ibn Mas’ud : « Les salutations sont à Allâh, ainsi que les actes d’adoration et les bonnes paroles. Que la paix soit sur toi, ô Prophète, ainsi que la miséricorde d’Allâh et Ses bénédictions. Que la paix soit sur nous et sur les serviteurs vertueux d’Allâh. J’atteste qu’il n’y a de divinité qu’Allâh, et j’atteste que Muhammad est Son serviteur et Messager. »</w:t>
+        <w:t xml:space="preserve">Ibn Mas’ûd l’a appris du Prophète ﷺ qui le lui enseignait paume contre paume, comme on enseigne un verset du Coran. Cette du’a se prononce assis, entre les rakaa et à la fin. C’est l’audience la plus intime de toute la prière. At-tahiyyâtu lillāh — toutes les salutations vont à Allah. As-salāmu ’alayka ayyuhā an-nabiyy — paix sur toi, ô Prophète. Phrase étrange, où l’on s’adresse directement au Messager ﷺ comme s’il était présent. Les savants ont expliqué : pendant le tashahhud, le serviteur s’adresse à Allah, puis au Prophète ﷺ par cette parole d’amour, puis à lui-même et aux serviteurs vertueux. Trois directions en quelques lignes. Et c’est seulement après avoir salué ainsi qu’on témoigne — j’atteste qu’il n’y a de divinité qu’Allah, et que Muhammad est Son serviteur et Son messager. La shahada à la fin, comme un sceau apposé sur tout ce qui précède.</w:t>
       </w:r>
     </w:p>
     <w:p>
@@ -6582,7 +6582,7 @@
           <w:sz w:val="20"/>
           <w:szCs w:val="20"/>
         </w:rPr>
-        <w:t xml:space="preserve">Abu Dawud 5105, Tirmidhi 1514 Hasan (débattu)</w:t>
+        <w:t xml:space="preserve">Abu Dawud 5105, Tirmidhi 1514 (chaîne classée da’if par la majorité des muhadditîn modernes, pratique populaire largement transmise dans la tradition) Hasan (débattu)</w:t>
       </w:r>
     </w:p>
     <w:p>
@@ -15825,7 +15825,7 @@
           <w:sz w:val="22"/>
           <w:szCs w:val="22"/>
         </w:rPr>
-        <w:t xml:space="preserve">Cette formule de louange est l'une des plus profondes transmises. Une femme vint au Prophète ﷺ et dit : ô Messager d'Allah, j'ai juré de louer Allah comme il convient à Sa majesté. Le Prophète ﷺ sourit et dit : aucune créature ne peut louer Allah comme il convient à Sa majesté — Lui seul peut Se louer Lui-même comme il Le mérite. Mais il enseigna cette formule, qui contourne le problème par l'humilité. Tu ne déclares pas pouvoir louer comme il convient — tu déclares que la louange T'appartient à la mesure qui Te convient. Tu ne dis pas je T'aime — tu dis l'amour T'est dû à la mesure de ce que Tu es. Tu reconnais l'impossibilité de ton geste et tu confies à Sa propre louange. C'est ainsi qu'Allah finit par accepter cette louange comme valant celle qu'on ne peut formuler. Phrase paradoxale et profonde. Pour ce jour 180 — exactement à mi-parcours du dataset (365 / 2 = 182.5, on est proche du milieu) — cette formule est juste. Tu n'as pas réussi à louer Allah comme il convient pendant ces six premiers mois. Tu n'y arriveras pas pendant les six suivants. Personne n'y arrive jamais. La louange parfaite est impossible. Mais tu peux dire — laka al-hamdu kamā yanbaghī lijalāli wajhika. Et Allah, par Sa miséricorde, accepte cette louange comme si elle était parfaite. Pour ce jour de mi-chemin, cette du'a est une halte. Pas un constat de réussite. Un acte d'humilité maximale. Tu n'as rien accompli. Tu as juste reçu ce qui était donné. Et tu remercies pour avoir reçu, à la mesure de ce que tu es — c'est-à-dire dans la pauvreté humaine — pour ce qu'Il est — c'est-à-dire dans la richesse divine.</w:t>
+        <w:t xml:space="preserve">Cette formule de louange est l'une des plus profondes transmises. Une femme vint au Prophète ﷺ et dit : ô Messager d'Allah, j'ai juré de louer Allah comme il convient à Sa majesté. Le Prophète ﷺ sourit et dit : aucune créature ne peut louer Allah comme il convient à Sa majesté — Lui seul peut Se louer Lui-même comme il Le mérite. Mais il enseigna cette formule, qui contourne le problème par l'humilité. Tu ne déclares pas pouvoir louer comme il convient — tu déclares que la louange T'appartient à la mesure qui Te convient. Tu ne dis pas je T'aime — tu dis l'amour T'est dû à la mesure de ce que Tu es. Tu reconnais l'impossibilité de ton geste et tu confies à Sa propre louange. C'est ainsi qu'Allah finit par accepter cette louange comme valant celle qu'on ne peut formuler. Phrase paradoxale et profonde. Pour ce jour 174 — à mi-parcours du chemin — cette formule est juste. Tu n'as pas réussi à louer Allah comme il convient pendant ces six premiers mois. Tu n'y arriveras pas pendant les six suivants. Personne n'y arrive jamais. La louange parfaite est impossible. Mais tu peux dire — laka al-hamdu kamā yanbaghī lijalāli wajhika. Et Allah, par Sa miséricorde, accepte cette louange comme si elle était parfaite. Pour ce jour de mi-chemin, cette du'a est une halte. Pas un constat de réussite. Un acte d'humilité maximale. Tu n'as rien accompli. Tu as juste reçu ce qui était donné. Et tu remercies pour avoir reçu, à la mesure de ce que tu es — c'est-à-dire dans la pauvreté humaine — pour ce qu'Il est — c'est-à-dire dans la richesse divine.</w:t>
       </w:r>
     </w:p>
     <w:p>
@@ -17008,7 +17008,7 @@
           <w:sz w:val="22"/>
           <w:szCs w:val="22"/>
         </w:rPr>
-        <w:t xml:space="preserve">Phrase coranique répétée à plusieurs endroits — sourate Al-Bayyina verset 8, sourate At-Tawba verset 100, et d'autres. Elle décrit l'état final des élus dans le Paradis. Allah est satisfait d'eux. Et ils sont satisfaits de Lui. Double agréation. Le Coran utilise cette description pour les premiers musulmans, pour les vertueux en général, pour ceux qui auront mérité le Paradis. Que veut dire qu'Allah soit satisfait de quelqu'un ? Cela veut dire que Sa volonté à son sujet est apaisée. Il ne lui reproche plus rien. Il l'aime. Il l'a accepté. C'est le plus haut état imaginable pour un serviteur. Le Paradis lui-même est une conséquence — quand Allah est satisfait, le Paradis suit. Mais ce qui compte d'abord, c'est l'agréation divine. Le Prophète ﷺ a dit qu'Allah dira aux gens du Paradis : Je suis satisfait de vous et Je ne serai jamais plus en colère contre vous. Phrase qui efface toute peur résiduelle. Tu es définitivement acquis. Et le second mouvement — ils sont satisfaits de Lui. Phrase étonnante. Bien sûr ils sont satisfaits, dirait-on — comment ne pas l'être ? Mais le Coran prend la peine de le préciser. C'est-à-dire qu'on cherche aussi la satisfaction du serviteur, pas seulement celle du Seigneur. Allah veut que ceux qu'Il aime soient pleinement satisfaits de leur sort. Pas obligés. Pas résignés. Pleinement contents. Cette double satisfaction est l'objectif final de toute vie spirituelle. Vivre maintenant en travaillant pour ce moment où Allah dira de toi — je suis satisfait. Et où toi, posant les yeux sur ce que tu auras reçu, tu diras — je suis satisfait. Pour ce jour 199, à la veille du 200 — du seuil — cette phrase est juste. Elle replace tout l'effort dans son objectif final.</w:t>
+        <w:t xml:space="preserve">Phrase coranique répétée à plusieurs endroits — sourate Al-Bayyina verset 8, sourate At-Tawba verset 100, et d'autres. Elle décrit l'état final des élus dans le Paradis. Allah est satisfait d'eux. Et ils sont satisfaits de Lui. Double agréation. Le Coran utilise cette description pour les premiers musulmans, pour les vertueux en général, pour ceux qui auront mérité le Paradis. Que veut dire qu'Allah soit satisfait de quelqu'un ? Cela veut dire que Sa volonté à son sujet est apaisée. Il ne lui reproche plus rien. Il l'aime. Il l'a accepté. C'est le plus haut état imaginable pour un serviteur. Le Paradis lui-même est une conséquence — quand Allah est satisfait, le Paradis suit. Mais ce qui compte d'abord, c'est l'agréation divine. Le Prophète ﷺ a dit qu'Allah dira aux gens du Paradis : Je suis satisfait de vous et Je ne serai jamais plus en colère contre vous. Phrase qui efface toute peur résiduelle. Tu es définitivement acquis. Et le second mouvement — ils sont satisfaits de Lui. Phrase étonnante. Bien sûr ils sont satisfaits, dirait-on — comment ne pas l'être ? Mais le Coran prend la peine de le préciser. C'est-à-dire qu'on cherche aussi la satisfaction du serviteur, pas seulement celle du Seigneur. Allah veut que ceux qu'Il aime soient pleinement satisfaits de leur sort. Pas obligés. Pas résignés. Pleinement contents. Cette double satisfaction est l'objectif final de toute vie spirituelle. Vivre maintenant en travaillant pour ce moment où Allah dira de toi — je suis satisfait. Et où toi, posant les yeux sur ce que tu auras reçu, tu diras — je suis satisfait. Pour ce jour 187, cette phrase est juste. Elle replace tout l'effort dans son objectif final.</w:t>
       </w:r>
     </w:p>
     <w:p>
@@ -21740,7 +21740,7 @@
           <w:sz w:val="22"/>
           <w:szCs w:val="22"/>
         </w:rPr>
-        <w:t xml:space="preserve">Phrase libre qui s'enracine dans le hadith célèbre du Prophète ﷺ. Que celui qui croit en Allah et au Jour Dernier dise du bien ou se taise. Hadith d'une simplicité radicale. Deux options seulement. Le bien — ou le silence. Pas de troisième possibilité. La parole inutile, la parole moyenne, la parole non-mauvaise mais non-bonne — tout cela n'a pas sa place. Une parole qui n'apporte pas du bien doit céder au silence. Cette règle est exigeante. La plupart des conversations modernes ne respectent pas. On parle pour parler. On comble les silences. On bavarde. Toute cette production langagière passe sans laisser de trace, mais elle compte. Chaque parole est notée. Chaque mot dit sera demandé. Le Coran dit qu'aucune parole ne sort sans qu'un ange ne l'inscrive. Imagine ton compte au Jour du Compte si tu pouvais voir la liste de toutes tes paroles. Combien de paroles utiles ? Combien de paroles neutres ? Combien de paroles nuisibles ? Beaucoup seraient stupéfaits par la disproportion. Cette du'a est l'antidote. Deux demandes. Première — 'hfaz lisānī mina al-fudūl. Préserve ma langue de la parole superflue. Le mot fudūl — ce qui est en trop, le superflu. La parole en trop, c'est tout ce qui dépasse l'utile. Tu demandes la protection contre ce débordement. Deuxième — wa alhimnī as-sukūta idhā kāna khayran. Inspire-moi le silence quand il est meilleur. Demande remarquable. Le silence n'est pas toujours bon — parfois il est lâcheté ou trahison (jour 296). Mais souvent, il est meilleur que la parole. Tu demandes à Allah l'inspiration du discernement — quand parler, quand se taire. Et tu demandes la grâce du silence quand il s'impose, parce que le silence est parfois plus dur que la parole. Cette pratique transforme la qualité des conversations.</w:t>
+        <w:t xml:space="preserve">Phrase libre qui s'enracine dans le hadith célèbre du Prophète ﷺ. Que celui qui croit en Allah et au Jour Dernier dise du bien ou se taise. Hadith d'une simplicité radicale. Deux options seulement. Le bien — ou le silence. Pas de troisième possibilité. La parole inutile, la parole moyenne, la parole non-mauvaise mais non-bonne — tout cela n'a pas sa place. Une parole qui n'apporte pas du bien doit céder au silence. Cette règle est exigeante. La plupart des conversations modernes ne respectent pas. On parle pour parler. On comble les silences. On bavarde. Toute cette production langagière passe sans laisser de trace, mais elle compte. Chaque parole est notée. Chaque mot dit sera demandé. Le Coran dit qu'aucune parole ne sort sans qu'un ange ne l'inscrive. Imagine ton compte au Jour du Compte si tu pouvais voir la liste de toutes tes paroles. Combien de paroles utiles ? Combien de paroles neutres ? Combien de paroles nuisibles ? Beaucoup seraient stupéfaits par la disproportion. Cette du'a est l'antidote. Deux demandes. Première — 'hfaz lisānī mina al-fudūl. Préserve ma langue de la parole superflue. Le mot fudūl — ce qui est en trop, le superflu. La parole en trop, c'est tout ce qui dépasse l'utile. Tu demandes la protection contre ce débordement. Deuxième — wa alhimnī as-sukūta idhā kāna khayran. Inspire-moi le silence quand il est meilleur. Demande remarquable. Le silence n'est pas toujours bon — parfois il est lâcheté ou trahison (voir le jour 240). Mais souvent, il est meilleur que la parole. Tu demandes à Allah l'inspiration du discernement — quand parler, quand se taire. Et tu demandes la grâce du silence quand il s'impose, parce que le silence est parfois plus dur que la parole. Cette pratique transforme la qualité des conversations.</w:t>
       </w:r>
     </w:p>
     <w:p>

</xml_diff>

<commit_message>
audit translittération : uniformisation Allah (16 fichiers)
- Allâh → Allah : 1 057 remplacements (12 fichiers)
- Allāh → Allah : 80 remplacements dans textes français (duaas)
- Formules composées uniformisées : Allahumma, Bismillah, Subhan Allah,
  Masha Allah, Insha Allah, La ilaha illa Allah, Rasulullah, etc.
- Translittérations scientifiques duaas (phonetique) préservées : 213 Allāh
- Textes arabes intacts
- Noms propres préservés (Abdullah, etc.)
- 13 DOCX miroirs régénérés

Co-Authored-By: Claude Opus 4.6 (1M context) <noreply@anthropic.com>
</commit_message>
<xml_diff>
--- a/ECRITS_NIYYAH/duaas.docx
+++ b/ECRITS_NIYYAH/duaas.docx
@@ -810,7 +810,7 @@
           <w:sz w:val="22"/>
           <w:szCs w:val="22"/>
         </w:rPr>
-        <w:t xml:space="preserve">Omar ibn al-Khattâb tenait cette parole du Prophète ﷺ lui-même. Celui qui fait ses ablutions complètes et dit ensuite cette double attestation — les huit portes du Paradis lui sont ouvertes. Il entrera par celle qu'il voudra. Huit portes. Pour une phrase. Mais quelle phrase. Toute la religion tient dedans. Lā ilāha illa Allāh — il n'y a rien à adorer sinon Lui. Tout le reste est faux dieu. L'argent qu'on poursuit, la réputation qu'on défend, la peur qu'on nourrit, l'image qu'on cultive — tous des idoles. Cette phrase les abat tous. Et puis : Muhammad est Son serviteur — d'abord serviteur, ensuite messager. La grandeur du Prophète ﷺ tenait dans cet ordre. Servir d'abord. Transmettre ensuite. Celui qui fait ses ablutions et prononce cela vient de se purifier deux fois — l'eau a lavé le corps, l'attestation a lavé le cœur. Les portes s'ouvrent parce que rien ne bloque plus le passage.</w:t>
+        <w:t xml:space="preserve">Omar ibn al-Khattâb tenait cette parole du Prophète ﷺ lui-même. Celui qui fait ses ablutions complètes et dit ensuite cette double attestation — les huit portes du Paradis lui sont ouvertes. Il entrera par celle qu'il voudra. Huit portes. Pour une phrase. Mais quelle phrase. Toute la religion tient dedans. Lā ilāha illa Allah — il n'y a rien à adorer sinon Lui. Tout le reste est faux dieu. L'argent qu'on poursuit, la réputation qu'on défend, la peur qu'on nourrit, l'image qu'on cultive — tous des idoles. Cette phrase les abat tous. Et puis : Muhammad est Son serviteur — d'abord serviteur, ensuite messager. La grandeur du Prophète ﷺ tenait dans cet ordre. Servir d'abord. Transmettre ensuite. Celui qui fait ses ablutions et prononce cela vient de se purifier deux fois — l'eau a lavé le corps, l'attestation a lavé le cœur. Les portes s'ouvrent parce que rien ne bloque plus le passage.</w:t>
       </w:r>
     </w:p>
     <w:p>
@@ -901,7 +901,7 @@
           <w:sz w:val="22"/>
           <w:szCs w:val="22"/>
         </w:rPr>
-        <w:t xml:space="preserve">Hudhayfah encore. Toujours lui, le confident des nuits. Il rapporte que le Prophète ﷺ posait la joue droite sur la main droite et disait ces mots avant que le sommeil le prenne. Bismika Allāhumma amūtu wa ahyā. En Ton nom je meurs et je vis. Le sommeil, il l'appelait la petite mort. Pas par peur — par lucidité. Chaque nuit, on rend la conscience. On lâche le corps. On part quelque part qu'on ne contrôle plus. Et chaque matin, si Allah le veut, on revient. Si Allah ne le veut pas, on ne revient pas. Combien d'hommes se sont couchés en pensant à demain et n'ont jamais vu demain ? La phrase ne dramatise pas. Elle nomme. En Ton nom je meurs — parce que ce qui m'arrive cette nuit T'appartient. En Ton nom je vis — parce que si je me relève demain, c'est parce que Tu l'as voulu. Dormir comme cela, c'est dormir vraiment. Sans cela, c'est juste s'effondrer.</w:t>
+        <w:t xml:space="preserve">Hudhayfah encore. Toujours lui, le confident des nuits. Il rapporte que le Prophète ﷺ posait la joue droite sur la main droite et disait ces mots avant que le sommeil le prenne. Bismika Allahumma amūtu wa ahyā. En Ton nom je meurs et je vis. Le sommeil, il l'appelait la petite mort. Pas par peur — par lucidité. Chaque nuit, on rend la conscience. On lâche le corps. On part quelque part qu'on ne contrôle plus. Et chaque matin, si Allah le veut, on revient. Si Allah ne le veut pas, on ne revient pas. Combien d'hommes se sont couchés en pensant à demain et n'ont jamais vu demain ? La phrase ne dramatise pas. Elle nomme. En Ton nom je meurs — parce que ce qui m'arrive cette nuit T'appartient. En Ton nom je vis — parce que si je me relève demain, c'est parce que Tu l'as voulu. Dormir comme cela, c'est dormir vraiment. Sans cela, c'est juste s'effondrer.</w:t>
       </w:r>
     </w:p>
     <w:p>
@@ -1265,7 +1265,7 @@
           <w:sz w:val="22"/>
           <w:szCs w:val="22"/>
         </w:rPr>
-        <w:t xml:space="preserve">Le Prophète ﷺ, dont les péchés passés et futurs étaient pardonnés, le disait soixante-dix fois par jour. Selon une autre tradition, cent fois. Cent fois. Lui. Imagine alors pour nous. Astaghfiru Allāh. Trois mots. Pas une formule magique. Une posture. Reconnaître qu'on est en dette, sans toujours savoir de quoi. Reconnaître que même quand on ne fait rien de mal, on aurait pu faire mieux. Reconnaître qu'entre l'idéal et la réalité, il y a un écart qu'on appelle péché et que cet écart, seul Allah peut le combler. Il y a des hommes qui passent leur vie sans jamais demander pardon. Ils s'en sortent bien dans le monde — l'arrogance paye souvent. Mais leur cœur durcit. Astaghfiru Allāh est l'eau qui empêche le cœur de devenir pierre. Le Prophète ﷺ disait : celui qui s'attache à l'istighfâr, Allah lui ménagera une issue à toute angoisse, un soulagement à toute peine, et lui accordera des subsistances d'où il ne s'y attend pas.</w:t>
+        <w:t xml:space="preserve">Le Prophète ﷺ, dont les péchés passés et futurs étaient pardonnés, le disait soixante-dix fois par jour. Selon une autre tradition, cent fois. Cent fois. Lui. Imagine alors pour nous. Astaghfiru Allah. Trois mots. Pas une formule magique. Une posture. Reconnaître qu'on est en dette, sans toujours savoir de quoi. Reconnaître que même quand on ne fait rien de mal, on aurait pu faire mieux. Reconnaître qu'entre l'idéal et la réalité, il y a un écart qu'on appelle péché et que cet écart, seul Allah peut le combler. Il y a des hommes qui passent leur vie sans jamais demander pardon. Ils s'en sortent bien dans le monde — l'arrogance paye souvent. Mais leur cœur durcit. Astaghfiru Allah est l'eau qui empêche le cœur de devenir pierre. Le Prophète ﷺ disait : celui qui s'attache à l'istighfâr, Allah lui ménagera une issue à toute angoisse, un soulagement à toute peine, et lui accordera des subsistances d'où il ne s'y attend pas.</w:t>
       </w:r>
     </w:p>
     <w:p>
@@ -1356,7 +1356,7 @@
           <w:sz w:val="22"/>
           <w:szCs w:val="22"/>
         </w:rPr>
-        <w:t xml:space="preserve">Le Prophète ﷺ a dit : deux paroles légères sur la langue, lourdes dans la balance, aimées du Tout-Miséricordieux — subhāna Allāhi wa bihamdihi, subhāna Allāhi al-'azīm. Deux paroles. Légères à dire — on peut les murmurer cent fois en cinq minutes. Lourdes au jour du compte — elles pèsent plus que ce qu'on imagine. Aimées d'Allah — parce qu'elles ne demandent rien. Elles ne sont que reconnaissance. Subhāna Allāh : Tu es pur de tout défaut, élevé au-dessus de tout ce qu'on T'attribue à tort. Wa bihamdihi : et je T'en loue. Subhāna Allāhi al-'azīm : Gloire à Allah le Magnifique. Trois affirmations qui ne mendient rien, qui ne réclament rien, qui se contentent de Te nommer pour ce que Tu es. Abu Hurayra le répétait sans cesse, marchant dans les ruelles de Médine. On le voyait remuer les lèvres. On lui demandait ce qu'il disait. Il répondait : la perle du Prophète. Et il continuait.</w:t>
+        <w:t xml:space="preserve">Le Prophète ﷺ a dit : deux paroles légères sur la langue, lourdes dans la balance, aimées du Tout-Miséricordieux — subhan Allahi wa bihamdihi, subhan Allahi al-'azīm. Deux paroles. Légères à dire — on peut les murmurer cent fois en cinq minutes. Lourdes au jour du compte — elles pèsent plus que ce qu'on imagine. Aimées d'Allah — parce qu'elles ne demandent rien. Elles ne sont que reconnaissance. Subhan Allah : Tu es pur de tout défaut, élevé au-dessus de tout ce qu'on T'attribue à tort. Wa bihamdihi : et je T'en loue. Subhan Allahi al-'azīm : Gloire à Allah le Magnifique. Trois affirmations qui ne mendient rien, qui ne réclament rien, qui se contentent de Te nommer pour ce que Tu es. Abu Hurayra le répétait sans cesse, marchant dans les ruelles de Médine. On le voyait remuer les lèvres. On lui demandait ce qu'il disait. Il répondait : la perle du Prophète. Et il continuait.</w:t>
       </w:r>
     </w:p>
     <w:p>
@@ -1538,7 +1538,7 @@
           <w:sz w:val="22"/>
           <w:szCs w:val="22"/>
         </w:rPr>
-        <w:t xml:space="preserve">Le Prophète ﷺ a dit : vous n'entrerez pas au Paradis tant que vous n'aurez pas cru, et vous ne croirez pas tant que vous ne vous aimerez pas les uns les autres. Voulez-vous que je vous indique une chose qui, si vous la faites, vous fera vous aimer ? Répandez le salam entre vous. Trois mots. As-salāmu 'alaykum. Et trois mots qui se déploient en bénédictions : que la paix, la miséricorde, les bénédictions soient sur toi. Tu donnes trois choses en disant cela. Tu ne mendies pas — tu donnes. Et celui qui reçoit doit rendre mieux ou pareil. Wa 'alaykum as-salām wa rahmatu Allāhi wa barakātuh. C'est une économie inversée. Plus tu donnes du salam, plus il t'en revient. Abdullah ibn Salâm rapportait que les premiers mots qu'il entendit du Prophète ﷺ en arrivant à Médine furent : ô gens, répandez le salam, nourrissez les pauvres, maintenez les liens de parenté, priez la nuit pendant que les autres dorment — vous entrerez au Paradis en paix.</w:t>
+        <w:t xml:space="preserve">Le Prophète ﷺ a dit : vous n'entrerez pas au Paradis tant que vous n'aurez pas cru, et vous ne croirez pas tant que vous ne vous aimerez pas les uns les autres. Voulez-vous que je vous indique une chose qui, si vous la faites, vous fera vous aimer ? Répandez le salam entre vous. Trois mots. As-salāmu 'alaykum. Et trois mots qui se déploient en bénédictions : que la paix, la miséricorde, les bénédictions soient sur toi. Tu donnes trois choses en disant cela. Tu ne mendies pas — tu donnes. Et celui qui reçoit doit rendre mieux ou pareil. Wa 'alaykum as-salām wa rahmatu Allahi wa barakātuh. C'est une économie inversée. Plus tu donnes du salam, plus il t'en revient. Abdullah ibn Salâm rapportait que les premiers mots qu'il entendit du Prophète ﷺ en arrivant à Médine furent : ô gens, répandez le salam, nourrissez les pauvres, maintenez les liens de parenté, priez la nuit pendant que les autres dorment — vous entrerez au Paradis en paix.</w:t>
       </w:r>
     </w:p>
     <w:p>
@@ -1629,7 +1629,7 @@
           <w:sz w:val="22"/>
           <w:szCs w:val="22"/>
         </w:rPr>
-        <w:t xml:space="preserve">Abu Hurayra rapporte que le Prophète ﷺ a dit : Allah aime l'éternuement et déteste le bâillement. Étrange préférence divine — pourquoi aimer l'éternuement ? Parce que c'est un soulagement du corps, une libération soudaine, un signe de vitalité. Et celui qui éternue doit aussitôt en rendre grâce. Al-hamdu lillāh. Pour ce souffle reçu et rendu. Pour ce corps qui fonctionne. Pour ce petit miracle d'organes qui se synchronisent en une seconde. Et celui qui entend dit : Yarhamuka Allāh. Qu'Allah te fasse miséricorde. Et le premier répond : Yahdīkumu Allāhu wa yuslihu bālakum — qu'Allah vous guide et améliore votre état. Trois échanges. Pour un éternuement. C'est une civilisation qui transforme un réflexe physiologique en triple bénédiction. Le bâillement, lui, est haï parce qu'il signale la paresse, l'engourdissement, la chute de vigilance. L'un est élévation involontaire. L'autre est affaissement involontaire. La religion est dans les détails.</w:t>
+        <w:t xml:space="preserve">Abu Hurayra rapporte que le Prophète ﷺ a dit : Allah aime l'éternuement et déteste le bâillement. Étrange préférence divine — pourquoi aimer l'éternuement ? Parce que c'est un soulagement du corps, une libération soudaine, un signe de vitalité. Et celui qui éternue doit aussitôt en rendre grâce. Al-hamdu lillāh. Pour ce souffle reçu et rendu. Pour ce corps qui fonctionne. Pour ce petit miracle d'organes qui se synchronisent en une seconde. Et celui qui entend dit : Yarhamuka Allah. Qu'Allah te fasse miséricorde. Et le premier répond : Yahdīkumu Allahu wa yuslihu bālakum — qu'Allah vous guide et améliore votre état. Trois échanges. Pour un éternuement. C'est une civilisation qui transforme un réflexe physiologique en triple bénédiction. Le bâillement, lui, est haï parce qu'il signale la paresse, l'engourdissement, la chute de vigilance. L'un est élévation involontaire. L'autre est affaissement involontaire. La religion est dans les détails.</w:t>
       </w:r>
     </w:p>
     <w:p>
@@ -1902,7 +1902,7 @@
           <w:sz w:val="22"/>
           <w:szCs w:val="22"/>
         </w:rPr>
-        <w:t xml:space="preserve">Ibn Abbâs rapporte que le Prophète ﷺ a dit : celui qui visite un malade dont le terme n'est pas venu et prononce cette du'a sept fois, Allah le guérit. Sept fois. Pas une. Pas dix. Sept. Comme si la guérison demandait une persistance. Comme si la première fois disait l'intention, la deuxième l'insistance, la troisième la foi, et qu'à la septième seulement la porte cédait. Le Prophète ﷺ visitait les malades. Il s'asseyait. Il prenait la main. Il passait sa main droite sur l'endroit qui faisait mal. Il disait : Allāhumma rabba an-nāsi, adhhibi al-ba's, ishfi anta ash-shāfī, lā shifā'a illā shifā'uka, shifā'an lā yughādiru saqaman — ô Allah Seigneur des hommes, ôte le mal, guéris, Tu es Le Guérisseur, il n'y a de guérison que la Tienne, une guérison qui ne laisse aucune maladie. Quelle médecine moderne offre autant que cela à un homme qui souffre ? Une présence. Une main. Une prière qui nomme exactement ce qu'on espère sans oser le formuler.</w:t>
+        <w:t xml:space="preserve">Ibn Abbâs rapporte que le Prophète ﷺ a dit : celui qui visite un malade dont le terme n'est pas venu et prononce cette du'a sept fois, Allah le guérit. Sept fois. Pas une. Pas dix. Sept. Comme si la guérison demandait une persistance. Comme si la première fois disait l'intention, la deuxième l'insistance, la troisième la foi, et qu'à la septième seulement la porte cédait. Le Prophète ﷺ visitait les malades. Il s'asseyait. Il prenait la main. Il passait sa main droite sur l'endroit qui faisait mal. Il disait : Allahumma rabba an-nāsi, adhhibi al-ba's, ishfi anta ash-shāfī, lā shifā'a illā shifā'uka, shifā'an lā yughādiru saqaman — ô Allah Seigneur des hommes, ôte le mal, guéris, Tu es Le Guérisseur, il n'y a de guérison que la Tienne, une guérison qui ne laisse aucune maladie. Quelle médecine moderne offre autant que cela à un homme qui souffre ? Une présence. Une main. Une prière qui nomme exactement ce qu'on espère sans oser le formuler.</w:t>
       </w:r>
     </w:p>
     <w:p>
@@ -2084,7 +2084,7 @@
           <w:sz w:val="22"/>
           <w:szCs w:val="22"/>
         </w:rPr>
-        <w:t xml:space="preserve">Ali ibn Abi Tâlib racontait qu'il avait vu le Prophète ﷺ poser son pied sur l'étrier en disant Bismillāh, et une fois assis sur la monture, lever la tête et prononcer ces mots tirés du Coran lui-même, sourate Az-Zukhruf. Puis il disait trois fois Al-hamdu lillāh. Puis trois fois Allāhu akbar. Puis : Subhānaka, innī zalamtu nafsī fa-ghfir lī, fa innahu lā yaghfiru adh-dhunūba illā anta — Gloire à Toi, j'ai fait du tort à mon âme, pardonne-moi, car nul ne pardonne les péchés sauf Toi. Et il riait. Ali lui demanda : pourquoi ris-tu, ô Messager d'Allah ? Il répondit : ton Seigneur s'émerveille de Son serviteur quand il dit pardonne-moi mes péchés ; Il sait que personne ne pardonne les péchés sauf Lui. Au cœur de cette du'a du voyage, le rappel : nous voyageons vers Lui. Toute route mène à Lui. Le véhicule qu'on enfourche n'est qu'une fraction du grand voyage. Mais nous n'aurions pu le maîtriser. Cinquante chevaux dans un moteur, une tonne de métal lancée à cent à l'heure — c'est Lui qui rend cela docile.</w:t>
+        <w:t xml:space="preserve">Ali ibn Abi Tâlib racontait qu'il avait vu le Prophète ﷺ poser son pied sur l'étrier en disant Bismillah, et une fois assis sur la monture, lever la tête et prononcer ces mots tirés du Coran lui-même, sourate Az-Zukhruf. Puis il disait trois fois Al-hamdu lillāh. Puis trois fois Allahu akbar. Puis : Subhānaka, innī zalamtu nafsī fa-ghfir lī, fa innahu lā yaghfiru adh-dhunūba illā anta — Gloire à Toi, j'ai fait du tort à mon âme, pardonne-moi, car nul ne pardonne les péchés sauf Toi. Et il riait. Ali lui demanda : pourquoi ris-tu, ô Messager d'Allah ? Il répondit : ton Seigneur s'émerveille de Son serviteur quand il dit pardonne-moi mes péchés ; Il sait que personne ne pardonne les péchés sauf Lui. Au cœur de cette du'a du voyage, le rappel : nous voyageons vers Lui. Toute route mène à Lui. Le véhicule qu'on enfourche n'est qu'une fraction du grand voyage. Mais nous n'aurions pu le maîtriser. Cinquante chevaux dans un moteur, une tonne de métal lancée à cent à l'heure — c'est Lui qui rend cela docile.</w:t>
       </w:r>
     </w:p>
     <w:p>
@@ -2448,7 +2448,7 @@
           <w:sz w:val="22"/>
           <w:szCs w:val="22"/>
         </w:rPr>
-        <w:t xml:space="preserve">Ibn Abbâs rapporte que cette phrase fut celle d'Ibrahim quand on le jeta dans le feu. Et celle du Prophète ﷺ et de ses compagnons quand on leur dit, après Uhud : les gens se sont rassemblés contre vous, ils reviennent vous attaquer, craignez-les. Et le Coran dit que cela ne fit qu'augmenter leur foi, et qu'ils répondirent : Hasbunā Allāhu wa ni'ma al-wakīl. Allah nous suffit, quel excellent garant. Et ils repartirent au combat alors qu'ils étaient blessés. La peur est un test. Elle te montre où est ton appui. L'homme qui a peur cherche du soutien — auprès d'amis, d'argent, de puissance, de plans. Tous ces appuis sont mortels. Hasbunā Allāhu — Allah nous suffit. Pas Allah complète mes appuis. Allah remplace tous les autres appuis. Quelle paix dans cette phrase. Tu n'as plus besoin de calculer si tu peux compter sur les autres. Tu comptes sur Lui. Et Lui ne déçoit pas. Ibrahim dans le feu, ses compagnons sur le champ de bataille, et toi dans ta peur de demain — la même phrase suffit.</w:t>
+        <w:t xml:space="preserve">Ibn Abbâs rapporte que cette phrase fut celle d'Ibrahim quand on le jeta dans le feu. Et celle du Prophète ﷺ et de ses compagnons quand on leur dit, après Uhud : les gens se sont rassemblés contre vous, ils reviennent vous attaquer, craignez-les. Et le Coran dit que cela ne fit qu'augmenter leur foi, et qu'ils répondirent : Hasbunā Allahu wa ni'ma al-wakīl. Allah nous suffit, quel excellent garant. Et ils repartirent au combat alors qu'ils étaient blessés. La peur est un test. Elle te montre où est ton appui. L'homme qui a peur cherche du soutien — auprès d'amis, d'argent, de puissance, de plans. Tous ces appuis sont mortels. Hasbunā Allahu — Allah nous suffit. Pas Allah complète mes appuis. Allah remplace tous les autres appuis. Quelle paix dans cette phrase. Tu n'as plus besoin de calculer si tu peux compter sur les autres. Tu comptes sur Lui. Et Lui ne déçoit pas. Ibrahim dans le feu, ses compagnons sur le champ de bataille, et toi dans ta peur de demain — la même phrase suffit.</w:t>
       </w:r>
     </w:p>
     <w:p>
@@ -2721,7 +2721,7 @@
           <w:sz w:val="22"/>
           <w:szCs w:val="22"/>
         </w:rPr>
-        <w:t xml:space="preserve">Hudhayfah encore. Lui dont le surnom était sâhib sirr rasūl Allāh — le confident des secrets du Messager d'Allah. Il rapporte que c'était la toute dernière parole du Prophète ﷺ avant le sommeil. Pas la première — la dernière. Après les ablutions, après les trois sourates, après s'être allongé sur le côté droit, la main sous la joue — alors seulement cette phrase. Comme un sceau qu'on appose à la fin d'une lettre. Bismika amūtu wa ahyā. En Ton nom je meurs et je vis. Et au matin, Hudhayfah dit que la première parole du Prophète ﷺ en se réveillant était : Al-hamdu lillāhi alladhī ahyānā ba'da mā amātanā wa ilayhi an-nushūr. Louange à Allah qui nous a rendu la vie après nous l'avoir ôtée. Le cercle se referme. Une journée encadrée par deux paroles qui nomment le sommeil pour ce qu'il est — une petite mort consentie. Trente jours de du'as fondamentales. Si tu es arrivé jusqu'ici, tu sais maintenant que chaque instant peut être nommé. Que rien n'est trop banal pour être offert. Que la vie d'un musulman est une longue conversation avec Allah, ponctuée de mots que le Prophète ﷺ nous a légués comme on lègue des clés. Reste à les utiliser.</w:t>
+        <w:t xml:space="preserve">Hudhayfah encore. Lui dont le surnom était sâhib sirr rasūl Allah — le confident des secrets du Messager d'Allah. Il rapporte que c'était la toute dernière parole du Prophète ﷺ avant le sommeil. Pas la première — la dernière. Après les ablutions, après les trois sourates, après s'être allongé sur le côté droit, la main sous la joue — alors seulement cette phrase. Comme un sceau qu'on appose à la fin d'une lettre. Bismika amūtu wa ahyā. En Ton nom je meurs et je vis. Et au matin, Hudhayfah dit que la première parole du Prophète ﷺ en se réveillant était : Al-hamdu lillāhi alladhī ahyānā ba'da mā amātanā wa ilayhi an-nushūr. Louange à Allah qui nous a rendu la vie après nous l'avoir ôtée. Le cercle se referme. Une journée encadrée par deux paroles qui nomment le sommeil pour ce qu'il est — une petite mort consentie. Trente jours de du'as fondamentales. Si tu es arrivé jusqu'ici, tu sais maintenant que chaque instant peut être nommé. Que rien n'est trop banal pour être offert. Que la vie d'un musulman est une longue conversation avec Allah, ponctuée de mots que le Prophète ﷺ nous a légués comme on lègue des clés. Reste à les utiliser.</w:t>
       </w:r>
     </w:p>
     <w:p>
@@ -2994,7 +2994,7 @@
           <w:sz w:val="22"/>
           <w:szCs w:val="22"/>
         </w:rPr>
-        <w:t xml:space="preserve">Othman ibn Affân rapporte que le Prophète ﷺ a dit : celui qui dit chaque matin et chaque soir, trois fois, cette du'a — rien ne pourra lui nuire. Othman, devenu vieux et frappé d'une paralysie partielle, l'a confiée comme un trésor. Il disait : depuis que je l'ai entendue, je ne l'ai jamais quittée. Trois fois. Pourquoi trois ? Comme pour les sourates de protection avant le sommeil. Comme pour Subhāna Allāh trente-trois fois après la prière. Le chiffre trois revient dans la pratique prophétique comme la mesure minimale pour graver. Une fois — on a dit. Deux fois — on confirme. Trois fois — on inscrit. Et l'inscription protège. Cette phrase n'est pas une amulette à porter. C'est une orientation à prendre. Avec le nom d'Allah, rien ne peut nuire — pas parce que les choses ne t'arrivent plus, mais parce que ce qui t'arrive ne te nuit plus dans le sens profond du nuire. La maladie n'est plus une nuisance si elle te rapproche de Lui. La pauvreté n'est plus une nuisance si elle t'enseigne. Seul te nuit ce qui t'éloigne de Lui. Cette phrase t'inscrit dans Son cercle.</w:t>
+        <w:t xml:space="preserve">Othman ibn Affân rapporte que le Prophète ﷺ a dit : celui qui dit chaque matin et chaque soir, trois fois, cette du'a — rien ne pourra lui nuire. Othman, devenu vieux et frappé d'une paralysie partielle, l'a confiée comme un trésor. Il disait : depuis que je l'ai entendue, je ne l'ai jamais quittée. Trois fois. Pourquoi trois ? Comme pour les sourates de protection avant le sommeil. Comme pour Subhan Allah trente-trois fois après la prière. Le chiffre trois revient dans la pratique prophétique comme la mesure minimale pour graver. Une fois — on a dit. Deux fois — on confirme. Trois fois — on inscrit. Et l'inscription protège. Cette phrase n'est pas une amulette à porter. C'est une orientation à prendre. Avec le nom d'Allah, rien ne peut nuire — pas parce que les choses ne t'arrivent plus, mais parce que ce qui t'arrive ne te nuit plus dans le sens profond du nuire. La maladie n'est plus une nuisance si elle te rapproche de Lui. La pauvreté n'est plus une nuisance si elle t'enseigne. Seul te nuit ce qui t'éloigne de Lui. Cette phrase t'inscrit dans Son cercle.</w:t>
       </w:r>
     </w:p>
     <w:p>
@@ -3085,7 +3085,7 @@
           <w:sz w:val="22"/>
           <w:szCs w:val="22"/>
         </w:rPr>
-        <w:t xml:space="preserve">Abu Hurayra a entendu un homme se plaindre au Prophète ﷺ : ô Messager d'Allah, un scorpion m'a piqué cette nuit. Le Prophète ﷺ a dit : si tu avais dit en arrivant à cet endroit a'ūdhu bikalimāti Allāhi at-tāmmāti min sharri mā khalaq — rien ne t'aurait nui. Mais il a ajouté pour les soirs : celui qui prononce ces mots trois fois en entrant dans le soir, rien ne lui nuira jusqu'au matin. Pourquoi at-tāmmāt — les paroles parfaites ? Parce que les paroles humaines ont des failles. Une langue glisse, un mot rate, une protection humaine cède. Les paroles d'Allah sont sans faille. Tāmm en arabe veut dire complet, achevé, qui ne souffre d'aucun manque. Te réfugier dans ce qui est tāmm, c'est te mettre derrière un mur sans brèche. Contre le mal de ce qu'Il a créé. Cette formule est totale. Elle ne nomme pas un mal particulier. Elle couvre tout ce qui peut nuire dans la création. Et c'est précisément parce qu'elle est totale qu'elle est efficace. Tu ne peux pas anticiper le danger. Tu peux te placer sous une protection qui couvre tout ce que tu ne peux pas anticiper.</w:t>
+        <w:t xml:space="preserve">Abu Hurayra a entendu un homme se plaindre au Prophète ﷺ : ô Messager d'Allah, un scorpion m'a piqué cette nuit. Le Prophète ﷺ a dit : si tu avais dit en arrivant à cet endroit a'ūdhu bikalimāti Allahi at-tāmmāti min sharri mā khalaq — rien ne t'aurait nui. Mais il a ajouté pour les soirs : celui qui prononce ces mots trois fois en entrant dans le soir, rien ne lui nuira jusqu'au matin. Pourquoi at-tāmmāt — les paroles parfaites ? Parce que les paroles humaines ont des failles. Une langue glisse, un mot rate, une protection humaine cède. Les paroles d'Allah sont sans faille. Tāmm en arabe veut dire complet, achevé, qui ne souffre d'aucun manque. Te réfugier dans ce qui est tāmm, c'est te mettre derrière un mur sans brèche. Contre le mal de ce qu'Il a créé. Cette formule est totale. Elle ne nomme pas un mal particulier. Elle couvre tout ce qui peut nuire dans la création. Et c'est précisément parce qu'elle est totale qu'elle est efficace. Tu ne peux pas anticiper le danger. Tu peux te placer sous une protection qui couvre tout ce que tu ne peux pas anticiper.</w:t>
       </w:r>
     </w:p>
     <w:p>
@@ -3358,7 +3358,7 @@
           <w:sz w:val="22"/>
           <w:szCs w:val="22"/>
         </w:rPr>
-        <w:t xml:space="preserve">Abu Hurayra rapporte. Le Prophète ﷺ a dit : celui qui dit subhāna Allāhi wa bihamdihi cent fois par jour, ses fautes sont effacées, même si elles étaient comme l'écume de la mer. Cent fois. Une formule de trois mots. Cinq syllabes. Cinq minutes en tout — peut-être moins. Et toutes les fautes effacées. La proposition est si avantageuse qu'elle ressemble à une erreur. Mais l'erreur est de notre côté — on a la pièce d'or et on regarde ailleurs. Pourquoi cent ? Parce que la répétition fait quelque chose à la langue, et la langue fait quelque chose au cœur. Tu dis subhāna Allāh une fois — c'est une parole. Dix fois — c'est une habitude. Cent fois — c'est une orientation. Au bout de cent, tu ne dis plus la phrase, tu la respires. Tu en deviens. Et l'écume de la mer — image vertigineuse — cesse de te poursuivre. Imagine la mer qui produit son écume sans cesse, et tu la vois s'effacer à mesure que tu répètes. Cent louanges, cent petites vagues qui passent dessus et lavent. Abu Hurayra l'a fait toute sa vie. On l'enterra avec les lèvres encore mouillées de subhāna Allāhi wa bihamdihi.</w:t>
+        <w:t xml:space="preserve">Abu Hurayra rapporte. Le Prophète ﷺ a dit : celui qui dit subhan Allahi wa bihamdihi cent fois par jour, ses fautes sont effacées, même si elles étaient comme l'écume de la mer. Cent fois. Une formule de trois mots. Cinq syllabes. Cinq minutes en tout — peut-être moins. Et toutes les fautes effacées. La proposition est si avantageuse qu'elle ressemble à une erreur. Mais l'erreur est de notre côté — on a la pièce d'or et on regarde ailleurs. Pourquoi cent ? Parce que la répétition fait quelque chose à la langue, et la langue fait quelque chose au cœur. Tu dis subhan Allah une fois — c'est une parole. Dix fois — c'est une habitude. Cent fois — c'est une orientation. Au bout de cent, tu ne dis plus la phrase, tu la respires. Tu en deviens. Et l'écume de la mer — image vertigineuse — cesse de te poursuivre. Imagine la mer qui produit son écume sans cesse, et tu la vois s'effacer à mesure que tu répètes. Cent louanges, cent petites vagues qui passent dessus et lavent. Abu Hurayra l'a fait toute sa vie. On l'enterra avec les lèvres encore mouillées de subhan Allahi wa bihamdihi.</w:t>
       </w:r>
     </w:p>
     <w:p>
@@ -3449,7 +3449,7 @@
           <w:sz w:val="22"/>
           <w:szCs w:val="22"/>
         </w:rPr>
-        <w:t xml:space="preserve">Cette du'a réinitialise. Chaque matin, tu te rappelles à toi-même qui tu es. Pas un homme qui se définit par son travail, sa nation, son origine — un homme qui se réclame d'une lignée plus ancienne et plus haute. La fitra — la nature originelle avec laquelle Allah crée tout enfant. Le Prophète ﷺ disait : tout enfant naît sur la fitra, ce sont ses parents qui en font un juif, un chrétien, un mazdéen. La fitra reconnaît Allah sans qu'on le lui apprenne. Elle est antérieure à la culture. Tu te réveilles et tu te rappelles : je suis revenu à cela. Puis la kalimat al-ikhlās — lā ilāha illa Allāh, la parole de pureté qui ne contient rien d'autre que Lui. Puis Muhammad ﷺ — la voie qu'on suit aujourd'hui. Puis Ibrahim — la lignée d'où l'on vient, le père de tous les monothéistes. Hanīfan musliman — droit, soumis, dégagé de toutes les fausses divinités. Cette du'a inscrit ton matin dans une généalogie qui remonte avant les civilisations. Tu n'es pas seul. Tu es le dernier maillon d'une chaîne qui remonte à Ibrahim et plus loin encore. Le matin que tu commences est leur héritage.</w:t>
+        <w:t xml:space="preserve">Cette du'a réinitialise. Chaque matin, tu te rappelles à toi-même qui tu es. Pas un homme qui se définit par son travail, sa nation, son origine — un homme qui se réclame d'une lignée plus ancienne et plus haute. La fitra — la nature originelle avec laquelle Allah crée tout enfant. Le Prophète ﷺ disait : tout enfant naît sur la fitra, ce sont ses parents qui en font un juif, un chrétien, un mazdéen. La fitra reconnaît Allah sans qu'on le lui apprenne. Elle est antérieure à la culture. Tu te réveilles et tu te rappelles : je suis revenu à cela. Puis la kalimat al-ikhlās — lā ilāha illa Allah, la parole de pureté qui ne contient rien d'autre que Lui. Puis Muhammad ﷺ — la voie qu'on suit aujourd'hui. Puis Ibrahim — la lignée d'où l'on vient, le père de tous les monothéistes. Hanīfan musliman — droit, soumis, dégagé de toutes les fausses divinités. Cette du'a inscrit ton matin dans une généalogie qui remonte avant les civilisations. Tu n'es pas seul. Tu es le dernier maillon d'une chaîne qui remonte à Ibrahim et plus loin encore. Le matin que tu commences est leur héritage.</w:t>
       </w:r>
     </w:p>
     <w:p>
@@ -4164,20 +4164,20 @@
           <w:sz w:val="22"/>
           <w:szCs w:val="22"/>
         </w:rPr>
-        <w:t xml:space="preserve">Quand nous montions, nous disions Allāhu akbar. Quand nous descendions, nous disions subhāna Allāh.</w:t>
-      </w:r>
-    </w:p>
-    <w:p>
-      <w:pPr>
-        <w:spacing w:after="60"/>
-      </w:pPr>
-      <w:r>
-        <w:rPr>
-          <w:rFonts w:ascii="Cormorant Garamond" w:cs="Cormorant Garamond" w:eastAsia="Cormorant Garamond" w:hAnsi="Cormorant Garamond"/>
-          <w:sz w:val="22"/>
-          <w:szCs w:val="22"/>
-        </w:rPr>
-        <w:t xml:space="preserve">Jâbir rapporte le comportement du Prophète ﷺ et de ses compagnons en voyage. Montée : Allāhu akbar. Descente : subhāna Allāh. Pourquoi cette correspondance ? Le mouvement physique épouse le mouvement spirituel. Tu montes — la grandeur d'Allah te frappe. Plus haut tu vas, plus large devient l'horizon, plus tu réalises qu'Il est plus grand que tout ce que tu vois. Tu descends — la pureté d'Allah te revient. Subhāna — Il est au-dessus de tout défaut, même quand toi tu rentres en bas, vers la vallée, vers le quotidien. Le Prophète ﷺ enseignait à ne jamais voyager mentalement à vide. Chaque variation du terrain devenait une occasion de dhikr. Aujourd'hui on traverse des autoroutes en regardant le téléphone. Imagine si à chaque côte tu disais Allāhu akbar — silencieusement même. À chaque descente subhāna Allāh. Le voyage ne serait plus une attente entre deux lieux. Il serait un acte continu.</w:t>
+        <w:t xml:space="preserve">Quand nous montions, nous disions Allahu akbar. Quand nous descendions, nous disions subhan Allah.</w:t>
+      </w:r>
+    </w:p>
+    <w:p>
+      <w:pPr>
+        <w:spacing w:after="60"/>
+      </w:pPr>
+      <w:r>
+        <w:rPr>
+          <w:rFonts w:ascii="Cormorant Garamond" w:cs="Cormorant Garamond" w:eastAsia="Cormorant Garamond" w:hAnsi="Cormorant Garamond"/>
+          <w:sz w:val="22"/>
+          <w:szCs w:val="22"/>
+        </w:rPr>
+        <w:t xml:space="preserve">Jâbir rapporte le comportement du Prophète ﷺ et de ses compagnons en voyage. Montée : Allahu akbar. Descente : subhan Allah. Pourquoi cette correspondance ? Le mouvement physique épouse le mouvement spirituel. Tu montes — la grandeur d'Allah te frappe. Plus haut tu vas, plus large devient l'horizon, plus tu réalises qu'Il est plus grand que tout ce que tu vois. Tu descends — la pureté d'Allah te revient. Subhāna — Il est au-dessus de tout défaut, même quand toi tu rentres en bas, vers la vallée, vers le quotidien. Le Prophète ﷺ enseignait à ne jamais voyager mentalement à vide. Chaque variation du terrain devenait une occasion de dhikr. Aujourd'hui on traverse des autoroutes en regardant le téléphone. Imagine si à chaque côte tu disais Allahu akbar — silencieusement même. À chaque descente subhan Allah. Le voyage ne serait plus une attente entre deux lieux. Il serait un acte continu.</w:t>
       </w:r>
     </w:p>
     <w:p>
@@ -4632,7 +4632,7 @@
           <w:sz w:val="22"/>
           <w:szCs w:val="22"/>
         </w:rPr>
-        <w:t xml:space="preserve">Omar ibn al-Khattâb rapporte du Prophète ﷺ : quand le muezzin dit Allāhu akbar Allāhu akbar, et que l'un de vous dit Allāhu akbar Allāhu akbar — puis répète tout l'appel jusqu'à dire à la fin du fond du cœur : il entrera au Paradis. Pourquoi remplacer Hayya 'alā as-salāh par Lā hawla wa lā quwwata illā billāh ? Hayya 'alā as-salāh — venez à la prière — c'est un appel que le muezzin lance aux autres. Toi qui répètes, tu ne peux pas lancer cet appel à ta propre place. Mais tu peux répondre à l'appel par une autre parole : il n'y a de force ni de puissance que par Allah. C'est-à-dire : oui, je veux venir à la prière, mais je ne peux le faire que par Toi. Sans Ton aide, je n'irai pas. Sans Ton soutien, je ne tiendrai pas debout. Quelle humilité dans cette substitution. L'appel se transforme en aveu. Et l'aveu devient une porte. Bilâl, premier muezzin de l'islam, avait une voix qui faisait trembler les cœurs. Mais ce n'était pas la beauté de sa voix qui ouvrait les portes du Paradis. C'était la sincérité de ceux qui répondaient.</w:t>
+        <w:t xml:space="preserve">Omar ibn al-Khattâb rapporte du Prophète ﷺ : quand le muezzin dit Allahu akbar Allahu akbar, et que l'un de vous dit Allahu akbar Allahu akbar — puis répète tout l'appel jusqu'à dire à la fin du fond du cœur : il entrera au Paradis. Pourquoi remplacer Hayya 'alā as-salāh par Lā hawla wa lā quwwata illā billāh ? Hayya 'alā as-salāh — venez à la prière — c'est un appel que le muezzin lance aux autres. Toi qui répètes, tu ne peux pas lancer cet appel à ta propre place. Mais tu peux répondre à l'appel par une autre parole : il n'y a de force ni de puissance que par Allah. C'est-à-dire : oui, je veux venir à la prière, mais je ne peux le faire que par Toi. Sans Ton aide, je n'irai pas. Sans Ton soutien, je ne tiendrai pas debout. Quelle humilité dans cette substitution. L'appel se transforme en aveu. Et l'aveu devient une porte. Bilâl, premier muezzin de l'islam, avait une voix qui faisait trembler les cœurs. Mais ce n'était pas la beauté de sa voix qui ouvrait les portes du Paradis. C'était la sincérité de ceux qui répondaient.</w:t>
       </w:r>
     </w:p>
     <w:p>
@@ -4996,7 +4996,7 @@
           <w:sz w:val="22"/>
           <w:szCs w:val="22"/>
         </w:rPr>
-        <w:t xml:space="preserve">Rifâ'a ibn Râfi' priait derrière le Prophète ﷺ. Quand celui-ci dit sami'a Allāhu liman hamidah et que Rifâ'a répondit par cette du'a longue, le Prophète ﷺ se tourna après la prière et demanda : qui a dit cela ? Rifâ'a répondit timidement : moi, ô Messager d'Allah. Le Prophète ﷺ dit : j'ai vu trente et quelques anges se précipiter, chacun voulant être celui qui inscrirait cette parole en premier. Trente anges. Pour une phrase prononcée à voix basse pendant la prière. Pourquoi cette précipitation ? Parce que la phrase enchaîne trois qualités de louange — kathīr, tayyib, mubārak. Abondante, bonne, bénie. La plupart des gens disent simplement rabbanā wa laka al-hamd. Bien. C'est ce que le Prophète ﷺ enseignait comme minimum. Mais celui qui ajoute ces trois qualificatifs fait quelque chose de plus — il qualifie sa propre louange devant Allah. Il dit : que ma louange ne soit pas une parole pauvre, fade et vaine — qu'elle soit abondante, bonne, bénie. Et les anges en sont touchés au point de courir pour l'inscrire.</w:t>
+        <w:t xml:space="preserve">Rifâ'a ibn Râfi' priait derrière le Prophète ﷺ. Quand celui-ci dit sami'a Allahu liman hamidah et que Rifâ'a répondit par cette du'a longue, le Prophète ﷺ se tourna après la prière et demanda : qui a dit cela ? Rifâ'a répondit timidement : moi, ô Messager d'Allah. Le Prophète ﷺ dit : j'ai vu trente et quelques anges se précipiter, chacun voulant être celui qui inscrirait cette parole en premier. Trente anges. Pour une phrase prononcée à voix basse pendant la prière. Pourquoi cette précipitation ? Parce que la phrase enchaîne trois qualités de louange — kathīr, tayyib, mubārak. Abondante, bonne, bénie. La plupart des gens disent simplement rabbanā wa laka al-hamd. Bien. C'est ce que le Prophète ﷺ enseignait comme minimum. Mais celui qui ajoute ces trois qualificatifs fait quelque chose de plus — il qualifie sa propre louange devant Allah. Il dit : que ma louange ne soit pas une parole pauvre, fade et vaine — qu'elle soit abondante, bonne, bénie. Et les anges en sont touchés au point de courir pour l'inscrire.</w:t>
       </w:r>
     </w:p>
     <w:p>
@@ -5542,7 +5542,7 @@
           <w:sz w:val="22"/>
           <w:szCs w:val="22"/>
         </w:rPr>
-        <w:t xml:space="preserve">Thawbân, l'affranchi du Prophète ﷺ, raconte qu'aussitôt après le salam final, le Prophète ﷺ disait trois fois astaghfiru Allāh puis cette phrase complète. Étrange habitude. On vient de finir la prière. On vient de réciter la Fâtiha, de se prosterner, de demander pardon entre les sujûd, de dire le tashahhud. Et la première chose qu'on fait en sortant, c'est de demander pardon trois fois. Pourquoi ? Parce que même la prière la mieux faite contient des manques. La concentration a flotté. L'esprit s'est échappé pendant une phrase. Une pensée du jour est passée. Trois istighfâr pour couvrir tous ces glissements de la prière elle-même. Puis : anta as-salām wa minka as-salām. Tu es la Paix et de Toi vient la paix. La prière est finie. Tu sors d'un état de paix. Tu vas rentrer dans le monde. Tu reconnais que la paix vient seulement de Lui — pas du silence, pas de la position, pas même de la prière en tant que rituel. De Lui. Et tu emportes ça en sortant. Sinon la prière reste un parenthèse qu'on ferme, alors qu'elle doit irriguer ce qui suit.</w:t>
+        <w:t xml:space="preserve">Thawbân, l'affranchi du Prophète ﷺ, raconte qu'aussitôt après le salam final, le Prophète ﷺ disait trois fois astaghfiru Allah puis cette phrase complète. Étrange habitude. On vient de finir la prière. On vient de réciter la Fâtiha, de se prosterner, de demander pardon entre les sujûd, de dire le tashahhud. Et la première chose qu'on fait en sortant, c'est de demander pardon trois fois. Pourquoi ? Parce que même la prière la mieux faite contient des manques. La concentration a flotté. L'esprit s'est échappé pendant une phrase. Une pensée du jour est passée. Trois istighfâr pour couvrir tous ces glissements de la prière elle-même. Puis : anta as-salām wa minka as-salām. Tu es la Paix et de Toi vient la paix. La prière est finie. Tu sors d'un état de paix. Tu vas rentrer dans le monde. Tu reconnais que la paix vient seulement de Lui — pas du silence, pas de la position, pas même de la prière en tant que rituel. De Lui. Et tu emportes ça en sortant. Sinon la prière reste un parenthèse qu'on ferme, alors qu'elle doit irriguer ce qui suit.</w:t>
       </w:r>
     </w:p>
     <w:p>
@@ -5633,7 +5633,7 @@
           <w:sz w:val="22"/>
           <w:szCs w:val="22"/>
         </w:rPr>
-        <w:t xml:space="preserve">Abu Hurayra rapporte du Prophète ﷺ : celui qui dit après chaque prière subhāna Allāh trente-trois fois, al-hamdu lillāh trente-trois fois, Allāhu akbar trente-trois fois — cela fait quatre-vingt-dix-neuf — et complète à cent par lā ilāha illa Allāhu wahdahu lā sharīka lah... ses péchés seront effacés même s'ils étaient comme l'écume de la mer. Quatre-vingt-dix-neuf paroles plus une. Cent. Comme les noms d'Allah. Comme les grains du subha qu'on tient entre les doigts. Et chaque grain efface. Imagine un homme qui prie cinq fois par jour et fait ces dhikrs après chaque prière. Cinq cents paroles par jour. Trois mille cinq cents par semaine. Cent cinquante mille par an. Et chaque parole pèse dans la balance. Pourquoi cette structure tripartite ? Subhāna Allāh dit ce qu'Il n'est pas — pas de défaut, pas d'imperfection. Al-hamdu lillāh dit ce qu'Il fait — toute bonté procède de Lui. Allāhu akbar dit ce qu'Il est — plus grand que tout ce qu'on peut Lui comparer. Négation, action, grandeur. Trois angles pour Le saisir. Et au bout des quatre-vingt-dix-neuf, la profession de foi qui résume tout. Fâtima, la fille du Prophète ﷺ, lui demanda un serviteur tellement le travail était dur. Il lui répondit : je vais t'apprendre quelque chose de mieux qu'un serviteur — ces dhikrs avant de dormir. Ce sont les compagnons les plus patients qu'on puisse avoir.</w:t>
+        <w:t xml:space="preserve">Abu Hurayra rapporte du Prophète ﷺ : celui qui dit après chaque prière subhan Allah trente-trois fois, al-hamdu lillāh trente-trois fois, Allahu akbar trente-trois fois — cela fait quatre-vingt-dix-neuf — et complète à cent par lā ilāha illa Allahu wahdahu lā sharīka lah... ses péchés seront effacés même s'ils étaient comme l'écume de la mer. Quatre-vingt-dix-neuf paroles plus une. Cent. Comme les noms d'Allah. Comme les grains du subha qu'on tient entre les doigts. Et chaque grain efface. Imagine un homme qui prie cinq fois par jour et fait ces dhikrs après chaque prière. Cinq cents paroles par jour. Trois mille cinq cents par semaine. Cent cinquante mille par an. Et chaque parole pèse dans la balance. Pourquoi cette structure tripartite ? Subhan Allah dit ce qu'Il n'est pas — pas de défaut, pas d'imperfection. Al-hamdu lillāh dit ce qu'Il fait — toute bonté procède de Lui. Allahu akbar dit ce qu'Il est — plus grand que tout ce qu'on peut Lui comparer. Négation, action, grandeur. Trois angles pour Le saisir. Et au bout des quatre-vingt-dix-neuf, la profession de foi qui résume tout. Fâtima, la fille du Prophète ﷺ, lui demanda un serviteur tellement le travail était dur. Il lui répondit : je vais t'apprendre quelque chose de mieux qu'un serviteur — ces dhikrs avant de dormir. Ce sont les compagnons les plus patients qu'on puisse avoir.</w:t>
       </w:r>
     </w:p>
     <w:p>
@@ -5724,7 +5724,7 @@
           <w:sz w:val="22"/>
           <w:szCs w:val="22"/>
         </w:rPr>
-        <w:t xml:space="preserve">Abu Umâma rapporte que le Prophète ﷺ a dit : celui qui récite Āyat al-Kursī après chaque prière obligatoire, rien ne le sépare de l'entrée au Paradis sinon la mort. Phrase qui devrait faire trembler tout musulman. Rien — sauf la mort. Tu meurs, tu entres. Si simple. Si à portée. Cinq fois par jour. Le Verset du Trône — déjà vu au jour 35 comme protection matinale — devient ici un pont après chaque salât. Pourquoi cette parole précisément ? Parce qu'elle est la plus grande affirmation de l'Unité dans tout le Coran. Tu viens de prier. Tu sors de l'intimité. Et au seuil, tu plantes un drapeau qui résume tout : Allāhu lā ilāha illā huwa — Allah, point de divinité à part Lui. Le Vivant. Le Subsistant. Celui qui ne dort jamais. Toute la majesté en quelques mots. Et tu repars dans le monde équipé de cette parole comme on repart avec une carte. Le verset reste avec toi. Il garde derrière toi. Il garde devant toi. Et quand le sommeil viendra une nuit qui ne ramènera pas le matin, le verset sera la dernière chose qu'Allah aura entendue de ta bouche cinq fois ce jour-là.</w:t>
+        <w:t xml:space="preserve">Abu Umâma rapporte que le Prophète ﷺ a dit : celui qui récite Āyat al-Kursī après chaque prière obligatoire, rien ne le sépare de l'entrée au Paradis sinon la mort. Phrase qui devrait faire trembler tout musulman. Rien — sauf la mort. Tu meurs, tu entres. Si simple. Si à portée. Cinq fois par jour. Le Verset du Trône — déjà vu au jour 35 comme protection matinale — devient ici un pont après chaque salât. Pourquoi cette parole précisément ? Parce qu'elle est la plus grande affirmation de l'Unité dans tout le Coran. Tu viens de prier. Tu sors de l'intimité. Et au seuil, tu plantes un drapeau qui résume tout : Allahu lā ilāha illā huwa — Allah, point de divinité à part Lui. Le Vivant. Le Subsistant. Celui qui ne dort jamais. Toute la majesté en quelques mots. Et tu repars dans le monde équipé de cette parole comme on repart avec une carte. Le verset reste avec toi. Il garde derrière toi. Il garde devant toi. Et quand le sommeil viendra une nuit qui ne ramènera pas le matin, le verset sera la dernière chose qu'Allah aura entendue de ta bouche cinq fois ce jour-là.</w:t>
       </w:r>
     </w:p>
     <w:p>
@@ -5906,7 +5906,7 @@
           <w:sz w:val="22"/>
           <w:szCs w:val="22"/>
         </w:rPr>
-        <w:t xml:space="preserve">Mu'âdh ibn Jabal était le compagnon le plus jeune envoyé par le Prophète ﷺ enseigner au Yémen. Avant le départ, le Prophète ﷺ lui prit la main et lui dit : ô Mu'âdh, par Allah, je t'aime. Alors je te recommande, ne manque jamais de dire après chaque prière : Allāhumma a'innī 'alā dhikrika wa shukrika wa husni 'ibādatika. Du Prophète ﷺ à Mu'âdh, par amour. Pas un ordre — un cadeau. Trois demandes glissées dans une phrase courte. Aide-moi à me souvenir de Toi — parce que sans Ton aide, je T'oublierai. La distraction du monde est plus forte que ma volonté seule. Aide-moi à Te remercier — parce que sans Ton aide, je tiendrai pour acquis ce qui ne l'est pas. Mon cœur s'habitue aux bienfaits. Il en faut peu pour qu'il oublie. Aide-moi à T'adorer de la meilleure façon — pas seulement à T'adorer, mais à le faire bien. Avec présence. Avec sincérité. Avec excellence. Trois demandes qui reconnaissent qu'on ne peut rien faire seul. Pas même se souvenir de Celui qu'on devrait toujours avoir en tête. La phrase est l'aveu humble que la pratique elle-même est un don d'Allah.</w:t>
+        <w:t xml:space="preserve">Mu'âdh ibn Jabal était le compagnon le plus jeune envoyé par le Prophète ﷺ enseigner au Yémen. Avant le départ, le Prophète ﷺ lui prit la main et lui dit : ô Mu'âdh, par Allah, je t'aime. Alors je te recommande, ne manque jamais de dire après chaque prière : Allahumma a'innī 'alā dhikrika wa shukrika wa husni 'ibādatika. Du Prophète ﷺ à Mu'âdh, par amour. Pas un ordre — un cadeau. Trois demandes glissées dans une phrase courte. Aide-moi à me souvenir de Toi — parce que sans Ton aide, je T'oublierai. La distraction du monde est plus forte que ma volonté seule. Aide-moi à Te remercier — parce que sans Ton aide, je tiendrai pour acquis ce qui ne l'est pas. Mon cœur s'habitue aux bienfaits. Il en faut peu pour qu'il oublie. Aide-moi à T'adorer de la meilleure façon — pas seulement à T'adorer, mais à le faire bien. Avec présence. Avec sincérité. Avec excellence. Trois demandes qui reconnaissent qu'on ne peut rien faire seul. Pas même se souvenir de Celui qu'on devrait toujours avoir en tête. La phrase est l'aveu humble que la pratique elle-même est un don d'Allah.</w:t>
       </w:r>
     </w:p>
     <w:p>
@@ -5997,7 +5997,7 @@
           <w:sz w:val="22"/>
           <w:szCs w:val="22"/>
         </w:rPr>
-        <w:t xml:space="preserve">Aïcha a vu le Prophète ﷺ se précipiter quand la pluie commençait. Il sortait. Il tendait la main. Il offrait son visage et son corps aux premières gouttes. Elle lui demanda : pourquoi fais-tu cela ? Il répondit : parce qu'elle vient juste de quitter son Seigneur. La pluie. Vient. Juste. De. Quitter. Son. Seigneur. Phrase qui change tout. Tu vois la pluie. Tu sors le parapluie. Tu peste contre le mauvais temps. Le Prophète ﷺ voyait quelque chose d'autre. Il voyait une chose qui venait directement d'Allah, qui n'avait fait qu'un trajet — du Ciel à la terre — et qu'il fallait accueillir avec respect, le corps mouillé. Allāhumma sayyiban nāfi'an. Sayyib veut dire pluie battante, abondante. Nāfi' veut dire utile, bienfaisante. Toute pluie n'est pas bienfaisante. Certaines inondent, détruisent, emportent. La du'a demande la version douce. Précise. La pluie qui pénètre le sol, fait pousser les blés, remplit les nappes. Pas celle qui balaie tout. Au moment où la pluie tombe, beaucoup en sont indifférents. Toi tu peux faire ce que faisait le Prophète ﷺ — la nommer, la demander, l'accueillir.</w:t>
+        <w:t xml:space="preserve">Aïcha a vu le Prophète ﷺ se précipiter quand la pluie commençait. Il sortait. Il tendait la main. Il offrait son visage et son corps aux premières gouttes. Elle lui demanda : pourquoi fais-tu cela ? Il répondit : parce qu'elle vient juste de quitter son Seigneur. La pluie. Vient. Juste. De. Quitter. Son. Seigneur. Phrase qui change tout. Tu vois la pluie. Tu sors le parapluie. Tu peste contre le mauvais temps. Le Prophète ﷺ voyait quelque chose d'autre. Il voyait une chose qui venait directement d'Allah, qui n'avait fait qu'un trajet — du Ciel à la terre — et qu'il fallait accueillir avec respect, le corps mouillé. Allahumma sayyiban nāfi'an. Sayyib veut dire pluie battante, abondante. Nāfi' veut dire utile, bienfaisante. Toute pluie n'est pas bienfaisante. Certaines inondent, détruisent, emportent. La du'a demande la version douce. Précise. La pluie qui pénètre le sol, fait pousser les blés, remplit les nappes. Pas celle qui balaie tout. Au moment où la pluie tombe, beaucoup en sont indifférents. Toi tu peux faire ce que faisait le Prophète ﷺ — la nommer, la demander, l'accueillir.</w:t>
       </w:r>
     </w:p>
     <w:p>
@@ -6088,7 +6088,7 @@
           <w:sz w:val="22"/>
           <w:szCs w:val="22"/>
         </w:rPr>
-        <w:t xml:space="preserve">Zayd ibn Khâlid raconte qu'après une nuit de pluie, le Prophète ﷺ pria le matin avec ses compagnons puis se tourna vers eux et dit : savez-vous ce que votre Seigneur a dit cette nuit ? Ils dirent : Allah et Son messager savent mieux. Il dit : Allah a dit — au matin, parmi Mes serviteurs, il y en a un croyant en Moi et un mécréant. Celui qui dit il a plu sur nous par la grâce d'Allah et Sa miséricorde — celui-là croit en Moi et mécroit aux astres. Celui qui dit il a plu à cause de tel astre, de telle position des étoiles — celui-là croit aux astres et mécroit en Moi. Hadith sidérant. La pluie devient un test. Pas un événement météorologique — un test de croyance. À qui attribues-tu la pluie ? Quand tu dis météo, tu dis astres déguisés en science. Quand tu dis nuage, tu dis cause sans Cause. Le Prophète ﷺ enseigne à dire la phrase qui restitue. Bifadli Allāhi wa rahmatih. Par Sa grâce et Sa miséricorde. Pas par hasard. Pas par mécanique. Par Lui. Phrase courte. Mais elle te place du bon côté de la déclaration divine entendue cette nuit-là. Croyant ou mécréant — la pluie devient frontière.</w:t>
+        <w:t xml:space="preserve">Zayd ibn Khâlid raconte qu'après une nuit de pluie, le Prophète ﷺ pria le matin avec ses compagnons puis se tourna vers eux et dit : savez-vous ce que votre Seigneur a dit cette nuit ? Ils dirent : Allah et Son messager savent mieux. Il dit : Allah a dit — au matin, parmi Mes serviteurs, il y en a un croyant en Moi et un mécréant. Celui qui dit il a plu sur nous par la grâce d'Allah et Sa miséricorde — celui-là croit en Moi et mécroit aux astres. Celui qui dit il a plu à cause de tel astre, de telle position des étoiles — celui-là croit aux astres et mécroit en Moi. Hadith sidérant. La pluie devient un test. Pas un événement météorologique — un test de croyance. À qui attribues-tu la pluie ? Quand tu dis météo, tu dis astres déguisés en science. Quand tu dis nuage, tu dis cause sans Cause. Le Prophète ﷺ enseigne à dire la phrase qui restitue. Bifadli Allahi wa rahmatih. Par Sa grâce et Sa miséricorde. Pas par hasard. Pas par mécanique. Par Lui. Phrase courte. Mais elle te place du bon côté de la déclaration divine entendue cette nuit-là. Croyant ou mécréant — la pluie devient frontière.</w:t>
       </w:r>
     </w:p>
     <w:p>
@@ -6634,7 +6634,7 @@
           <w:sz w:val="22"/>
           <w:szCs w:val="22"/>
         </w:rPr>
-        <w:t xml:space="preserve">Abu Râfi' rapporte qu'il vit le Prophète ﷺ faire l'adhân à l'oreille de Hassan, le nouveau-né de Fâtima, dès sa naissance. La première parole qu'entend un humain qui vient de naître devrait être le nom d'Allah. Pas un mot d'amour humain. Pas une parole de la mère ou du père — ils viendront ensuite. La première — le takbîr. Allāhu akbar. Allah est plus grand. Avant que cet enfant connaisse le visage de qui que ce soit, il connaît cette parole. Avant que sa langue puisse répéter, son oreille a reçu. Le Prophète ﷺ savait que l'oreille du nouveau-né est ouverte d'une manière qu'on ne retrouvera plus. Tout entre. Tout grave. Il a choisi de graver l'adhân. Et l'iqâma à l'oreille gauche — celle qui va l'appeler vers la prière toute sa vie. Comme si on disait à l'enfant dès le premier instant : tu es né, et il y a déjà une prière qui t'attend. Tu n'es pas venu seul, sans direction, sans appel. Tu es né dans un monde où l'appel à la prière retentit, et ta première oreille en a été baignée. Beaucoup de musulmans modernes ont oublié ce geste. Ils accueillent leur enfant sans rien dire de sacré. Le geste prophétique est simple et prend trois minutes. Mais il inscrit l'enfant dans une lignée d'appelés.</w:t>
+        <w:t xml:space="preserve">Abu Râfi' rapporte qu'il vit le Prophète ﷺ faire l'adhân à l'oreille de Hassan, le nouveau-né de Fâtima, dès sa naissance. La première parole qu'entend un humain qui vient de naître devrait être le nom d'Allah. Pas un mot d'amour humain. Pas une parole de la mère ou du père — ils viendront ensuite. La première — le takbîr. Allahu akbar. Allah est plus grand. Avant que cet enfant connaisse le visage de qui que ce soit, il connaît cette parole. Avant que sa langue puisse répéter, son oreille a reçu. Le Prophète ﷺ savait que l'oreille du nouveau-né est ouverte d'une manière qu'on ne retrouvera plus. Tout entre. Tout grave. Il a choisi de graver l'adhân. Et l'iqâma à l'oreille gauche — celle qui va l'appeler vers la prière toute sa vie. Comme si on disait à l'enfant dès le premier instant : tu es né, et il y a déjà une prière qui t'attend. Tu n'es pas venu seul, sans direction, sans appel. Tu es né dans un monde où l'appel à la prière retentit, et ta première oreille en a été baignée. Beaucoup de musulmans modernes ont oublié ce geste. Ils accueillent leur enfant sans rien dire de sacré. Le geste prophétique est simple et prend trois minutes. Mais il inscrit l'enfant dans une lignée d'appelés.</w:t>
       </w:r>
     </w:p>
     <w:p>
@@ -6998,7 +6998,7 @@
           <w:sz w:val="22"/>
           <w:szCs w:val="22"/>
         </w:rPr>
-        <w:t xml:space="preserve">Anas ibn Mâlik rapporte du Prophète ﷺ : celui qui voit quelque chose qui lui plaît et dit mā shā'a Allāh, lā quwwata illā billāh — rien ne nuira à cette chose. Phrase brève. Mais elle désamorce un mécanisme spirituel ancien et reconnu. Quand tu vois la beauté d'un enfant et que tu dis quel bel enfant — sans mentionner Allah — quelque chose dans ton regard peut blesser cet enfant. Pas par méchanceté. Par admiration nue. L'admiration nue contient un grain d'envie, même imperceptible. Et ce grain peut faire mal. Mā shā'a Allāh — c'est ce qu'Allah a voulu — replace la beauté à sa source. Tu ne dis plus quel bel enfant comme s'il était beau par hasard ou par les mérites de ses parents. Tu dis : Allah a voulu qu'il soit ainsi. Lā quwwata illā billāh — il n'y a de puissance que par Allah. Cet enfant ne tient pas debout par lui-même, ni par sa famille — par Lui. Phrase d'humilité qui rend toute admiration acceptable. On peut louer beaucoup, à condition de relier sans cesse à la Source. Sinon, l'admiration humaine devient une arme contre celui qu'elle vise. Cette phrase est aussi celle d'un homme dans le Coran, dans la sourate Al-Kahf, qui visite le jardin d'un orgueilleux et lui reproche de ne pas avoir dit ces mots en entrant.</w:t>
+        <w:t xml:space="preserve">Anas ibn Mâlik rapporte du Prophète ﷺ : celui qui voit quelque chose qui lui plaît et dit mā shā'a Allah, lā quwwata illā billāh — rien ne nuira à cette chose. Phrase brève. Mais elle désamorce un mécanisme spirituel ancien et reconnu. Quand tu vois la beauté d'un enfant et que tu dis quel bel enfant — sans mentionner Allah — quelque chose dans ton regard peut blesser cet enfant. Pas par méchanceté. Par admiration nue. L'admiration nue contient un grain d'envie, même imperceptible. Et ce grain peut faire mal. Mā shā'a Allah — c'est ce qu'Allah a voulu — replace la beauté à sa source. Tu ne dis plus quel bel enfant comme s'il était beau par hasard ou par les mérites de ses parents. Tu dis : Allah a voulu qu'il soit ainsi. Lā quwwata illā billāh — il n'y a de puissance que par Allah. Cet enfant ne tient pas debout par lui-même, ni par sa famille — par Lui. Phrase d'humilité qui rend toute admiration acceptable. On peut louer beaucoup, à condition de relier sans cesse à la Source. Sinon, l'admiration humaine devient une arme contre celui qu'elle vise. Cette phrase est aussi celle d'un homme dans le Coran, dans la sourate Al-Kahf, qui visite le jardin d'un orgueilleux et lui reproche de ne pas avoir dit ces mots en entrant.</w:t>
       </w:r>
     </w:p>
     <w:p>
@@ -7271,7 +7271,7 @@
           <w:sz w:val="22"/>
           <w:szCs w:val="22"/>
         </w:rPr>
-        <w:t xml:space="preserve">Anas rapporte qu'un homme passa près du Prophète ﷺ pendant qu'il était avec ses compagnons. Le Prophète ﷺ dit : je l'aime, par Allah. L'un de ses compagnons se leva. Il alla à l'homme. Il lui dit : le Prophète ﷺ a dit qu'il t'aime, par Allah. L'homme répondit : que t'aime Celui pour qui tu m'aimes. Le compagnon revint rapporter. Le Prophète ﷺ sourit. Cette pratique — dire à un frère qu'on l'aime — est une obligation prophétique. Pas un sentiment vague gardé pour soi. Une parole prononcée. Le Prophète ﷺ a dit : quand l'un de vous aime son frère, qu'il le lui dise. Pourquoi ? Parce que l'amour non dit s'évapore. Combien d'amis se sont éloignés simplement parce qu'aucun n'a osé dire à l'autre ce qu'il représentait pour lui ? Combien de fratries se sont effritées par non-dit ? La parole nomme. Et la nomination renforce. Mais surtout : innī uhibbuka fī Allāh. Je t'aime en Allah. Pas pour ce que tu m'apportes. Pas pour ton charisme. Pas pour les souvenirs partagés. En Allah — c'est-à-dire pour Sa cause, parce que tu Le sers, parce que tu m'aides à Le servir. Cet amour-là est le seul qui survit aux séparations, aux brouilles passagères, à la mort. Le Prophète ﷺ a dit que ceux qui s'aiment en Allah seront à l'ombre de Son Trône le jour où il n'y aura d'autre ombre que la Sienne.</w:t>
+        <w:t xml:space="preserve">Anas rapporte qu'un homme passa près du Prophète ﷺ pendant qu'il était avec ses compagnons. Le Prophète ﷺ dit : je l'aime, par Allah. L'un de ses compagnons se leva. Il alla à l'homme. Il lui dit : le Prophète ﷺ a dit qu'il t'aime, par Allah. L'homme répondit : que t'aime Celui pour qui tu m'aimes. Le compagnon revint rapporter. Le Prophète ﷺ sourit. Cette pratique — dire à un frère qu'on l'aime — est une obligation prophétique. Pas un sentiment vague gardé pour soi. Une parole prononcée. Le Prophète ﷺ a dit : quand l'un de vous aime son frère, qu'il le lui dise. Pourquoi ? Parce que l'amour non dit s'évapore. Combien d'amis se sont éloignés simplement parce qu'aucun n'a osé dire à l'autre ce qu'il représentait pour lui ? Combien de fratries se sont effritées par non-dit ? La parole nomme. Et la nomination renforce. Mais surtout : innī uhibbuka fī Allah. Je t'aime en Allah. Pas pour ce que tu m'apportes. Pas pour ton charisme. Pas pour les souvenirs partagés. En Allah — c'est-à-dire pour Sa cause, parce que tu Le sers, parce que tu m'aides à Le servir. Cet amour-là est le seul qui survit aux séparations, aux brouilles passagères, à la mort. Le Prophète ﷺ a dit que ceux qui s'aiment en Allah seront à l'ombre de Son Trône le jour où il n'y aura d'autre ombre que la Sienne.</w:t>
       </w:r>
     </w:p>
     <w:p>
@@ -7908,7 +7908,7 @@
           <w:sz w:val="22"/>
           <w:szCs w:val="22"/>
         </w:rPr>
-        <w:t xml:space="preserve">Miqdâd ibn al-Aswad raconte une histoire. Une nuit, il avait faim. Ses compagnons aussi. Le Prophète ﷺ aussi. Ils n'avaient rien. Un homme leur offrit du lait. Ils burent. Le Prophète ﷺ but. Et il leva les mains et prononça ces mots : Allāhumma at'im man at'amanī, wasqi man saqānī. Ô Allah, nourris celui qui m'a nourri, abreuve celui qui m'a abreuvé. Phrase courte et bouleversante. Quand quelqu'un t'offre à manger, tu peux dire merci. Tu peux dire que c'était bon. Tu peux promettre de le rendre. Mais le Prophète ﷺ enseigne autre chose. Tu te tournes vers Allah et tu demandes à Allah de nourrir cette personne. Inversion du circuit. Le repas vient d'Allah à l'hôte, de l'hôte à toi. Tu renvoies à Allah, pour qu'Allah donne à l'hôte. Et Allah donne mieux que ce que l'hôte t'a donné. Allah donne dans le visible et l'invisible. Allah donne dans cette vie et dans l'autre. Tu ne peux pas rendre à ton hôte ce qu'il vaut. Tu peux demander à Celui qui peut. Cette du'a est l'élégance même. Elle reconnaît la dette. Elle confie son paiement à Celui qui paye en monnaie qu'aucun humain ne possède.</w:t>
+        <w:t xml:space="preserve">Miqdâd ibn al-Aswad raconte une histoire. Une nuit, il avait faim. Ses compagnons aussi. Le Prophète ﷺ aussi. Ils n'avaient rien. Un homme leur offrit du lait. Ils burent. Le Prophète ﷺ but. Et il leva les mains et prononça ces mots : Allahumma at'im man at'amanī, wasqi man saqānī. Ô Allah, nourris celui qui m'a nourri, abreuve celui qui m'a abreuvé. Phrase courte et bouleversante. Quand quelqu'un t'offre à manger, tu peux dire merci. Tu peux dire que c'était bon. Tu peux promettre de le rendre. Mais le Prophète ﷺ enseigne autre chose. Tu te tournes vers Allah et tu demandes à Allah de nourrir cette personne. Inversion du circuit. Le repas vient d'Allah à l'hôte, de l'hôte à toi. Tu renvoies à Allah, pour qu'Allah donne à l'hôte. Et Allah donne mieux que ce que l'hôte t'a donné. Allah donne dans le visible et l'invisible. Allah donne dans cette vie et dans l'autre. Tu ne peux pas rendre à ton hôte ce qu'il vaut. Tu peux demander à Celui qui peut. Cette du'a est l'élégance même. Elle reconnaît la dette. Elle confie son paiement à Celui qui paye en monnaie qu'aucun humain ne possède.</w:t>
       </w:r>
     </w:p>
     <w:p>
@@ -7999,7 +7999,7 @@
           <w:sz w:val="22"/>
           <w:szCs w:val="22"/>
         </w:rPr>
-        <w:t xml:space="preserve">Ibn Omar rapporte que le Prophète ﷺ disait cela au moment de rompre le jeûne. Trois constats. Dhahaba az-zama' — la soif est partie. Wabtallati al-'urūq — les veines se sont humectées. Phrase physique. Tu sens dans ton corps ce que l'eau fait. Tu décris ce que tu vis. Le Prophète ﷺ enseignait à nommer ce qu'on ressent. Pas à le subir distraitement. La soif partait — il le disait. Les veines se réhydrataient — il le sentait et le nommait. Puis le constat spirituel : wa thabata al-ajr in shā'a Allāh — la récompense est établie, si Allah le veut. Tu as jeûné toute la journée. Tu as eu faim. Tu as eu soif. Tu as résisté. Et au moment où le soleil disparaît et que tu bois, tu te dis : ce que j'ai fait est compté. La récompense est inscrite. Si Allah le veut — parce que rien n'est garanti, même la récompense de l'acte le mieux fait peut être annulée par un mauvais comportement ailleurs. Mais en première intention, la récompense est là. Trois constats en cinq mots arabes. Le corps soulagé. Les veines remplies. Le ciel qui inscrit. Voilà ce qui se passe quand on rompt un jeûne. La phrase t'aide à le voir.</w:t>
+        <w:t xml:space="preserve">Ibn Omar rapporte que le Prophète ﷺ disait cela au moment de rompre le jeûne. Trois constats. Dhahaba az-zama' — la soif est partie. Wabtallati al-'urūq — les veines se sont humectées. Phrase physique. Tu sens dans ton corps ce que l'eau fait. Tu décris ce que tu vis. Le Prophète ﷺ enseignait à nommer ce qu'on ressent. Pas à le subir distraitement. La soif partait — il le disait. Les veines se réhydrataient — il le sentait et le nommait. Puis le constat spirituel : wa thabata al-ajr in shā'a Allah — la récompense est établie, si Allah le veut. Tu as jeûné toute la journée. Tu as eu faim. Tu as eu soif. Tu as résisté. Et au moment où le soleil disparaît et que tu bois, tu te dis : ce que j'ai fait est compté. La récompense est inscrite. Si Allah le veut — parce que rien n'est garanti, même la récompense de l'acte le mieux fait peut être annulée par un mauvais comportement ailleurs. Mais en première intention, la récompense est là. Trois constats en cinq mots arabes. Le corps soulagé. Les veines remplies. Le ciel qui inscrit. Voilà ce qui se passe quand on rompt un jeûne. La phrase t'aide à le voir.</w:t>
       </w:r>
     </w:p>
     <w:p>
@@ -9000,7 +9000,7 @@
           <w:sz w:val="22"/>
           <w:szCs w:val="22"/>
         </w:rPr>
-        <w:t xml:space="preserve">On a déjà vu cette phrase au jour 27. Elle revient ici dans son contexte le plus haut — celui d'Ibrahim. Le peuple d'Ibrahim avait construit un bûcher gigantesque pour le brûler vivant. Le feu était si grand qu'on devait catapulter Ibrahim depuis loin. Quand on le lança, Jibrîl descendit et lui demanda : as-tu besoin de quelque chose ? Ibrahim répondit : pas de toi. Allah me suffit. Hasbunā Allāhu wa ni'ma al-wakīl. Et Allah ordonna au feu : sois fraîcheur et paix pour Ibrahim. Le feu se transforma en jardin. Ibrahim sortit indemne. Plus tard, le Prophète ﷺ et ses compagnons, après la bataille d'Uhud, apprirent qu'une grande armée se rassemblait pour finir le travail. Tout le monde leur dit : ils viennent vous achever. Et leur réponse fut la même phrase — Hasbunā Allāhu wa ni'ma al-wakīl. Et Allah retira la peur de leur cœur, et l'armée ennemie se dispersa sans combat. Deux fois la même phrase. Deux fois l'impossible renversé. La phrase est si puissante qu'on devrait la dire au moins une fois par jour, même sans crise. Pour s'habituer à elle. Pour que lorsque la vraie crise viendra — et elle viendra — la phrase soit déjà à fleur de langue, comme elle l'était pour Ibrahim quand il tombait dans le feu.</w:t>
+        <w:t xml:space="preserve">On a déjà vu cette phrase au jour 27. Elle revient ici dans son contexte le plus haut — celui d'Ibrahim. Le peuple d'Ibrahim avait construit un bûcher gigantesque pour le brûler vivant. Le feu était si grand qu'on devait catapulter Ibrahim depuis loin. Quand on le lança, Jibrîl descendit et lui demanda : as-tu besoin de quelque chose ? Ibrahim répondit : pas de toi. Allah me suffit. Hasbunā Allahu wa ni'ma al-wakīl. Et Allah ordonna au feu : sois fraîcheur et paix pour Ibrahim. Le feu se transforma en jardin. Ibrahim sortit indemne. Plus tard, le Prophète ﷺ et ses compagnons, après la bataille d'Uhud, apprirent qu'une grande armée se rassemblait pour finir le travail. Tout le monde leur dit : ils viennent vous achever. Et leur réponse fut la même phrase — Hasbunā Allahu wa ni'ma al-wakīl. Et Allah retira la peur de leur cœur, et l'armée ennemie se dispersa sans combat. Deux fois la même phrase. Deux fois l'impossible renversé. La phrase est si puissante qu'on devrait la dire au moins une fois par jour, même sans crise. Pour s'habituer à elle. Pour que lorsque la vraie crise viendra — et elle viendra — la phrase soit déjà à fleur de langue, comme elle l'était pour Ibrahim quand il tombait dans le feu.</w:t>
       </w:r>
     </w:p>
     <w:p>
@@ -9273,7 +9273,7 @@
           <w:sz w:val="22"/>
           <w:szCs w:val="22"/>
         </w:rPr>
-        <w:t xml:space="preserve">Abu Sa'îd al-Khudrî rapporte du Prophète ﷺ : faites prononcer à vos mourants lā ilāha illa Allāh. Trois mots. Mais avec une instruction précise : faites-leur prononcer. Pas insister. Pas répéter agressivement. Faites doucement, par évocation. Pourquoi ? Parce que le Prophète ﷺ a dit : celui dont la dernière parole est lā ilāha illa Allāh entrera au Paradis. La dernière parole. Pas une parole quelconque dite dans la vie — la dernière, celle qui sort au moment où le souffle s'arrête. Et celui qui agonise n'y pense pas toujours. Il a mal. Il est paniqué. Sa langue s'emmêle. Satan, dit-on, fait son ultime tentative à ce moment-là — il propose de l'eau contre l'apostasie, il joue sur la peur, il essaie d'arracher l'aveu inverse. Le proche qui rappelle doucement la shahâda accomplit le geste le plus précieux qu'un humain puisse faire pour un autre humain. Tu ne peux pas lui sauver la vie. Mais tu peux peut-être lui sauver l'éternité. Comment faire ? On la dit soi-même, à côté du mourant, doucement. On ne lui ordonne pas — on la prononce. Lui l'entend. Sa langue, par mimétisme spirituel, suit. Aïcha a fait cela pour son père Abu Bakr. Les compagnons l'ont fait les uns pour les autres. Cette transmission ultime est l'un des actes les plus discrets et les plus immenses de l'islam.</w:t>
+        <w:t xml:space="preserve">Abu Sa'îd al-Khudrî rapporte du Prophète ﷺ : faites prononcer à vos mourants lā ilāha illa Allah. Trois mots. Mais avec une instruction précise : faites-leur prononcer. Pas insister. Pas répéter agressivement. Faites doucement, par évocation. Pourquoi ? Parce que le Prophète ﷺ a dit : celui dont la dernière parole est lā ilāha illa Allah entrera au Paradis. La dernière parole. Pas une parole quelconque dite dans la vie — la dernière, celle qui sort au moment où le souffle s'arrête. Et celui qui agonise n'y pense pas toujours. Il a mal. Il est paniqué. Sa langue s'emmêle. Satan, dit-on, fait son ultime tentative à ce moment-là — il propose de l'eau contre l'apostasie, il joue sur la peur, il essaie d'arracher l'aveu inverse. Le proche qui rappelle doucement la shahâda accomplit le geste le plus précieux qu'un humain puisse faire pour un autre humain. Tu ne peux pas lui sauver la vie. Mais tu peux peut-être lui sauver l'éternité. Comment faire ? On la dit soi-même, à côté du mourant, doucement. On ne lui ordonne pas — on la prononce. Lui l'entend. Sa langue, par mimétisme spirituel, suit. Aïcha a fait cela pour son père Abu Bakr. Les compagnons l'ont fait les uns pour les autres. Cette transmission ultime est l'un des actes les plus discrets et les plus immenses de l'islam.</w:t>
       </w:r>
     </w:p>
     <w:p>
@@ -9910,7 +9910,7 @@
           <w:sz w:val="22"/>
           <w:szCs w:val="22"/>
         </w:rPr>
-        <w:t xml:space="preserve">Aïcha vint demander au Prophète ﷺ : ô Messager d'Allah, si je tombe sur Laylat al-Qadr, que dois-je dire ? Il répondit : dis Allāhumma innaka 'afuwwun tuhibbu al-'afwa fa'fu 'annī. La Nuit du Destin. Une nuit meilleure que mille mois — soit plus de quatre-vingt-trois ans, soit plus qu'une vie humaine entière. Une seule nuit. Dans laquelle un acte fait pèse plus que tous les actes faits pendant quatre-vingt-trois ans. Et le Prophète ﷺ a caché la date exacte. Pourquoi ? Pour que tu cherches. Pour que tu veilles plusieurs nuits, pas une seule. Pour que tu nettoies tout le mois, pas juste un soir. Les savants disent qu'elle tombe le plus souvent la nuit du 27, mais cela varie. Le mieux est de veiller les dix dernières nuits, comme faisait le Prophète ﷺ. Aïcha demande la bonne du'a pour cette nuit. Le Prophète ﷺ ne donne pas une longue liste. Il donne une seule phrase. Pourquoi ? Parce que dans cette nuit exceptionnelle, la priorité est le pardon. Pas la richesse, pas la santé, pas la descendance. Le pardon. Parce que sans pardon, rien ne sert. Tu peux avoir tout dans cette vie — sans le pardon, tu perds dans l'autre. Et le pardon dans cette nuit-là est démultiplié. Une demande sincère équivaut à des années de demandes ordinaires. La phrase est calibrée parfaitement. Tu es Le Pardonneur — affirmation. Tu aimes le pardon — précision essentielle, Il aime pardonner, ce n'est pas un acte qui Lui coûte, c'est un acte qu'Il aime. Pardonne-moi — la demande. Cinq mots arabes. Une nuit qui change tout.</w:t>
+        <w:t xml:space="preserve">Aïcha vint demander au Prophète ﷺ : ô Messager d'Allah, si je tombe sur Laylat al-Qadr, que dois-je dire ? Il répondit : dis Allahumma innaka 'afuwwun tuhibbu al-'afwa fa'fu 'annī. La Nuit du Destin. Une nuit meilleure que mille mois — soit plus de quatre-vingt-trois ans, soit plus qu'une vie humaine entière. Une seule nuit. Dans laquelle un acte fait pèse plus que tous les actes faits pendant quatre-vingt-trois ans. Et le Prophète ﷺ a caché la date exacte. Pourquoi ? Pour que tu cherches. Pour que tu veilles plusieurs nuits, pas une seule. Pour que tu nettoies tout le mois, pas juste un soir. Les savants disent qu'elle tombe le plus souvent la nuit du 27, mais cela varie. Le mieux est de veiller les dix dernières nuits, comme faisait le Prophète ﷺ. Aïcha demande la bonne du'a pour cette nuit. Le Prophète ﷺ ne donne pas une longue liste. Il donne une seule phrase. Pourquoi ? Parce que dans cette nuit exceptionnelle, la priorité est le pardon. Pas la richesse, pas la santé, pas la descendance. Le pardon. Parce que sans pardon, rien ne sert. Tu peux avoir tout dans cette vie — sans le pardon, tu perds dans l'autre. Et le pardon dans cette nuit-là est démultiplié. Une demande sincère équivaut à des années de demandes ordinaires. La phrase est calibrée parfaitement. Tu es Le Pardonneur — affirmation. Tu aimes le pardon — précision essentielle, Il aime pardonner, ce n'est pas un acte qui Lui coûte, c'est un acte qu'Il aime. Pardonne-moi — la demande. Cinq mots arabes. Une nuit qui change tout.</w:t>
       </w:r>
     </w:p>
     <w:p>
@@ -10001,7 +10001,7 @@
           <w:sz w:val="22"/>
           <w:szCs w:val="22"/>
         </w:rPr>
-        <w:t xml:space="preserve">Talha ibn 'Ubaydullâh rapporte du Prophète ﷺ : quand il voyait le nouveau croissant, il disait cette du'a. Et il s'adressait à la lune comme à un témoin. Rabbī wa rabbuka Allāh — mon Seigneur et le tien est Allah. Phrase incroyable. Le Prophète ﷺ parlait à la lune comme à un être qui obéit à Allah au même titre que lui. Pas pour l'adorer — pour la reconnaître comme co-serviteur. Toute la création est musulmane, dit le Coran. Les arbres, les pierres, les astres — tous obéissent à Allah dans leur ordre. Seul l'homme a la liberté de se rebeller. Donc le Prophète ﷺ pouvait dire à la lune — toi et moi nous avons le même Seigneur, donc nous sommes du même côté. Quatre demandes glissées dans la salutation. Amn — sécurité. Que le mois qui s'ouvre soit sûr. Pas de guerre, pas d'accident, pas de catastrophe. Īmān — foi. Que ce mois augmente notre foi, ne la diminue pas. Salāma — bien-être. Que les corps tiennent, que les santés résistent. Islām — soumission. Que la pratique soit maintenue, voire approfondie. Quatre cadres pour un nouveau cycle de vingt-neuf ou trente jours. Et la formule finale — hilālu rushdin wa khayr. Croissant de droiture et de bien. Tu nommes le croissant comme on baptise un objet. Tu lui demandes d'être porteur de ces qualités. Cette du'a est particulièrement précieuse pour Ramadan — voir le croissant qui annonce le mois sacré, et le saluer avec cette parole, c'est commencer le mois sous la meilleure orientation possible.</w:t>
+        <w:t xml:space="preserve">Talha ibn 'Ubaydullâh rapporte du Prophète ﷺ : quand il voyait le nouveau croissant, il disait cette du'a. Et il s'adressait à la lune comme à un témoin. Rabbī wa rabbuka Allah — mon Seigneur et le tien est Allah. Phrase incroyable. Le Prophète ﷺ parlait à la lune comme à un être qui obéit à Allah au même titre que lui. Pas pour l'adorer — pour la reconnaître comme co-serviteur. Toute la création est musulmane, dit le Coran. Les arbres, les pierres, les astres — tous obéissent à Allah dans leur ordre. Seul l'homme a la liberté de se rebeller. Donc le Prophète ﷺ pouvait dire à la lune — toi et moi nous avons le même Seigneur, donc nous sommes du même côté. Quatre demandes glissées dans la salutation. Amn — sécurité. Que le mois qui s'ouvre soit sûr. Pas de guerre, pas d'accident, pas de catastrophe. Īmān — foi. Que ce mois augmente notre foi, ne la diminue pas. Salāma — bien-être. Que les corps tiennent, que les santés résistent. Islām — soumission. Que la pratique soit maintenue, voire approfondie. Quatre cadres pour un nouveau cycle de vingt-neuf ou trente jours. Et la formule finale — hilālu rushdin wa khayr. Croissant de droiture et de bien. Tu nommes le croissant comme on baptise un objet. Tu lui demandes d'être porteur de ces qualités. Cette du'a est particulièrement précieuse pour Ramadan — voir le croissant qui annonce le mois sacré, et le saluer avec cette parole, c'est commencer le mois sous la meilleure orientation possible.</w:t>
       </w:r>
     </w:p>
     <w:p>
@@ -10365,7 +10365,7 @@
           <w:sz w:val="22"/>
           <w:szCs w:val="22"/>
         </w:rPr>
-        <w:t xml:space="preserve">Le Prophète ﷺ a dit : la meilleure du'a est la du'a du jour de 'Arafat. Et la meilleure de ce que j'ai dit, moi et les prophètes avant moi, est : lā ilāha illa Allāhu wahdahu lā sharīka lah, lahu al-mulku wa lahu al-hamdu wa huwa 'alā kulli shay'in qadīr. 'Arafat. La plaine où tous les pèlerins se retrouvent en un jour. Le sommet du Hajj — le Prophète ﷺ a dit : le Hajj, c'est 'Arafat. Sans 'Arafat, pas de Hajj. C'est un avant-goût du Jour de la Résurrection — des millions d'êtres rassemblés dans une plaine, sans rang, sans hiérarchie, tous en blanc, tous demandant pardon. Et Allah, ce jour-là, descend dans Sa lumière et se vante de Ses serviteurs devant les anges. Il dit : regardez Mes serviteurs, ils sont venus à Moi, échevelés et poussiéreux, demandant Ma miséricorde — soyez témoins que Je leur ai pardonné. Les anges sont les témoins. Le pardon est massif ce jour-là. Pour celui qui est à 'Arafat — pardon. Pour celui qui jeûne ce jour, sans être à 'Arafat — pardon de l'année passée et de l'année à venir. C'est le jour le plus rentable spirituellement de l'année. Et la formule essentielle pour ce jour est cette attestation d'Unité, dite et redite. Pourquoi celle-là ? Parce que c'est la phrase qui résume toute la religion. Et quand Allah pardonne en masse, c'est sur la base de cette croyance. Tu n'as rien d'autre à offrir — tu offres cela. Et Allah pardonne.</w:t>
+        <w:t xml:space="preserve">Le Prophète ﷺ a dit : la meilleure du'a est la du'a du jour de 'Arafat. Et la meilleure de ce que j'ai dit, moi et les prophètes avant moi, est : lā ilāha illa Allahu wahdahu lā sharīka lah, lahu al-mulku wa lahu al-hamdu wa huwa 'alā kulli shay'in qadīr. 'Arafat. La plaine où tous les pèlerins se retrouvent en un jour. Le sommet du Hajj — le Prophète ﷺ a dit : le Hajj, c'est 'Arafat. Sans 'Arafat, pas de Hajj. C'est un avant-goût du Jour de la Résurrection — des millions d'êtres rassemblés dans une plaine, sans rang, sans hiérarchie, tous en blanc, tous demandant pardon. Et Allah, ce jour-là, descend dans Sa lumière et se vante de Ses serviteurs devant les anges. Il dit : regardez Mes serviteurs, ils sont venus à Moi, échevelés et poussiéreux, demandant Ma miséricorde — soyez témoins que Je leur ai pardonné. Les anges sont les témoins. Le pardon est massif ce jour-là. Pour celui qui est à 'Arafat — pardon. Pour celui qui jeûne ce jour, sans être à 'Arafat — pardon de l'année passée et de l'année à venir. C'est le jour le plus rentable spirituellement de l'année. Et la formule essentielle pour ce jour est cette attestation d'Unité, dite et redite. Pourquoi celle-là ? Parce que c'est la phrase qui résume toute la religion. Et quand Allah pardonne en masse, c'est sur la base de cette croyance. Tu n'as rien d'autre à offrir — tu offres cela. Et Allah pardonne.</w:t>
       </w:r>
     </w:p>
     <w:p>
@@ -10547,7 +10547,7 @@
           <w:sz w:val="22"/>
           <w:szCs w:val="22"/>
         </w:rPr>
-        <w:t xml:space="preserve">Omar ibn al-Khattâb fit son tawâf. En passant devant la Pierre Noire, il s'arrêta. Il la regarda. Il dit fortement, pour que tout le monde l'entende : par Allah, je sais que tu n'es qu'une pierre, qui ne nuit ni ne profite. Si je n'avais pas vu le Messager d'Allah ﷺ t'embrasser, je ne t'embrasserais pas. Puis il l'embrassa. Phrase fondamentale dans la théologie de l'islam. Aucun objet n'est sacré en soi. La Pierre Noire — pierre noire, peut-être un météorite, on ne sait pas. Elle n'a aucun pouvoir propre. Tu ne pries pas la pierre. Tu pries Allah, et tu embrasses la pierre parce que le Prophète ﷺ l'a embrassée — par fidélité à sa Sunna, pas par culte de la pierre. Pour les Salaf, cette nuance est cardinale. Sans elle, on retombe dans le paganisme. Avec elle, on reste dans le tawhîd. Et le geste reste plein. Pourquoi alors le Prophète ﷺ embrassait-il cette pierre ? Parce qu'elle est, dit-il, descendue du Paradis. Elle était blanche à l'origine, ce sont les péchés des humains qui l'ont noircie. C'est une trace. Comme on garde une photo d'un être cher. La photo n'est pas la personne — mais on la regarde par amour. La Pierre Noire est une photo terrestre du Paradis. On la salue. On dit Bismillāh — au nom d'Allah, pour bien clarifier qu'on ne la prie pas. Et Allāhu akbar — Allah est plus grand qu'elle, plus grand que tout. La pierre rétrécit. Allah occupe la place.</w:t>
+        <w:t xml:space="preserve">Omar ibn al-Khattâb fit son tawâf. En passant devant la Pierre Noire, il s'arrêta. Il la regarda. Il dit fortement, pour que tout le monde l'entende : par Allah, je sais que tu n'es qu'une pierre, qui ne nuit ni ne profite. Si je n'avais pas vu le Messager d'Allah ﷺ t'embrasser, je ne t'embrasserais pas. Puis il l'embrassa. Phrase fondamentale dans la théologie de l'islam. Aucun objet n'est sacré en soi. La Pierre Noire — pierre noire, peut-être un météorite, on ne sait pas. Elle n'a aucun pouvoir propre. Tu ne pries pas la pierre. Tu pries Allah, et tu embrasses la pierre parce que le Prophète ﷺ l'a embrassée — par fidélité à sa Sunna, pas par culte de la pierre. Pour les Salaf, cette nuance est cardinale. Sans elle, on retombe dans le paganisme. Avec elle, on reste dans le tawhîd. Et le geste reste plein. Pourquoi alors le Prophète ﷺ embrassait-il cette pierre ? Parce qu'elle est, dit-il, descendue du Paradis. Elle était blanche à l'origine, ce sont les péchés des humains qui l'ont noircie. C'est une trace. Comme on garde une photo d'un être cher. La photo n'est pas la personne — mais on la regarde par amour. La Pierre Noire est une photo terrestre du Paradis. On la salue. On dit Bismillah — au nom d'Allah, pour bien clarifier qu'on ne la prie pas. Et Allahu akbar — Allah est plus grand qu'elle, plus grand que tout. La pierre rétrécit. Allah occupe la place.</w:t>
       </w:r>
     </w:p>
     <w:p>
@@ -11730,7 +11730,7 @@
           <w:sz w:val="22"/>
           <w:szCs w:val="22"/>
         </w:rPr>
-        <w:t xml:space="preserve">On a vu au jour 46 que les compagnons disaient Allāhu akbar en montant et subhāna Allāh en descendant pendant les voyages. C'était la pratique. Et le Prophète ﷺ l'a généralisée à toute montée. Pourquoi ? Parce que monter est une métaphore. Tu montes physiquement — tu rappelles que quelque chose est plus haut. Plus haut que toi qui pourtant monte. Allāhu akbar. Allah est plus grand. Plus grand que cette colline. Plus grand que cet escalier. Plus grand que la tour que tu gravis. Plus haut que ce que tu peux atteindre. Cette parole est l'antidote à l'orgueil de la hauteur. Quand on monte, le sentiment de domination peut venir. On voit tout d'en haut. On se sent supérieur. Beaucoup d'hommes ont commis leur premier péché en regardant le monde du haut d'un balcon, d'une voiture luxueuse, d'un bureau au quarantième étage. Allāhu akbar les ramène. Tu montes, mais quoi que tu monte, Lui reste plus haut. Et cette parole peut accompagner toutes les montées de la vie — pas seulement physiques. Tu montes en grade au travail — Allāhu akbar. Tu montes financièrement — Allāhu akbar. Tu montes en notoriété — Allāhu akbar. Chaque montée est une occasion de plier le cou en disant : Toi Tu es plus haut. Sinon, à un certain moment, on croit qu'on a monté tout seul. Et c'est la chute.</w:t>
+        <w:t xml:space="preserve">On a vu au jour 46 que les compagnons disaient Allahu akbar en montant et subhan Allah en descendant pendant les voyages. C'était la pratique. Et le Prophète ﷺ l'a généralisée à toute montée. Pourquoi ? Parce que monter est une métaphore. Tu montes physiquement — tu rappelles que quelque chose est plus haut. Plus haut que toi qui pourtant monte. Allahu akbar. Allah est plus grand. Plus grand que cette colline. Plus grand que cet escalier. Plus grand que la tour que tu gravis. Plus haut que ce que tu peux atteindre. Cette parole est l'antidote à l'orgueil de la hauteur. Quand on monte, le sentiment de domination peut venir. On voit tout d'en haut. On se sent supérieur. Beaucoup d'hommes ont commis leur premier péché en regardant le monde du haut d'un balcon, d'une voiture luxueuse, d'un bureau au quarantième étage. Allahu akbar les ramène. Tu montes, mais quoi que tu monte, Lui reste plus haut. Et cette parole peut accompagner toutes les montées de la vie — pas seulement physiques. Tu montes en grade au travail — Allahu akbar. Tu montes financièrement — Allahu akbar. Tu montes en notoriété — Allahu akbar. Chaque montée est une occasion de plier le cou en disant : Toi Tu es plus haut. Sinon, à un certain moment, on croit qu'on a monté tout seul. Et c'est la chute.</w:t>
       </w:r>
     </w:p>
     <w:p>
@@ -12003,7 +12003,7 @@
           <w:sz w:val="22"/>
           <w:szCs w:val="22"/>
         </w:rPr>
-        <w:t xml:space="preserve">Variante de la du'a du jour 131, mais ici avec 'izza — la puissance dominatrice — au lieu de Bismillāh. Une nuance importante. 'Izza, c'est la force qui ne plie devant rien. La supériorité absolue. Tu te réfugies dans la 'izza d'Allah — c'est-à-dire que tu mets la maladie face à plus fort qu'elle. Othmân ibn Abi al-'Âs, après avoir reçu cette pratique du Prophète ﷺ, l'a transmise à toute la communauté de Tâ'if dont il fut gouverneur. Lui-même rapportait avoir guéri instantanément d'une douleur insupportable la première fois qu'il l'avait pratiquée. Et il ajoutait : depuis ce jour, j'ai recommandé cette pratique à ma famille et à mes proches, et tous ceux qui l'ont essayée en bonne foi en ont bénéficié. La répétition de sept fois n'est pas accidentelle. Le chiffre sept est récurrent dans la tradition prophétique pour les guérisons. Sept gouttes d'eau sur l'enfant en colère. Sept fois subhāna Allāh. Sept fois cette formule. Le sept boucle. Et la pratique combine trois éléments : la main posée (geste), la parole prononcée (verbe), la confiance dans la 'izza divine (intention). Sans l'un de ces trois, la pratique perd sa force. Avec les trois, elle devient une thérapeutique authentique.</w:t>
+        <w:t xml:space="preserve">Variante de la du'a du jour 131, mais ici avec 'izza — la puissance dominatrice — au lieu de Bismillah. Une nuance importante. 'Izza, c'est la force qui ne plie devant rien. La supériorité absolue. Tu te réfugies dans la 'izza d'Allah — c'est-à-dire que tu mets la maladie face à plus fort qu'elle. Othmân ibn Abi al-'Âs, après avoir reçu cette pratique du Prophète ﷺ, l'a transmise à toute la communauté de Tâ'if dont il fut gouverneur. Lui-même rapportait avoir guéri instantanément d'une douleur insupportable la première fois qu'il l'avait pratiquée. Et il ajoutait : depuis ce jour, j'ai recommandé cette pratique à ma famille et à mes proches, et tous ceux qui l'ont essayée en bonne foi en ont bénéficié. La répétition de sept fois n'est pas accidentelle. Le chiffre sept est récurrent dans la tradition prophétique pour les guérisons. Sept gouttes d'eau sur l'enfant en colère. Sept fois subhan Allah. Sept fois cette formule. Le sept boucle. Et la pratique combine trois éléments : la main posée (geste), la parole prononcée (verbe), la confiance dans la 'izza divine (intention). Sans l'un de ces trois, la pratique perd sa force. Avec les trois, elle devient une thérapeutique authentique.</w:t>
       </w:r>
     </w:p>
     <w:p>
@@ -12185,7 +12185,7 @@
           <w:sz w:val="22"/>
           <w:szCs w:val="22"/>
         </w:rPr>
-        <w:t xml:space="preserve">Aïcha rapporte que le Prophète ﷺ, quand il se mettait au lit, joignait ses paumes, récitait dedans Qul huwa Allāhu ahad, Qul a'ūdhu birabbi al-falaq, Qul a'ūdhu birabbi an-nās. Puis il soufflait dans ses paumes et passait ses mains sur tout son corps, en commençant par la tête, le visage et le devant du corps, et en faisant cela trois fois. Cette pratique est la roqya — la guérison par récitation. L'islam la légifère pour soi et pour autrui. Pas une magie. Pas une superstition. Une médecine spirituelle qui mobilise la parole d'Allah comme remède. Le Prophète ﷺ a dit : il n'y a pas de mal à la roqya tant qu'elle ne contient pas de polythéisme. Donc on peut réciter pour soigner — à condition que seul Allah soit invoqué. Le verset de la Fâtiha est appelé ash-Shifâ' — la Guérison. La Fâtiha entière soigne, par tradition prophétique. Un compagnon récita la Fâtiha sur un homme piqué par un scorpion — l'homme guérit. Le Prophète ﷺ apprit cela et confirma que la Fâtiha est bel et bien la roqya. Âyat al-Kursī chasse les démons. Les trois dernières sourates protègent contre tout mal. Le combiné est la pharmacie spirituelle complète. Tu peux le pratiquer pour ton corps fatigué, ton esprit angoissé, ton cœur lourd. Et tu peux le pratiquer sur ton enfant, ton conjoint, tes parents. C'est gratuit, c'est efficace, et c'est légiféré. Et pourtant tant de musulmans préfèrent les charlatans ou les psychologues sans Allah.</w:t>
+        <w:t xml:space="preserve">Aïcha rapporte que le Prophète ﷺ, quand il se mettait au lit, joignait ses paumes, récitait dedans Qul huwa Allahu ahad, Qul a'ūdhu birabbi al-falaq, Qul a'ūdhu birabbi an-nās. Puis il soufflait dans ses paumes et passait ses mains sur tout son corps, en commençant par la tête, le visage et le devant du corps, et en faisant cela trois fois. Cette pratique est la roqya — la guérison par récitation. L'islam la légifère pour soi et pour autrui. Pas une magie. Pas une superstition. Une médecine spirituelle qui mobilise la parole d'Allah comme remède. Le Prophète ﷺ a dit : il n'y a pas de mal à la roqya tant qu'elle ne contient pas de polythéisme. Donc on peut réciter pour soigner — à condition que seul Allah soit invoqué. Le verset de la Fâtiha est appelé ash-Shifâ' — la Guérison. La Fâtiha entière soigne, par tradition prophétique. Un compagnon récita la Fâtiha sur un homme piqué par un scorpion — l'homme guérit. Le Prophète ﷺ apprit cela et confirma que la Fâtiha est bel et bien la roqya. Âyat al-Kursī chasse les démons. Les trois dernières sourates protègent contre tout mal. Le combiné est la pharmacie spirituelle complète. Tu peux le pratiquer pour ton corps fatigué, ton esprit angoissé, ton cœur lourd. Et tu peux le pratiquer sur ton enfant, ton conjoint, tes parents. C'est gratuit, c'est efficace, et c'est légiféré. Et pourtant tant de musulmans préfèrent les charlatans ou les psychologues sans Allah.</w:t>
       </w:r>
     </w:p>
     <w:p>
@@ -13004,7 +13004,7 @@
           <w:sz w:val="22"/>
           <w:szCs w:val="22"/>
         </w:rPr>
-        <w:t xml:space="preserve">Zayd ibn Habîb rapporte du Prophète ﷺ : celui qui dit astaghfiru Allāha al-'azīma alladhī lā ilāha illā huwa al-Hayya al-Qayyūma wa atūbu ilayh — il lui est pardonné, même s'il a fui devant l'ennemi. Phrase qui fait référence à un péché majeur — fuir devant l'ennemi au combat est l'un des sept péchés capitaux dans l'islam. Et pourtant cette formule, dite sincèrement, suffit à laver cela. Pourquoi cette puissance ? Parce que la formule combine deux choses essentielles — l'istighfâr (demande de pardon) et la tawba (retour). L'istighfâr est passif — je demande qu'on me pardonne. La tawba est active — je reviens à Toi, je change. Le mot tawba vient de la racine TWB qui veut dire revenir. Tu fais demi-tour. Tu quittes le chemin qui t'éloignait. Tu rebrousse. C'est un mouvement, pas une parole. Et cette mouvement, Allah l'aime tellement qu'Il dit dans un hadith qudsî : Je suis plus content du retour de Mon serviteur qu'un homme qui aurait perdu son chameau au milieu du désert avec toute sa provision dessus, qui se serait résigné à mourir, qui se serait couché à l'ombre d'un arbre, et qui en se réveillant trouverait son chameau debout devant lui avec la provision intacte. La joie indescriptible de cet homme — c'est moins que celle d'Allah quand un serviteur Lui revient. Cette image, le Prophète ﷺ l'a donnée pour faire comprendre. Tu reviens — et Lui se réjouit comme jamais. Donc reviens souvent.</w:t>
+        <w:t xml:space="preserve">Zayd ibn Habîb rapporte du Prophète ﷺ : celui qui dit astaghfiru Allaha al-'azīma alladhī lā ilāha illā huwa al-Hayya al-Qayyūma wa atūbu ilayh — il lui est pardonné, même s'il a fui devant l'ennemi. Phrase qui fait référence à un péché majeur — fuir devant l'ennemi au combat est l'un des sept péchés capitaux dans l'islam. Et pourtant cette formule, dite sincèrement, suffit à laver cela. Pourquoi cette puissance ? Parce que la formule combine deux choses essentielles — l'istighfâr (demande de pardon) et la tawba (retour). L'istighfâr est passif — je demande qu'on me pardonne. La tawba est active — je reviens à Toi, je change. Le mot tawba vient de la racine TWB qui veut dire revenir. Tu fais demi-tour. Tu quittes le chemin qui t'éloignait. Tu rebrousse. C'est un mouvement, pas une parole. Et cette mouvement, Allah l'aime tellement qu'Il dit dans un hadith qudsî : Je suis plus content du retour de Mon serviteur qu'un homme qui aurait perdu son chameau au milieu du désert avec toute sa provision dessus, qui se serait résigné à mourir, qui se serait couché à l'ombre d'un arbre, et qui en se réveillant trouverait son chameau debout devant lui avec la provision intacte. La joie indescriptible de cet homme — c'est moins que celle d'Allah quand un serviteur Lui revient. Cette image, le Prophète ﷺ l'a donnée pour faire comprendre. Tu reviens — et Lui se réjouit comme jamais. Donc reviens souvent.</w:t>
       </w:r>
     </w:p>
     <w:p>
@@ -13823,7 +13823,7 @@
           <w:sz w:val="22"/>
           <w:szCs w:val="22"/>
         </w:rPr>
-        <w:t xml:space="preserve">Sourate At-Tawba, verset 129. Phrase qui clôt la sourate At-Tawba — c'est-à-dire le verset final de l'avant-dernière sourate du Coran dans l'ordre de révélation. Abu ad-Dardâ' rapporte que le Prophète ﷺ a dit : celui qui dit le matin et le soir, sept fois, hasbiya Allāhu lā ilāha illā huwa, 'alayhi tawakkaltu, wa huwa rabbu al-'arshi al-'azīm — Allah lui suffira pour tout ce qui le préoccupe, de cette vie et de l'autre. Sept fois. Comme dans plusieurs autres formules prophétiques essentielles. Le chiffre sept scelle. Et la promesse — kafāhu Allāhu mā ahammahu min amri ad-dunyā wa al-ākhira — Allah lui suffira pour tout ce qui le préoccupe. Promesse vertigineuse. Tu prends une responsabilité — Allah s'occupe du reste. Tu acceptes un défi — Allah règle ce qui dépasse. Tu portes un projet — Allah charge avec toi. Trois éléments dans la phrase. Hasbiya Allāh — Allah me suffit. Tu déclares ta suffisance en Lui. Tu n'as pas besoin d'autres. Pas de patron qui te couvre. Pas de relations qui te protègent. Pas d'argent qui rassure. Lui suffit. 'Alayhi tawakkaltu — en Lui je place ma confiance. Tu déposes ton dossier. Tu lâches le contrôle. Tu fais confiance. Wa huwa rabbu al-'arshi al-'azīm — et Il est le Seigneur du Trône Immense. Tu nommes Sa grandeur. Pas un dieu local, un dieu utilitaire. Le Maître du Trône Immense — le centre du cosmos. Cette phrase, répétée sept fois matin et soir, restaure la juste hiérarchie. Toi, tout petit. Lui, Maître du Trône. Tes problèmes — proportionnés à toi. Sa puissance — proportionnée à Lui. La disproportion fait que rien ne peut t'inquiéter durablement.</w:t>
+        <w:t xml:space="preserve">Sourate At-Tawba, verset 129. Phrase qui clôt la sourate At-Tawba — c'est-à-dire le verset final de l'avant-dernière sourate du Coran dans l'ordre de révélation. Abu ad-Dardâ' rapporte que le Prophète ﷺ a dit : celui qui dit le matin et le soir, sept fois, hasbiya Allahu lā ilāha illā huwa, 'alayhi tawakkaltu, wa huwa rabbu al-'arshi al-'azīm — Allah lui suffira pour tout ce qui le préoccupe, de cette vie et de l'autre. Sept fois. Comme dans plusieurs autres formules prophétiques essentielles. Le chiffre sept scelle. Et la promesse — kafāhu Allahu mā ahammahu min amri ad-dunyā wa al-ākhira — Allah lui suffira pour tout ce qui le préoccupe. Promesse vertigineuse. Tu prends une responsabilité — Allah s'occupe du reste. Tu acceptes un défi — Allah règle ce qui dépasse. Tu portes un projet — Allah charge avec toi. Trois éléments dans la phrase. Hasbiya Allah — Allah me suffit. Tu déclares ta suffisance en Lui. Tu n'as pas besoin d'autres. Pas de patron qui te couvre. Pas de relations qui te protègent. Pas d'argent qui rassure. Lui suffit. 'Alayhi tawakkaltu — en Lui je place ma confiance. Tu déposes ton dossier. Tu lâches le contrôle. Tu fais confiance. Wa huwa rabbu al-'arshi al-'azīm — et Il est le Seigneur du Trône Immense. Tu nommes Sa grandeur. Pas un dieu local, un dieu utilitaire. Le Maître du Trône Immense — le centre du cosmos. Cette phrase, répétée sept fois matin et soir, restaure la juste hiérarchie. Toi, tout petit. Lui, Maître du Trône. Tes problèmes — proportionnés à toi. Sa puissance — proportionnée à Lui. La disproportion fait que rien ne peut t'inquiéter durablement.</w:t>
       </w:r>
     </w:p>
     <w:p>
@@ -14915,7 +14915,7 @@
           <w:sz w:val="22"/>
           <w:szCs w:val="22"/>
         </w:rPr>
-        <w:t xml:space="preserve">Aws ibn Aws rapporte du Prophète ﷺ : le meilleur de vos jours est le vendredi. En ce jour Adam fut créé. En ce jour il mourut. En ce jour la corne sera soufflée. En ce jour aura lieu le grand cri. Multipliez donc la prière sur moi ce jour-là, car votre prière m'est présentée. Les compagnons demandèrent : comment notre prière sur toi te sera-t-elle présentée alors que tu seras devenu poussière ? Il répondit : Allah a interdit à la terre de consommer les corps des prophètes. Quelle déclaration. Quatre événements cosmiques liés au vendredi — la création d'Adam, sa mort, le souffle de la corne (annonçant la résurrection), et le grand cri (Jour du Jugement). Tous concentrés sur ce jour. Et le Prophète ﷺ ajoute une promesse personnelle — vos prières sur moi me sont présentées ce jour-là. Pas le Coran. Pas les actes de piété en général. Les prières sur lui spécifiquement. Et il précise qu'il les recevra dans sa tombe — protégée par Allah. Chaque vendredi, tu peux donc multiplier cette phrase courte. Allāhumma salli 'alā Muhammadin wa 'alā āli Muhammad. Et chaque fois que tu la dis, elle parvient au Prophète ﷺ. Il l'entend. Et plus précisément encore, il sait que c'est toi qui l'a dite — un autre hadith dit qu'Allah a chargé des anges de transmettre au Prophète ﷺ les salutations des croyants avec leur nom. Quelle relation extraordinaire à travers quatorze siècles. Tu prononces des mots à Paris ou à Tunis ou à Kuala Lumpur — et un ange porte ton nom et ton message à Médine.</w:t>
+        <w:t xml:space="preserve">Aws ibn Aws rapporte du Prophète ﷺ : le meilleur de vos jours est le vendredi. En ce jour Adam fut créé. En ce jour il mourut. En ce jour la corne sera soufflée. En ce jour aura lieu le grand cri. Multipliez donc la prière sur moi ce jour-là, car votre prière m'est présentée. Les compagnons demandèrent : comment notre prière sur toi te sera-t-elle présentée alors que tu seras devenu poussière ? Il répondit : Allah a interdit à la terre de consommer les corps des prophètes. Quelle déclaration. Quatre événements cosmiques liés au vendredi — la création d'Adam, sa mort, le souffle de la corne (annonçant la résurrection), et le grand cri (Jour du Jugement). Tous concentrés sur ce jour. Et le Prophète ﷺ ajoute une promesse personnelle — vos prières sur moi me sont présentées ce jour-là. Pas le Coran. Pas les actes de piété en général. Les prières sur lui spécifiquement. Et il précise qu'il les recevra dans sa tombe — protégée par Allah. Chaque vendredi, tu peux donc multiplier cette phrase courte. Allahumma salli 'alā Muhammadin wa 'alā āli Muhammad. Et chaque fois que tu la dis, elle parvient au Prophète ﷺ. Il l'entend. Et plus précisément encore, il sait que c'est toi qui l'a dite — un autre hadith dit qu'Allah a chargé des anges de transmettre au Prophète ﷺ les salutations des croyants avec leur nom. Quelle relation extraordinaire à travers quatorze siècles. Tu prononces des mots à Paris ou à Tunis ou à Kuala Lumpur — et un ange porte ton nom et ton message à Médine.</w:t>
       </w:r>
     </w:p>
     <w:p>
@@ -15006,7 +15006,7 @@
           <w:sz w:val="22"/>
           <w:szCs w:val="22"/>
         </w:rPr>
-        <w:t xml:space="preserve">'Ubâda ibn as-Sâmit rapporte du Prophète ﷺ : celui qui se réveille la nuit et prononce cette du'a, puis demande quelque chose, on lui répondra. Et s'il fait ses ablutions et prie, sa prière est acceptée. Promesse double. Première — toute demande prononcée après cette du'a sera entendue. Seconde — toute prière offerte après cette du'a sera acceptée. Pour celui qui se réveille la nuit. Pourquoi cette grâce particulière pour le réveillé nocturne ? Parce que se réveiller la nuit est une grâce. La plupart dorment d'un sommeil de plomb jusqu'au réveil. Celui qui se réveille à 2h ou 3h du matin reçoit une opportunité — le ciel est ouvert, comme on l'a vu au jour 108. Mais cette opportunité, encore faut-il la saisir. Beaucoup se réveillent la nuit et passent une heure à scroller leur téléphone, à ressasser des soucis, à essayer de se rendormir. Le Prophète ﷺ enseigne autre chose. Tu te réveilles ? Profite. Prononce cette série de dhikrs — sept formules enchaînées qui couvrent toute la louange. Tahlîl (lā ilāha illa Allāh), tahmîd (al-hamdu lillāh), tasbîh (subhāna Allāh), takbîr (Allāhu akbar), et hawqala (lā hawla wa lā quwwata illā billāh). Toutes les formules essentielles en une seule récitation. Puis tu fais une demande. Elle sera entendue. Cette pratique transforme l'insomnie en opportunité. Au lieu de subir le réveil, tu en fais un acte spirituel. Et avec le temps, ton corps lui-même peut commencer à se réveiller régulièrement la nuit — non par anxiété, mais par habitude spirituelle ancrée.</w:t>
+        <w:t xml:space="preserve">'Ubâda ibn as-Sâmit rapporte du Prophète ﷺ : celui qui se réveille la nuit et prononce cette du'a, puis demande quelque chose, on lui répondra. Et s'il fait ses ablutions et prie, sa prière est acceptée. Promesse double. Première — toute demande prononcée après cette du'a sera entendue. Seconde — toute prière offerte après cette du'a sera acceptée. Pour celui qui se réveille la nuit. Pourquoi cette grâce particulière pour le réveillé nocturne ? Parce que se réveiller la nuit est une grâce. La plupart dorment d'un sommeil de plomb jusqu'au réveil. Celui qui se réveille à 2h ou 3h du matin reçoit une opportunité — le ciel est ouvert, comme on l'a vu au jour 108. Mais cette opportunité, encore faut-il la saisir. Beaucoup se réveillent la nuit et passent une heure à scroller leur téléphone, à ressasser des soucis, à essayer de se rendormir. Le Prophète ﷺ enseigne autre chose. Tu te réveilles ? Profite. Prononce cette série de dhikrs — sept formules enchaînées qui couvrent toute la louange. Tahlîl (lā ilāha illa Allah), tahmîd (al-hamdu lillāh), tasbîh (subhan Allah), takbîr (Allahu akbar), et hawqala (lā hawla wa lā quwwata illā billāh). Toutes les formules essentielles en une seule récitation. Puis tu fais une demande. Elle sera entendue. Cette pratique transforme l'insomnie en opportunité. Au lieu de subir le réveil, tu en fais un acte spirituel. Et avec le temps, ton corps lui-même peut commencer à se réveiller régulièrement la nuit — non par anxiété, mais par habitude spirituelle ancrée.</w:t>
       </w:r>
     </w:p>
     <w:p>
@@ -15188,7 +15188,7 @@
           <w:sz w:val="22"/>
           <w:szCs w:val="22"/>
         </w:rPr>
-        <w:t xml:space="preserve">Usâma ibn Zayd rapporte du Prophète ﷺ : celui à qui on fait du bien et qui dit à son bienfaiteur jazāka Allāhu khayran — il l'a pleinement loué. Phrase courte d'une élégance suprême. La plupart des cultures ont des formules de remerciement creuses — merci, thanks, gracias, danke. Mots utiles mais qui ne disent rien de plus. Le Prophète ﷺ enseigne autre chose. Tu ne remercies pas seulement par tes propres mots. Tu invoques Allah pour qu'Il récompense. Pourquoi cette inversion ? Parce que toi tu ne peux pas payer le bienfait à sa juste valeur. Quelqu'un te dépanne d'une somme — tu peux la rendre, mais ce qu'il a fait — sa générosité, son temps, sa confiance — c'est irréductible à la somme. Tu ne peux pas le rendre. Quelqu'un t'invite chez lui — tu peux l'inviter en retour, mais le geste original reste premier. Tu ne peux pas l'égaler. Donc tu confies à Allah le paiement de la dette. Jazāka Allāhu khayran. Qu'Allah te récompense par le bien. Et le bien d'Allah n'a aucune commune mesure avec ce que toi tu peux donner. Allah récompense par la santé, la baraka, le pardon des péchés, le rang dans l'autre vie. Tout cela bien au-delà de ce que toi tu pourrais offrir. Cette phrase est l'élégance arabe par excellence. Trois mots. Toute la dette transférée. Le bienfaiteur reçoit mieux que ce qu'il a donné. Et toi tu restes humble, conscient que tu n'as pas les moyens de payer toi-même. Aujourd'hui, dans les milieux musulmans francophones, cette phrase circule comme une pièce d'or. On l'utilise pour tout. Quelqu'un t'aide à porter ton sac — jazāka Allāhu khayran. Quelqu'un te prête un livre — jazāka Allāhu khayran. Le Prophète ﷺ a fait de la gratitude un acte d'intercession.</w:t>
+        <w:t xml:space="preserve">Usâma ibn Zayd rapporte du Prophète ﷺ : celui à qui on fait du bien et qui dit à son bienfaiteur jazāka Allahu khayran — il l'a pleinement loué. Phrase courte d'une élégance suprême. La plupart des cultures ont des formules de remerciement creuses — merci, thanks, gracias, danke. Mots utiles mais qui ne disent rien de plus. Le Prophète ﷺ enseigne autre chose. Tu ne remercies pas seulement par tes propres mots. Tu invoques Allah pour qu'Il récompense. Pourquoi cette inversion ? Parce que toi tu ne peux pas payer le bienfait à sa juste valeur. Quelqu'un te dépanne d'une somme — tu peux la rendre, mais ce qu'il a fait — sa générosité, son temps, sa confiance — c'est irréductible à la somme. Tu ne peux pas le rendre. Quelqu'un t'invite chez lui — tu peux l'inviter en retour, mais le geste original reste premier. Tu ne peux pas l'égaler. Donc tu confies à Allah le paiement de la dette. Jazāka Allahu khayran. Qu'Allah te récompense par le bien. Et le bien d'Allah n'a aucune commune mesure avec ce que toi tu peux donner. Allah récompense par la santé, la baraka, le pardon des péchés, le rang dans l'autre vie. Tout cela bien au-delà de ce que toi tu pourrais offrir. Cette phrase est l'élégance arabe par excellence. Trois mots. Toute la dette transférée. Le bienfaiteur reçoit mieux que ce qu'il a donné. Et toi tu restes humble, conscient que tu n'as pas les moyens de payer toi-même. Aujourd'hui, dans les milieux musulmans francophones, cette phrase circule comme une pièce d'or. On l'utilise pour tout. Quelqu'un t'aide à porter ton sac — jazāka Allahu khayran. Quelqu'un te prête un livre — jazāka Allahu khayran. Le Prophète ﷺ a fait de la gratitude un acte d'intercession.</w:t>
       </w:r>
     </w:p>
     <w:p>
@@ -15643,7 +15643,7 @@
           <w:sz w:val="22"/>
           <w:szCs w:val="22"/>
         </w:rPr>
-        <w:t xml:space="preserve">On a vu cette du'a au jour 154 dans le contexte de la prise de responsabilité. Elle revient ici dans un autre usage — la défense devant l'injustice du jugement. Le Prophète ﷺ et ses compagnons ont vécu d'innombrables accusations fausses. Quand on a accusé Aïcha d'adultère pendant des semaines, elle vivait dans l'angoisse. Elle a été lavée par un verset du Coran révélé directement. Mais avant la révélation, elle a dû patienter. Et la patience face à l'injustice du jugement est l'une des épreuves les plus dures. Tu peux te défendre — souvent en vain. Tu peux expliquer — on ne t'écoute pas. Tu peux pleurer — on s'en moque. Que reste-t-il ? Cette phrase. Hasbiya Allāh. Allah me suffit. C'est-à-dire — Lui m'entend. Lui sait. Lui jugera. Et Son jugement est plus précieux que celui de tous les hommes réunis. Tu transfère le tribunal. Tu cesses de plaider devant ceux qui ne veulent pas entendre. Tu plaides devant Lui. Et tu sais qu'au final, Sa décision sera juste. Cette posture libère. Tu n'es plus obligé de te défendre. Tu n'es plus dépendant de l'approbation humaine. Tu vis dans la conscience que ta réputation finale ne sera pas écrite par les humains — elle sera révélée au Jour du Compte. Les compagnons ont vécu de cette manière. Ils acceptaient les injustices de leur époque parce qu'ils savaient qu'Allah écrivait. Cette du'a est leur sérénité. Sept fois matin et soir, dit le hadith. Et ta peau s'épaissit. Tu cesses d'être blessé par les jugements. Tu vis dans un espace plus grand.</w:t>
+        <w:t xml:space="preserve">On a vu cette du'a au jour 154 dans le contexte de la prise de responsabilité. Elle revient ici dans un autre usage — la défense devant l'injustice du jugement. Le Prophète ﷺ et ses compagnons ont vécu d'innombrables accusations fausses. Quand on a accusé Aïcha d'adultère pendant des semaines, elle vivait dans l'angoisse. Elle a été lavée par un verset du Coran révélé directement. Mais avant la révélation, elle a dû patienter. Et la patience face à l'injustice du jugement est l'une des épreuves les plus dures. Tu peux te défendre — souvent en vain. Tu peux expliquer — on ne t'écoute pas. Tu peux pleurer — on s'en moque. Que reste-t-il ? Cette phrase. Hasbiya Allah. Allah me suffit. C'est-à-dire — Lui m'entend. Lui sait. Lui jugera. Et Son jugement est plus précieux que celui de tous les hommes réunis. Tu transfère le tribunal. Tu cesses de plaider devant ceux qui ne veulent pas entendre. Tu plaides devant Lui. Et tu sais qu'au final, Sa décision sera juste. Cette posture libère. Tu n'es plus obligé de te défendre. Tu n'es plus dépendant de l'approbation humaine. Tu vis dans la conscience que ta réputation finale ne sera pas écrite par les humains — elle sera révélée au Jour du Compte. Les compagnons ont vécu de cette manière. Ils acceptaient les injustices de leur époque parce qu'ils savaient qu'Allah écrivait. Cette du'a est leur sérénité. Sept fois matin et soir, dit le hadith. Et ta peau s'épaissit. Tu cesses d'être blessé par les jugements. Tu vis dans un espace plus grand.</w:t>
       </w:r>
     </w:p>
     <w:p>
@@ -15734,7 +15734,7 @@
           <w:sz w:val="22"/>
           <w:szCs w:val="22"/>
         </w:rPr>
-        <w:t xml:space="preserve">Phrase courte qui mérite son jour propre. Bāraka Allāhu fīk. Qu'Allah te bénisse. Fīk — en toi. Pas seulement sur toi — en toi. C'est-à-dire que la bénédiction pénètre, qu'elle se loge dans ton être, qu'elle imprègne ce que tu es. Le mot baraka est l'un des plus précieux de l'arabe. Il évoque la fixation, le maintien, l'abondance qui dure. Une eau bénie ne se tarit pas. Un argent béni n'épuise pas. Une famille bénie ne se brise pas. La baraka est cette qualité invisible qui fait que les choses tiennent. Quand tu dis bāraka Allāhu fīk à quelqu'un, tu invoques cette qualité pour lui. Tu ne demandes pas une chose précise. Tu demandes la fixation des bienfaits. Que tout ce qu'Allah lui a donné s'installe, s'enracine, ne s'évapore pas. Cette du'a courte circule abondamment dans les milieux musulmans. Elle remplace souvent merci. Quelqu'un t'envoie un audio inspirant — bāraka Allāhu fīk. Quelqu'un te rappelle une heure de prière — bāraka Allāhu fīk. Quelqu'un te corrige avec douceur — bāraka Allāhu fīk. Phrase d'usage social autant que spirituel. Et elle est facile à apprendre — quatre mots, faciles à prononcer pour un francophone. Tu peux la donner à tes enfants comme premier vocabulaire arabe utile. Avant même Bismillāh — qui est plus solennel — cette phrase peut être leur première parole en arabe. Et plus tard, ils l'utiliseront naturellement. Toute une vie de bénédictions adressées dont elle est la porte.</w:t>
+        <w:t xml:space="preserve">Phrase courte qui mérite son jour propre. Bāraka Allahu fīk. Qu'Allah te bénisse. Fīk — en toi. Pas seulement sur toi — en toi. C'est-à-dire que la bénédiction pénètre, qu'elle se loge dans ton être, qu'elle imprègne ce que tu es. Le mot baraka est l'un des plus précieux de l'arabe. Il évoque la fixation, le maintien, l'abondance qui dure. Une eau bénie ne se tarit pas. Un argent béni n'épuise pas. Une famille bénie ne se brise pas. La baraka est cette qualité invisible qui fait que les choses tiennent. Quand tu dis bāraka Allahu fīk à quelqu'un, tu invoques cette qualité pour lui. Tu ne demandes pas une chose précise. Tu demandes la fixation des bienfaits. Que tout ce qu'Allah lui a donné s'installe, s'enracine, ne s'évapore pas. Cette du'a courte circule abondamment dans les milieux musulmans. Elle remplace souvent merci. Quelqu'un t'envoie un audio inspirant — bāraka Allahu fīk. Quelqu'un te rappelle une heure de prière — bāraka Allahu fīk. Quelqu'un te corrige avec douceur — bāraka Allahu fīk. Phrase d'usage social autant que spirituel. Et elle est facile à apprendre — quatre mots, faciles à prononcer pour un francophone. Tu peux la donner à tes enfants comme premier vocabulaire arabe utile. Avant même Bismillah — qui est plus solennel — cette phrase peut être leur première parole en arabe. Et plus tard, ils l'utiliseront naturellement. Toute une vie de bénédictions adressées dont elle est la porte.</w:t>
       </w:r>
     </w:p>
     <w:p>
@@ -16189,7 +16189,7 @@
           <w:sz w:val="22"/>
           <w:szCs w:val="22"/>
         </w:rPr>
-        <w:t xml:space="preserve">On a déjà vu cette phrase aux jours 27 et 99. Elle revient ici dans son usage spécifique contre l'anxiété envahissante. Abu ad-Dardâ' rapporte du Prophète ﷺ : celui qui dit hasbiya Allāhu wa ni'ma al-wakīl sept fois matin et soir, Allah lui suffira pour ce qui le préoccupe de cette vie et de l'autre. Le chiffre sept. Le matin et le soir. Mais aussi à tout moment de crise. L'anxiété moderne — celle qui prend à la gorge sans raison précise, ou avec une raison disproportionnée — est l'un des fléaux de notre époque. Beaucoup la nomment dépression, panique, stress. Au-delà des noms, l'expérience est universelle. Tu te sens écrasé. Ton souffle se raccourcit. Tes pensées tournent en boucle. Tu ne sais plus que faire. Cette du'a, répétée sept fois, fait quelque chose de physique. D'abord, elle ralentit la respiration. Pour la dire sept fois calmement, tu dois respirer. Tu sors du souffle court de l'angoisse. Tu reviens dans un rythme. Ensuite, elle oriente l'attention. Au lieu de tourner autour de ton problème, tu tournes autour d'Allah. Hasbiya Allāh. Il me suffit. Tu n'as plus besoin de tout porter seul. Tu reconnais qu'il y a Plus Grand qui prend. Wa ni'ma al-wakīl. Quel excellent garant. Wakīl — celui à qui on confie un dossier, comme un avocat, un mandataire. Lui prend ton dossier. Lui s'occupe de ce qui te dépasse. Tu lâches. Et la répétition sept fois ancre. Quand on dit cette phrase une fois, on la prononce. Sept fois, on la vit. La septième fois, quelque chose en toi commence à y croire vraiment. C'est de cette croyance que vient le soulagement.</w:t>
+        <w:t xml:space="preserve">On a déjà vu cette phrase aux jours 27 et 99. Elle revient ici dans son usage spécifique contre l'anxiété envahissante. Abu ad-Dardâ' rapporte du Prophète ﷺ : celui qui dit hasbiya Allahu wa ni'ma al-wakīl sept fois matin et soir, Allah lui suffira pour ce qui le préoccupe de cette vie et de l'autre. Le chiffre sept. Le matin et le soir. Mais aussi à tout moment de crise. L'anxiété moderne — celle qui prend à la gorge sans raison précise, ou avec une raison disproportionnée — est l'un des fléaux de notre époque. Beaucoup la nomment dépression, panique, stress. Au-delà des noms, l'expérience est universelle. Tu te sens écrasé. Ton souffle se raccourcit. Tes pensées tournent en boucle. Tu ne sais plus que faire. Cette du'a, répétée sept fois, fait quelque chose de physique. D'abord, elle ralentit la respiration. Pour la dire sept fois calmement, tu dois respirer. Tu sors du souffle court de l'angoisse. Tu reviens dans un rythme. Ensuite, elle oriente l'attention. Au lieu de tourner autour de ton problème, tu tournes autour d'Allah. Hasbiya Allah. Il me suffit. Tu n'as plus besoin de tout porter seul. Tu reconnais qu'il y a Plus Grand qui prend. Wa ni'ma al-wakīl. Quel excellent garant. Wakīl — celui à qui on confie un dossier, comme un avocat, un mandataire. Lui prend ton dossier. Lui s'occupe de ce qui te dépasse. Tu lâches. Et la répétition sept fois ancre. Quand on dit cette phrase une fois, on la prononce. Sept fois, on la vit. La septième fois, quelque chose en toi commence à y croire vraiment. C'est de cette croyance que vient le soulagement.</w:t>
       </w:r>
     </w:p>
     <w:p>
@@ -16644,7 +16644,7 @@
           <w:sz w:val="22"/>
           <w:szCs w:val="22"/>
         </w:rPr>
-        <w:t xml:space="preserve">On a vu cette phrase au jour 7 dans le contexte de la sortie de la maison. Elle revient ici dans un usage plus large — avant tout grand effort. Trois mouvements en quelques mots. Bismillāh — au nom d'Allah. Tu nommes Allah avant de commencer. Sans cette nomination, l'œuvre part nue. Tawakkaltu 'alā Allāh — je place ma confiance en Allah. Tu déposes le résultat à Lui. Tu fais ce qui dépend de toi, et tu confies le reste. Lā hawla wa lā quwwata illā billāh — il n'y a de force ni de puissance que par Allah. Tu reconnais que même ta capacité à faire est de Lui. Pas seulement le résultat — le moyen aussi. La main qui écrira, la voix qui parlera, l'intelligence qui pensera — tout est emprunté. Cette phrase, dite avant tout grand effort, fait trois choses. Elle te calme — parce que tu sais que tu n'es pas seul. Elle te concentre — parce que tu as orienté ton intention. Elle te protège — parce qu'elle ferme la porte aux interventions parasites. Le Prophète ﷺ a dit qu'un homme qui sort de chez lui en prononçant ces mots — il sera dit à son sujet : tu es guidé, tu es préservé, tu es suffi. Et le diable s'écarte de lui. Trois bénédictions pour trois mots. Ces trois mots peuvent ouvrir tes journées de travail. Avant l'examen difficile. Avant la réunion stratégique. Avant l'opération chirurgicale. Avant la conversation où tout va se jouer. Tu ne te précipites pas dans l'effort. Tu te préposes par cette phrase. Et tu commences depuis un autre lieu intérieur.</w:t>
+        <w:t xml:space="preserve">On a vu cette phrase au jour 7 dans le contexte de la sortie de la maison. Elle revient ici dans un usage plus large — avant tout grand effort. Trois mouvements en quelques mots. Bismillah — au nom d'Allah. Tu nommes Allah avant de commencer. Sans cette nomination, l'œuvre part nue. Tawakkaltu 'alā Allah — je place ma confiance en Allah. Tu déposes le résultat à Lui. Tu fais ce qui dépend de toi, et tu confies le reste. Lā hawla wa lā quwwata illā billāh — il n'y a de force ni de puissance que par Allah. Tu reconnais que même ta capacité à faire est de Lui. Pas seulement le résultat — le moyen aussi. La main qui écrira, la voix qui parlera, l'intelligence qui pensera — tout est emprunté. Cette phrase, dite avant tout grand effort, fait trois choses. Elle te calme — parce que tu sais que tu n'es pas seul. Elle te concentre — parce que tu as orienté ton intention. Elle te protège — parce qu'elle ferme la porte aux interventions parasites. Le Prophète ﷺ a dit qu'un homme qui sort de chez lui en prononçant ces mots — il sera dit à son sujet : tu es guidé, tu es préservé, tu es suffi. Et le diable s'écarte de lui. Trois bénédictions pour trois mots. Ces trois mots peuvent ouvrir tes journées de travail. Avant l'examen difficile. Avant la réunion stratégique. Avant l'opération chirurgicale. Avant la conversation où tout va se jouer. Tu ne te précipites pas dans l'effort. Tu te préposes par cette phrase. Et tu commences depuis un autre lieu intérieur.</w:t>
       </w:r>
     </w:p>
     <w:p>
@@ -17190,7 +17190,7 @@
           <w:sz w:val="22"/>
           <w:szCs w:val="22"/>
         </w:rPr>
-        <w:t xml:space="preserve">Anas ibn Mâlik rapporte que le Prophète ﷺ a dit : si vous entrez dans une maison où il n'y a personne, dites cette salutation. Étrange instruction. Pourquoi saluer quand personne n'est là pour entendre ? Parce qu'il y a toujours quelqu'un. Les anges. Les âmes invisibles. Et surtout, ta propre âme — qui se respecte par la salutation. Le silence en entrant dans une maison vide est une porte ouverte à la solitude angoissée. Si tu rentres et qu'il n'y a personne, ton cœur peut se serrer. La maison te paraît étrangère. La salutation rétablit la présence. Tu salues toi-même et les serviteurs vertueux. Wa 'alā 'ibādi Allāhi as-sālihīn — et sur les serviteurs vertueux. Phrase qui élargit. Tu ne salues pas seulement les présents — tu salues une communauté invisible, ceux qui sont absents mais qui font partie de l'ummah des serviteurs. Cette pratique relie. Tu n'es jamais seul. Quelque part, en cet instant, des serviteurs vertueux d'Allah prient, étudient, servent. Tu les salues à travers le monde et le temps. Et le hadith continue — quand vous entrez dans une maison habitée, dites la salutation aux gens. Et quand il n'y a personne, dites la salutation aux serviteurs vertueux. La pratique est complète. Elle te tient dans la salutation continue — qu'il y ait ou non quelqu'un en face. Pour le voyageur moderne, cette pratique est précieuse. Tu arrives dans un Airbnb à minuit, fatigué, dans une ville étrangère. La porte se ferme derrière toi. Tu es seul. Tu dis cette phrase. Et la chambre cesse d'être étrangère. Quelque chose s'installe. La présence revient.</w:t>
+        <w:t xml:space="preserve">Anas ibn Mâlik rapporte que le Prophète ﷺ a dit : si vous entrez dans une maison où il n'y a personne, dites cette salutation. Étrange instruction. Pourquoi saluer quand personne n'est là pour entendre ? Parce qu'il y a toujours quelqu'un. Les anges. Les âmes invisibles. Et surtout, ta propre âme — qui se respecte par la salutation. Le silence en entrant dans une maison vide est une porte ouverte à la solitude angoissée. Si tu rentres et qu'il n'y a personne, ton cœur peut se serrer. La maison te paraît étrangère. La salutation rétablit la présence. Tu salues toi-même et les serviteurs vertueux. Wa 'alā 'ibādi Allahi as-sālihīn — et sur les serviteurs vertueux. Phrase qui élargit. Tu ne salues pas seulement les présents — tu salues une communauté invisible, ceux qui sont absents mais qui font partie de l'ummah des serviteurs. Cette pratique relie. Tu n'es jamais seul. Quelque part, en cet instant, des serviteurs vertueux d'Allah prient, étudient, servent. Tu les salues à travers le monde et le temps. Et le hadith continue — quand vous entrez dans une maison habitée, dites la salutation aux gens. Et quand il n'y a personne, dites la salutation aux serviteurs vertueux. La pratique est complète. Elle te tient dans la salutation continue — qu'il y ait ou non quelqu'un en face. Pour le voyageur moderne, cette pratique est précieuse. Tu arrives dans un Airbnb à minuit, fatigué, dans une ville étrangère. La porte se ferme derrière toi. Tu es seul. Tu dis cette phrase. Et la chambre cesse d'être étrangère. Quelque chose s'installe. La présence revient.</w:t>
       </w:r>
     </w:p>
     <w:p>
@@ -17372,7 +17372,7 @@
           <w:sz w:val="22"/>
           <w:szCs w:val="22"/>
         </w:rPr>
-        <w:t xml:space="preserve">Variante étendue de la du'a du jour 110 — pour Ramadan. Celle-ci est pour chaque mois lunaire — Muharram, Safar, Rabî' al-Awwal, et ainsi de suite. Tous les mois ont leur croissant annonceur. Et le Prophète ﷺ saluait chaque croissant par une du'a. Pourquoi ? Parce que chaque mois est un nouveau cycle. Un nouveau temps qui commence. Tu ne sais pas si tu seras encore en vie au croissant suivant. Donc chaque croissant est précieux. Tu le salues. Tu en demandes la qualité. Cinq demandes en parallèle. Yumn — bénédiction, prospérité, baraka. Que le mois apporte sa baraka. Īmān — foi. Que la foi augmente pendant ce mois, ne diminue pas. Salāma — bien-être. Que la santé tienne, que les corps résistent. Islām — soumission. Que la pratique reste. Tawfīq limā tuhibbu wa tardā — réussite dans ce que Tu aimes et agrées. Cette dernière demande est la plus belle. Tu ne demandes pas la réussite en général — la réussite dans ce que Lui aime et agrée. Combien d'hommes réussissent dans ce qu'Allah déteste — fortune mal acquise, gloire par les voies tortueuses, influence par la manipulation. Réussite humaine, échec spirituel. Cette du'a vise l'autre direction. Que tes mois soient des mois où tu réussis ce qu'Il aime. Et la phrase finale — rabbī wa rabbuka Allāh. Mon Seigneur et le tien est Allah. Tu parles à la lune. Tu lui reconnais son Seigneur. La lune obéit à Allah comme toi tu obéis. Vous êtes co-serviteurs. Cette pratique du regard nocturne salutateur au croissant peut transformer ton année. Douze fois par an au moins, tu lèves les yeux. Tu regardes le croissant. Tu prononces cette phrase. Et l'année cesse d'être une succession indistincte de jours — elle devient un chapelet de douze mois nommés et bénis.</w:t>
+        <w:t xml:space="preserve">Variante étendue de la du'a du jour 110 — pour Ramadan. Celle-ci est pour chaque mois lunaire — Muharram, Safar, Rabî' al-Awwal, et ainsi de suite. Tous les mois ont leur croissant annonceur. Et le Prophète ﷺ saluait chaque croissant par une du'a. Pourquoi ? Parce que chaque mois est un nouveau cycle. Un nouveau temps qui commence. Tu ne sais pas si tu seras encore en vie au croissant suivant. Donc chaque croissant est précieux. Tu le salues. Tu en demandes la qualité. Cinq demandes en parallèle. Yumn — bénédiction, prospérité, baraka. Que le mois apporte sa baraka. Īmān — foi. Que la foi augmente pendant ce mois, ne diminue pas. Salāma — bien-être. Que la santé tienne, que les corps résistent. Islām — soumission. Que la pratique reste. Tawfīq limā tuhibbu wa tardā — réussite dans ce que Tu aimes et agrées. Cette dernière demande est la plus belle. Tu ne demandes pas la réussite en général — la réussite dans ce que Lui aime et agrée. Combien d'hommes réussissent dans ce qu'Allah déteste — fortune mal acquise, gloire par les voies tortueuses, influence par la manipulation. Réussite humaine, échec spirituel. Cette du'a vise l'autre direction. Que tes mois soient des mois où tu réussis ce qu'Il aime. Et la phrase finale — rabbī wa rabbuka Allah. Mon Seigneur et le tien est Allah. Tu parles à la lune. Tu lui reconnais son Seigneur. La lune obéit à Allah comme toi tu obéis. Vous êtes co-serviteurs. Cette pratique du regard nocturne salutateur au croissant peut transformer ton année. Douze fois par an au moins, tu lèves les yeux. Tu regardes le croissant. Tu prononces cette phrase. Et l'année cesse d'être une succession indistincte de jours — elle devient un chapelet de douze mois nommés et bénis.</w:t>
       </w:r>
     </w:p>
     <w:p>
@@ -17918,7 +17918,7 @@
           <w:sz w:val="22"/>
           <w:szCs w:val="22"/>
         </w:rPr>
-        <w:t xml:space="preserve">Ibn Omar rapporte que le Prophète ﷺ, quand on portait un mort, prononçait ces mots. Phrase courte mais qui dit beaucoup. Bismillāh — au nom d'Allah. Tu nommes Allah dans ce geste qui semble si étrange aux humains — porter un corps humain comme on porterait un objet, vers un trou. C'est le moment où l'humain est traité de la manière la plus humble. Allongé. Lavé par d'autres. Enveloppé dans un drap. Porté. Pour cet humain qui peut-être dirigeait une entreprise, élevait une famille, comptait dans le monde — il est maintenant porté par d'autres mains, passif, le visage couvert. La pratique islamique fait cela précisément pour la leçon. Toi qui marches derrière, tu seras à ta tour porté un jour. Cette inversion est délibérée. Et la phrase ajoute — 'alā millati rasūli Allāh — sur la voie du Messager d'Allah. Tu portes ce mort selon la Sunna. Pas selon les coutumes étrangères. Selon la pratique prophétique précise. Le Prophète ﷺ a institué le cortège silencieux, la rapidité du transport, la simplicité du linceul, l'absence de fanfare. Tu te conformes à cela. Et 'alā millati rasūli Allāh signifie aussi que le mort lui-même est porté sur la voie du Prophète ﷺ — c'est-à-dire qu'il est conduit comme un musulman au lieu où il sera enterré comme un musulman. Identité confirmée jusqu'à la dernière étape. La phrase est aussi celle qu'on prononce, par certaines traditions, en couchant le défunt dans la tombe. Le geste final. Tu poses le corps. Tu prononces cette phrase. Tu refermes. Et tu te retires, en sachant que ce trou t'attend toi aussi, mais que ce jour est entre les mains d'Allah Seul.</w:t>
+        <w:t xml:space="preserve">Ibn Omar rapporte que le Prophète ﷺ, quand on portait un mort, prononçait ces mots. Phrase courte mais qui dit beaucoup. Bismillah — au nom d'Allah. Tu nommes Allah dans ce geste qui semble si étrange aux humains — porter un corps humain comme on porterait un objet, vers un trou. C'est le moment où l'humain est traité de la manière la plus humble. Allongé. Lavé par d'autres. Enveloppé dans un drap. Porté. Pour cet humain qui peut-être dirigeait une entreprise, élevait une famille, comptait dans le monde — il est maintenant porté par d'autres mains, passif, le visage couvert. La pratique islamique fait cela précisément pour la leçon. Toi qui marches derrière, tu seras à ta tour porté un jour. Cette inversion est délibérée. Et la phrase ajoute — 'alā millati rasūli Allah — sur la voie du Messager d'Allah. Tu portes ce mort selon la Sunna. Pas selon les coutumes étrangères. Selon la pratique prophétique précise. Le Prophète ﷺ a institué le cortège silencieux, la rapidité du transport, la simplicité du linceul, l'absence de fanfare. Tu te conformes à cela. Et 'alā millati rasūli Allah signifie aussi que le mort lui-même est porté sur la voie du Prophète ﷺ — c'est-à-dire qu'il est conduit comme un musulman au lieu où il sera enterré comme un musulman. Identité confirmée jusqu'à la dernière étape. La phrase est aussi celle qu'on prononce, par certaines traditions, en couchant le défunt dans la tombe. Le geste final. Tu poses le corps. Tu prononces cette phrase. Tu refermes. Et tu te retires, en sachant que ce trou t'attend toi aussi, mais que ce jour est entre les mains d'Allah Seul.</w:t>
       </w:r>
     </w:p>
     <w:p>
@@ -18464,7 +18464,7 @@
           <w:sz w:val="22"/>
           <w:szCs w:val="22"/>
         </w:rPr>
-        <w:t xml:space="preserve">'Amr ibn Shu'ayb rapporte cette du'a complète du Prophète ﷺ. Il enseignait à ses enfants à la dire avant de dormir et dans les situations nocturnes inquiétantes. Cinq refuges en une phrase. Ghadab Allāh — la colère d'Allah. La pire chose qui puisse toucher un humain n'est pas la maladie, ni la mort, ni la pauvreté. C'est la colère divine. Tu te réfugies d'abord contre cela. 'Iqāb Allāh — Son châtiment. Conséquence de la colère. Sharr 'ibādih — le mal de Ses serviteurs. Tous les humains et les djinns. Tous peuvent nuire. Tu cherches refuge contre ce mal-là. Hamazāt ash-shayātīn — les chuchotements des démons. Mot précis. Hamz veut dire pousser, presser, susurrer dans le creux de l'oreille. Les démons ne crient pas — ils chuchotent. Ils insinuent. Ils glissent une idée. Le Prophète ﷺ a dit que Satan parcourt les fils d'Adam comme le sang. Il est en toi. Il chuchote à ton oreille intérieure. Tu te réfugies contre ses hamazāt. An yahdurūn — qu'ils me visitent. C'est-à-dire qu'ils viennent physiquement, qu'ils s'approchent. Demande de protection contre la présence elle-même des démons, pas seulement contre leur action. Cette du'a est précieuse la nuit. Quand tu marches dans la rue à minuit. Quand tu rentres seul. Quand tu croises quelqu'un dont les intentions sont obscures. Le Prophète ﷺ a dit aussi qu'elle protège dans toute situation de peur. Tu peux la dire dans un avion qui tangue. Dans une voiture la nuit sur une route déserte. Dans une chambre d'hôtel inconnue. Elle couvre.</w:t>
+        <w:t xml:space="preserve">'Amr ibn Shu'ayb rapporte cette du'a complète du Prophète ﷺ. Il enseignait à ses enfants à la dire avant de dormir et dans les situations nocturnes inquiétantes. Cinq refuges en une phrase. Ghadab Allah — la colère d'Allah. La pire chose qui puisse toucher un humain n'est pas la maladie, ni la mort, ni la pauvreté. C'est la colère divine. Tu te réfugies d'abord contre cela. 'Iqāb Allah — Son châtiment. Conséquence de la colère. Sharr 'ibādih — le mal de Ses serviteurs. Tous les humains et les djinns. Tous peuvent nuire. Tu cherches refuge contre ce mal-là. Hamazāt ash-shayātīn — les chuchotements des démons. Mot précis. Hamz veut dire pousser, presser, susurrer dans le creux de l'oreille. Les démons ne crient pas — ils chuchotent. Ils insinuent. Ils glissent une idée. Le Prophète ﷺ a dit que Satan parcourt les fils d'Adam comme le sang. Il est en toi. Il chuchote à ton oreille intérieure. Tu te réfugies contre ses hamazāt. An yahdurūn — qu'ils me visitent. C'est-à-dire qu'ils viennent physiquement, qu'ils s'approchent. Demande de protection contre la présence elle-même des démons, pas seulement contre leur action. Cette du'a est précieuse la nuit. Quand tu marches dans la rue à minuit. Quand tu rentres seul. Quand tu croises quelqu'un dont les intentions sont obscures. Le Prophète ﷺ a dit aussi qu'elle protège dans toute situation de peur. Tu peux la dire dans un avion qui tangue. Dans une voiture la nuit sur une route déserte. Dans une chambre d'hôtel inconnue. Elle couvre.</w:t>
       </w:r>
     </w:p>
     <w:p>
@@ -18828,7 +18828,7 @@
           <w:sz w:val="22"/>
           <w:szCs w:val="22"/>
         </w:rPr>
-        <w:t xml:space="preserve">Sa'd ibn Abi Waqqâs rapporte du Prophète ﷺ : celui qui dit en entendant le muezzin proclamer la shahâda — radītu billāhi rabban wa bi'l-islāmi dīnan wa bi-Muhammadin nabiyyan — ses péchés sont pardonnés. On a vu cette du'a au jour 145. Elle revient ici dans un usage particulier — l'adhân entendu loin de chez soi. Cette expérience est marquante pour tout musulman qui voyage. Tu es dans une ville étrangère, peut-être un pays où tu ne t'attendais pas à l'entendre. Et soudain, perché en haut d'un minaret invisible, ou jaillissant d'un haut-parleur, l'appel s'élève. Allāhu akbar, Allāhu akbar. Et tu sens quelque chose remonter. Pas une émotion intellectuelle — quelque chose de plus profond. Tu reconnais. C'est ta voix dans une langue qui n'est pas la tienne. C'est ton chez-toi dans un pays étranger. Cet adhân, qui sonne pareil partout dans le monde depuis quatorze siècles, est l'un des plus grands miracles continus de l'islam. Le Prophète ﷺ a institué ces mots. Et depuis, dans toutes les villes du monde où vivent des musulmans, cinq fois par jour, ces mots sortent. À Médine. À Istanbul. À Paris. À Lagos. À Jakarta. À Marrakech. À Sydney. Continuité absolue. Quand tu l'entends ailleurs, tu reconnais cette continuité. Et tu prononces ces six mots — radītu billāhi rabban, wa bi'l-islāmi dīnan, wa bi-Muhammadin nabiyyan. Tu déclares ton agréation. Tu confirmes ton appartenance. Et Allah pardonne. Cette pratique change le voyage. Au lieu de te sentir étranger, tu te sens chez toi partout où l'adhân résonne.</w:t>
+        <w:t xml:space="preserve">Sa'd ibn Abi Waqqâs rapporte du Prophète ﷺ : celui qui dit en entendant le muezzin proclamer la shahâda — radītu billāhi rabban wa bi'l-islāmi dīnan wa bi-Muhammadin nabiyyan — ses péchés sont pardonnés. On a vu cette du'a au jour 145. Elle revient ici dans un usage particulier — l'adhân entendu loin de chez soi. Cette expérience est marquante pour tout musulman qui voyage. Tu es dans une ville étrangère, peut-être un pays où tu ne t'attendais pas à l'entendre. Et soudain, perché en haut d'un minaret invisible, ou jaillissant d'un haut-parleur, l'appel s'élève. Allahu akbar, Allahu akbar. Et tu sens quelque chose remonter. Pas une émotion intellectuelle — quelque chose de plus profond. Tu reconnais. C'est ta voix dans une langue qui n'est pas la tienne. C'est ton chez-toi dans un pays étranger. Cet adhân, qui sonne pareil partout dans le monde depuis quatorze siècles, est l'un des plus grands miracles continus de l'islam. Le Prophète ﷺ a institué ces mots. Et depuis, dans toutes les villes du monde où vivent des musulmans, cinq fois par jour, ces mots sortent. À Médine. À Istanbul. À Paris. À Lagos. À Jakarta. À Marrakech. À Sydney. Continuité absolue. Quand tu l'entends ailleurs, tu reconnais cette continuité. Et tu prononces ces six mots — radītu billāhi rabban, wa bi'l-islāmi dīnan, wa bi-Muhammadin nabiyyan. Tu déclares ton agréation. Tu confirmes ton appartenance. Et Allah pardonne. Cette pratique change le voyage. Au lieu de te sentir étranger, tu te sens chez toi partout où l'adhân résonne.</w:t>
       </w:r>
     </w:p>
     <w:p>
@@ -19192,7 +19192,7 @@
           <w:sz w:val="22"/>
           <w:szCs w:val="22"/>
         </w:rPr>
-        <w:t xml:space="preserve">Sourate Al-Baqara, verset 127. C'est la prière d'Ibrahim et Ismaël élevant les fondations de la Ka'ba. Rabbanā taqabbal minnā — notre Seigneur, accepte de nous. Deux hommes en pleine construction du temple le plus sacré du monde. Et ils ne sont pas sûrs que leur acte sera accepté. Si Ibrahim et Ismaël ne sont pas sûrs — qui peut l'être ? L'acceptation divine n'est jamais garantie par le mérite de l'acte. Tu peux faire un acte techniquement parfait — sans qu'Allah l'accepte. Pourquoi ? Parce qu'Il regarde le cœur, pas seulement la forme. Et le cœur, tu ne sais pas dans quel état il était vraiment. Tu sais que tu as prié. Tu ne sais pas si ta prière était sincère. Tu sais que tu as donné. Tu ne sais pas si ton don était pur. D'où l'angoisse permanente du serviteur — mes actes ont-ils été acceptés ? Le Coran enseigne qu'au Jour du Compte, certains arriveront avec une montagne de bonnes œuvres — Allah les dispersera comme poussière. Pourquoi ? Parce qu'elles étaient faites pour autre que Lui. La crainte de la non-acceptation est légitime. Cette du'a en est la réponse. Tu ne te rassures pas par toi-même. Tu demandes l'acceptation après chaque acte. Allāhumma taqabbal minnī. Accepte de moi. Pas — j'ai été parfait, c'est sûr. Mais — j'ai fait ce que j'ai pu, accepte. Innaka anta as-samī'u al-'alīm. Tu es Celui qui entend, Celui qui sait. Tu as entendu mes paroles. Tu sais mes intentions. Mieux que moi-même. Donc juge — mais accepte. Cette demande répétée après chaque prière, chaque jeûne, chaque aumône, change la relation à l'acte. Tu cesses de t'enorgueillir de tes actes. Tu cesses aussi de désespérer. Tu remets.</w:t>
+        <w:t xml:space="preserve">Sourate Al-Baqara, verset 127. C'est la prière d'Ibrahim et Ismaël élevant les fondations de la Ka'ba. Rabbanā taqabbal minnā — notre Seigneur, accepte de nous. Deux hommes en pleine construction du temple le plus sacré du monde. Et ils ne sont pas sûrs que leur acte sera accepté. Si Ibrahim et Ismaël ne sont pas sûrs — qui peut l'être ? L'acceptation divine n'est jamais garantie par le mérite de l'acte. Tu peux faire un acte techniquement parfait — sans qu'Allah l'accepte. Pourquoi ? Parce qu'Il regarde le cœur, pas seulement la forme. Et le cœur, tu ne sais pas dans quel état il était vraiment. Tu sais que tu as prié. Tu ne sais pas si ta prière était sincère. Tu sais que tu as donné. Tu ne sais pas si ton don était pur. D'où l'angoisse permanente du serviteur — mes actes ont-ils été acceptés ? Le Coran enseigne qu'au Jour du Compte, certains arriveront avec une montagne de bonnes œuvres — Allah les dispersera comme poussière. Pourquoi ? Parce qu'elles étaient faites pour autre que Lui. La crainte de la non-acceptation est légitime. Cette du'a en est la réponse. Tu ne te rassures pas par toi-même. Tu demandes l'acceptation après chaque acte. Allahumma taqabbal minnī. Accepte de moi. Pas — j'ai été parfait, c'est sûr. Mais — j'ai fait ce que j'ai pu, accepte. Innaka anta as-samī'u al-'alīm. Tu es Celui qui entend, Celui qui sait. Tu as entendu mes paroles. Tu sais mes intentions. Mieux que moi-même. Donc juge — mais accepte. Cette demande répétée après chaque prière, chaque jeûne, chaque aumône, change la relation à l'acte. Tu cesses de t'enorgueillir de tes actes. Tu cesses aussi de désespérer. Tu remets.</w:t>
       </w:r>
     </w:p>
     <w:p>
@@ -19374,7 +19374,7 @@
           <w:sz w:val="22"/>
           <w:szCs w:val="22"/>
         </w:rPr>
-        <w:t xml:space="preserve">Phrase qui s'enracine dans le verset de la sourate Âl 'Imrân — 3:134. Ce verset décrit les qualités des muttaqîn — les pieux. Trois qualités enchaînées. Ils dépensent dans l'aisance et dans la gêne. Ils retiennent leur colère. Et ils pardonnent aux gens. Allah aime les bienfaisants. Pardonner est l'une des trois marques de la piété selon ce verset. Mais c'est aussi la plus dure. Dépenser, on peut s'y forcer. Retenir sa colère, c'est difficile mais possible par discipline. Pardonner — c'est lâcher prise sur une blessure réelle. C'est renoncer à la juste vengeance. C'est libérer celui qui t'a fait du mal. Beaucoup ne pardonnent jamais. Ils gardent rancœur pendant des décennies. Ils meurent avec leurs blessures encore ouvertes. Cette accumulation est un cancer spirituel. Le Prophète ﷺ a dit : Allah n'augmente pas un serviteur en pardon sans qu'Il l'augmente en grandeur. Phrase paradoxale. Tu pardonnes — tu deviens grand. La logique humaine dirait l'inverse — pardonner, c'est abaisser. La logique divine dit — pardonner, c'est s'élever. Cette du'a demande à entrer dans cette catégorie. Pas le pardon facile pour les petites choses — tout le monde fait ça. Le pardon pour les vraies blessures. Pour la trahison. Pour le mensonge. Pour le mal qu'on n'oublie pas. Allāhumma ij'alnī mina alladhīna ya'fūna 'ani an-nās. Et le bénéfice immédiat — wa Allāhu yuhibbu al-muhsinīn. Allah aime les bienfaisants. C'est-à-dire — Lui t'aime. L'amour divin descend sur ceux qui pardonnent. Quel échange. Tu laisses tomber ta rancune envers un humain — tu reçois l'amour du Maître de l'univers. Cette pratique transforme la blessure en porte vers Allah.</w:t>
+        <w:t xml:space="preserve">Phrase qui s'enracine dans le verset de la sourate Âl 'Imrân — 3:134. Ce verset décrit les qualités des muttaqîn — les pieux. Trois qualités enchaînées. Ils dépensent dans l'aisance et dans la gêne. Ils retiennent leur colère. Et ils pardonnent aux gens. Allah aime les bienfaisants. Pardonner est l'une des trois marques de la piété selon ce verset. Mais c'est aussi la plus dure. Dépenser, on peut s'y forcer. Retenir sa colère, c'est difficile mais possible par discipline. Pardonner — c'est lâcher prise sur une blessure réelle. C'est renoncer à la juste vengeance. C'est libérer celui qui t'a fait du mal. Beaucoup ne pardonnent jamais. Ils gardent rancœur pendant des décennies. Ils meurent avec leurs blessures encore ouvertes. Cette accumulation est un cancer spirituel. Le Prophète ﷺ a dit : Allah n'augmente pas un serviteur en pardon sans qu'Il l'augmente en grandeur. Phrase paradoxale. Tu pardonnes — tu deviens grand. La logique humaine dirait l'inverse — pardonner, c'est abaisser. La logique divine dit — pardonner, c'est s'élever. Cette du'a demande à entrer dans cette catégorie. Pas le pardon facile pour les petites choses — tout le monde fait ça. Le pardon pour les vraies blessures. Pour la trahison. Pour le mensonge. Pour le mal qu'on n'oublie pas. Allahumma ij'alnī mina alladhīna ya'fūna 'ani an-nās. Et le bénéfice immédiat — wa Allahu yuhibbu al-muhsinīn. Allah aime les bienfaisants. C'est-à-dire — Lui t'aime. L'amour divin descend sur ceux qui pardonnent. Quel échange. Tu laisses tomber ta rancune envers un humain — tu reçois l'amour du Maître de l'univers. Cette pratique transforme la blessure en porte vers Allah.</w:t>
       </w:r>
     </w:p>
     <w:p>
@@ -19556,7 +19556,7 @@
           <w:sz w:val="22"/>
           <w:szCs w:val="22"/>
         </w:rPr>
-        <w:t xml:space="preserve">Mu'âdh ibn Jabal rapporte que le Prophète ﷺ lui a pris la main un jour et a dit : ô Mu'âdh, par Allah, je t'aime. Mu'âdh, ne manque jamais à la fin de chaque prière de dire cette du'a. Quelle déclaration. Le Prophète ﷺ donne une du'a précieuse précédée par une déclaration d'amour personnelle. Mu'âdh, je t'aime — donc je te donne cette du'a. Trois demandes en parallèle. A'innī 'alā dhikrik — aide-moi à T'évoquer. Pas seulement que je dise Ton nom — que Tu m'aides à le faire. Parce que sans Son aide, on oublie. La constance du dhikr n'est pas une discipline humaine — c'est un don. Tu peux essayer de te discipliner à dire subhāna Allāh tout le temps — tu oublieras. Mais si Allah t'aide, tu deviens dhâkir — quelqu'un qui mentionne. Wa shukrika — et à Te remercier. Pareil. La gratitude n'est pas une compétence — c'est une grâce. Sans Son aide, on oublie même de remercier pour les choses évidentes. Wa husni 'ibādatik — et à bien T'adorer. Husn — la qualité, l'excellence. Pas seulement T'adorer — bien T'adorer. La différence entre adoration et bonne adoration est immense. Tu peux prier toute ta vie sans bien prier. Tu peux jeûner sans bien jeûner. Tu peux donner sans bien donner. Le husn est la qualité qui transforme. Et cette qualité aussi est demandée à Lui. Trois aides demandées qui couvrent toute la vie spirituelle. Évocation, gratitude, bonne adoration. Tu ne peux rien faire de cela par toi-même. Mais avec Son aide, tout est possible.</w:t>
+        <w:t xml:space="preserve">Mu'âdh ibn Jabal rapporte que le Prophète ﷺ lui a pris la main un jour et a dit : ô Mu'âdh, par Allah, je t'aime. Mu'âdh, ne manque jamais à la fin de chaque prière de dire cette du'a. Quelle déclaration. Le Prophète ﷺ donne une du'a précieuse précédée par une déclaration d'amour personnelle. Mu'âdh, je t'aime — donc je te donne cette du'a. Trois demandes en parallèle. A'innī 'alā dhikrik — aide-moi à T'évoquer. Pas seulement que je dise Ton nom — que Tu m'aides à le faire. Parce que sans Son aide, on oublie. La constance du dhikr n'est pas une discipline humaine — c'est un don. Tu peux essayer de te discipliner à dire subhan Allah tout le temps — tu oublieras. Mais si Allah t'aide, tu deviens dhâkir — quelqu'un qui mentionne. Wa shukrika — et à Te remercier. Pareil. La gratitude n'est pas une compétence — c'est une grâce. Sans Son aide, on oublie même de remercier pour les choses évidentes. Wa husni 'ibādatik — et à bien T'adorer. Husn — la qualité, l'excellence. Pas seulement T'adorer — bien T'adorer. La différence entre adoration et bonne adoration est immense. Tu peux prier toute ta vie sans bien prier. Tu peux jeûner sans bien jeûner. Tu peux donner sans bien donner. Le husn est la qualité qui transforme. Et cette qualité aussi est demandée à Lui. Trois aides demandées qui couvrent toute la vie spirituelle. Évocation, gratitude, bonne adoration. Tu ne peux rien faire de cela par toi-même. Mais avec Son aide, tout est possible.</w:t>
       </w:r>
     </w:p>
     <w:p>
@@ -20284,7 +20284,7 @@
           <w:sz w:val="22"/>
           <w:szCs w:val="22"/>
         </w:rPr>
-        <w:t xml:space="preserve">Abu Mâlik al-Ash'arî rapporte du Prophète ﷺ. Phrase remarquable qui combine entrée et sortie en une seule formule. Bismillāhi walajnā — au nom d'Allah nous sommes entrés. Walaj veut dire pénétrer, entrer profondément. Tu rentres chez toi en nommant Allah. Bismillāhi kharajnā — au nom d'Allah nous sommes sortis. Kharaj — sortir. Mais ici, étrange — tu mentionnes la sortie dans la même phrase que l'entrée. Pourquoi ? Parce que la phrase boucle. Chaque entrée est précédée d'une sortie. Tu entres maintenant chez toi parce que tu en es sorti tout à l'heure. Et tu sortiras à nouveau plus tard. Cette circulation entrée-sortie est ta journée entière. Le Prophète ﷺ enseigne à la nommer entièrement par cette phrase qui contient les deux. Wa 'alā Allāhi rabbinā tawakkalnā — et en Allah notre Seigneur nous avons placé notre confiance. Phrase qui boucle la pratique. Tu reconnais que l'entrée et la sortie ne sont pas par ta volonté seule — elles sont par Sa permission. Tu as confié à Lui le mouvement entier. Cette du'a est précieuse pour la fin de journée. Tu rentres. Souvent fatigué. Souvent préoccupé. Tu peux jeter ton sac et te poser sans une parole. Le Prophète ﷺ enseigne autre chose. Tu nommes l'entrée. Tu nommes les sorties qui ont précédé. Tu confies l'ensemble à Allah. Et ce simple geste rituel ferme la journée extérieure et ouvre la soirée intérieure. La maison redevient sacrée parce que tu y entres en nommant. Sans cette nomination, la maison est juste un lieu de stockage de tes affaires. Avec elle, c'est ton refuge spirituel. Cette pratique change le rapport au lieu de vie.</w:t>
+        <w:t xml:space="preserve">Abu Mâlik al-Ash'arî rapporte du Prophète ﷺ. Phrase remarquable qui combine entrée et sortie en une seule formule. Bismillahi walajnā — au nom d'Allah nous sommes entrés. Walaj veut dire pénétrer, entrer profondément. Tu rentres chez toi en nommant Allah. Bismillahi kharajnā — au nom d'Allah nous sommes sortis. Kharaj — sortir. Mais ici, étrange — tu mentionnes la sortie dans la même phrase que l'entrée. Pourquoi ? Parce que la phrase boucle. Chaque entrée est précédée d'une sortie. Tu entres maintenant chez toi parce que tu en es sorti tout à l'heure. Et tu sortiras à nouveau plus tard. Cette circulation entrée-sortie est ta journée entière. Le Prophète ﷺ enseigne à la nommer entièrement par cette phrase qui contient les deux. Wa 'alā Allahi rabbinā tawakkalnā — et en Allah notre Seigneur nous avons placé notre confiance. Phrase qui boucle la pratique. Tu reconnais que l'entrée et la sortie ne sont pas par ta volonté seule — elles sont par Sa permission. Tu as confié à Lui le mouvement entier. Cette du'a est précieuse pour la fin de journée. Tu rentres. Souvent fatigué. Souvent préoccupé. Tu peux jeter ton sac et te poser sans une parole. Le Prophète ﷺ enseigne autre chose. Tu nommes l'entrée. Tu nommes les sorties qui ont précédé. Tu confies l'ensemble à Allah. Et ce simple geste rituel ferme la journée extérieure et ouvre la soirée intérieure. La maison redevient sacrée parce que tu y entres en nommant. Sans cette nomination, la maison est juste un lieu de stockage de tes affaires. Avec elle, c'est ton refuge spirituel. Cette pratique change le rapport au lieu de vie.</w:t>
       </w:r>
     </w:p>
     <w:p>
@@ -20830,7 +20830,7 @@
           <w:sz w:val="22"/>
           <w:szCs w:val="22"/>
         </w:rPr>
-        <w:t xml:space="preserve">Hasan al-Basrî rapporte du Prophète ﷺ cette formule de félicitation pour les naissances. Elle est précieuse parce qu'elle remplace les formules creuses modernes — bravo, félicitations, beau bébé — par une invocation complète. Quatre demandes en une phrase. Première — bāraka Allāhu laka fī al-mawhūb. Qu'Allah te bénisse dans le don reçu. Le mot mawhūb — ce qui est donné. Tu nommes l'enfant comme un don. Pas comme un produit de ta volonté. Pas comme un projet de vie. Un don. Et tu demandes la baraka sur ce don. Que cet enfant porte du bien dans la vie de la famille, pas seulement de la fatigue. Deuxième — wa shakarta al-Wāhib. Et que tu remercies Celui qui donne. Tu rappelles au nouveau parent que la gratitude est due. L'enfant n'est pas tombé du ciel par hasard. Quelqu'un l'a donné. Et Celui qui a donné mérite la reconnaissance. Beaucoup de parents oublient cela. Ils se réjouissent de l'enfant et oublient le Donateur. Cette du'a rappelle. Troisième — wa balagha ashuddah. Qu'il atteigne sa maturité. Beaucoup d'enfants ne survivent pas à l'enfance. La mortalité infantile était écrasante dans l'histoire humaine, et reste réelle dans beaucoup de régions. Tu demandes que cet enfant tienne. Qu'il grandisse. Qu'il devienne adulte. Quatrième — wa ruziqta birrah. Que tu sois pourvu de sa piété filiale. Le birr — la piété envers les parents — est l'une des qualités les plus précieuses d'un enfant. Combien d'enfants se retournent contre leurs parents à l'adolescence ou à l'âge adulte ? Beaucoup. Cette du'a demande la piété filiale comme don à recevoir. Et la phrase ferme la boucle — du don reçu (l'enfant) à un autre don à venir (sa piété pour toi). Cette formule est l'antithèse du sentimentalisme moderne. Elle est élégante, juste, vraie.</w:t>
+        <w:t xml:space="preserve">Hasan al-Basrî rapporte du Prophète ﷺ cette formule de félicitation pour les naissances. Elle est précieuse parce qu'elle remplace les formules creuses modernes — bravo, félicitations, beau bébé — par une invocation complète. Quatre demandes en une phrase. Première — bāraka Allahu laka fī al-mawhūb. Qu'Allah te bénisse dans le don reçu. Le mot mawhūb — ce qui est donné. Tu nommes l'enfant comme un don. Pas comme un produit de ta volonté. Pas comme un projet de vie. Un don. Et tu demandes la baraka sur ce don. Que cet enfant porte du bien dans la vie de la famille, pas seulement de la fatigue. Deuxième — wa shakarta al-Wāhib. Et que tu remercies Celui qui donne. Tu rappelles au nouveau parent que la gratitude est due. L'enfant n'est pas tombé du ciel par hasard. Quelqu'un l'a donné. Et Celui qui a donné mérite la reconnaissance. Beaucoup de parents oublient cela. Ils se réjouissent de l'enfant et oublient le Donateur. Cette du'a rappelle. Troisième — wa balagha ashuddah. Qu'il atteigne sa maturité. Beaucoup d'enfants ne survivent pas à l'enfance. La mortalité infantile était écrasante dans l'histoire humaine, et reste réelle dans beaucoup de régions. Tu demandes que cet enfant tienne. Qu'il grandisse. Qu'il devienne adulte. Quatrième — wa ruziqta birrah. Que tu sois pourvu de sa piété filiale. Le birr — la piété envers les parents — est l'une des qualités les plus précieuses d'un enfant. Combien d'enfants se retournent contre leurs parents à l'adolescence ou à l'âge adulte ? Beaucoup. Cette du'a demande la piété filiale comme don à recevoir. Et la phrase ferme la boucle — du don reçu (l'enfant) à un autre don à venir (sa piété pour toi). Cette formule est l'antithèse du sentimentalisme moderne. Elle est élégante, juste, vraie.</w:t>
       </w:r>
     </w:p>
     <w:p>
@@ -21649,7 +21649,7 @@
           <w:sz w:val="22"/>
           <w:szCs w:val="22"/>
         </w:rPr>
-        <w:t xml:space="preserve">Phrase libre qui s'enracine dans le verset coranique At-Tawba 9:100 où Allah dit qu'Il est satisfait des premiers émigrés et auxiliaires, et que eux sont satisfaits de Lui. Les compagnons du Prophète ﷺ — les sahāba — sont les hommes et femmes qui ont vu le Prophète ﷺ en étant musulmans. Ils ont reçu la révélation en direct. Ils ont vu le Coran descendre. Ils ont entendu les hadiths de la bouche du Prophète ﷺ. Et ils ont transmis tout cela. Sans eux, l'islam ne serait pas arrivé jusqu'à nous. Tu leur dois ta religion. Cette dette est immense. Et le minimum est de prier pour eux. La phrase radia Allāhu 'anh — qu'Allah soit satisfait de lui — est ajoutée traditionnellement après le nom de chaque compagnon mentionné. Cette pratique honore. Mais on peut faire plus que les nommer un par un. On peut prier pour eux en bloc, comme communauté précieuse. Cette du'a fait cela. Deux demandes. Première — irda 'ani as-sahābah. Sois satisfait des compagnons. Tu demandes l'agrément divin sur eux. C'est-à-dire la plus haute station possible. Allah satisfait d'eux — donc eux satisfaits de Lui — donc proches de Lui dans le Paradis. Tu réclames cette double satisfaction pour ceux à qui tu dois ta religion. Deuxième — waj'alnī muttabi'an li-hadyihim. Fais de moi quelqu'un qui suit leur guidance. Tu ne te contentes pas de les honorer en parole. Tu demandes à les imiter en pratique. Suivre leur hady — leur orientation, leur exemple, leur manière de vivre l'islam. Les compagnons ont vécu un islam pur, simple, intense, sans complications théologiques tardives. Tu demandes à les imiter. Cette demande te place dans la lignée des ahl as-sunnah qui ont toujours fait des compagnons leur référence après le Prophète ﷺ.</w:t>
+        <w:t xml:space="preserve">Phrase libre qui s'enracine dans le verset coranique At-Tawba 9:100 où Allah dit qu'Il est satisfait des premiers émigrés et auxiliaires, et que eux sont satisfaits de Lui. Les compagnons du Prophète ﷺ — les sahāba — sont les hommes et femmes qui ont vu le Prophète ﷺ en étant musulmans. Ils ont reçu la révélation en direct. Ils ont vu le Coran descendre. Ils ont entendu les hadiths de la bouche du Prophète ﷺ. Et ils ont transmis tout cela. Sans eux, l'islam ne serait pas arrivé jusqu'à nous. Tu leur dois ta religion. Cette dette est immense. Et le minimum est de prier pour eux. La phrase radia Allahu 'anh — qu'Allah soit satisfait de lui — est ajoutée traditionnellement après le nom de chaque compagnon mentionné. Cette pratique honore. Mais on peut faire plus que les nommer un par un. On peut prier pour eux en bloc, comme communauté précieuse. Cette du'a fait cela. Deux demandes. Première — irda 'ani as-sahābah. Sois satisfait des compagnons. Tu demandes l'agrément divin sur eux. C'est-à-dire la plus haute station possible. Allah satisfait d'eux — donc eux satisfaits de Lui — donc proches de Lui dans le Paradis. Tu réclames cette double satisfaction pour ceux à qui tu dois ta religion. Deuxième — waj'alnī muttabi'an li-hadyihim. Fais de moi quelqu'un qui suit leur guidance. Tu ne te contentes pas de les honorer en parole. Tu demandes à les imiter en pratique. Suivre leur hady — leur orientation, leur exemple, leur manière de vivre l'islam. Les compagnons ont vécu un islam pur, simple, intense, sans complications théologiques tardives. Tu demandes à les imiter. Cette demande te place dans la lignée des ahl as-sunnah qui ont toujours fait des compagnons leur référence après le Prophète ﷺ.</w:t>
       </w:r>
     </w:p>
     <w:p>
@@ -22013,7 +22013,7 @@
           <w:sz w:val="22"/>
           <w:szCs w:val="22"/>
         </w:rPr>
-        <w:t xml:space="preserve">Phrase libre qui s'enracine dans une des dimensions les plus hautes de l'éthique islamique. Pardonner à quelqu'un qui demande pardon est déjà difficile — mais accessible. Pardonner à quelqu'un qui ne demande même pas pardon — qui ne reconnaît pas son tort — qui continue peut-être à nuire — c'est l'épreuve la plus haute. Pourtant le Coran y invite. Allah dit dans la sourate Ash-Shûrâ : la rétribution d'un mal est un mal équivalent. Mais celui qui pardonne et améliore — sa récompense incombe à Allah. Verset précieux. La justice horizontale dit — œil pour œil. L'islam la permet, mais ne la recommande pas. Il invite à mieux — pardonner et améliorer. Et la récompense de cet acte supérieur, Allah Lui-même la prend en charge — 'alā Allāh. Phrase saisissante. Quand toi tu pardonnes au-delà de ce qui t'est dû, Allah se substitue à la dette. Tu deviens Son créancier. Cette logique est vertigineuse. Mais elle est exigeante. Pardonner à celui qui ne demande pas pardon n'est pas naturel. Il faut une force qui dépasse l'ego. Cette force, tu la demandes à Allah. Première phrase — alhimnī an a'fuwa 'amman lam yatlub 'afwī. Inspire-moi de pardonner à celui qui ne m'a pas demandé pardon. Le verbe ilhām — inspiration. Tu ne peux pas le décider — Lui doit le mettre en toi. Deuxième phrase — rajā'a 'afwika 'annī. Espérant Ton pardon pour moi. Tu donnes la raison. Tu pardonnes pour qu'Il pardonne. Tu fais ce que tu attends de Lui. Logique miroir. Le Prophète ﷺ a dit que celui qui ne fait pas miséricorde aux gens, Allah ne lui fait pas miséricorde. Inversement, celui qui fait miséricorde, reçoit la miséricorde. Tu pardonnes — tu reçois pardon. Tu maintiens la rancœur — la rancœur te maintient.</w:t>
+        <w:t xml:space="preserve">Phrase libre qui s'enracine dans une des dimensions les plus hautes de l'éthique islamique. Pardonner à quelqu'un qui demande pardon est déjà difficile — mais accessible. Pardonner à quelqu'un qui ne demande même pas pardon — qui ne reconnaît pas son tort — qui continue peut-être à nuire — c'est l'épreuve la plus haute. Pourtant le Coran y invite. Allah dit dans la sourate Ash-Shûrâ : la rétribution d'un mal est un mal équivalent. Mais celui qui pardonne et améliore — sa récompense incombe à Allah. Verset précieux. La justice horizontale dit — œil pour œil. L'islam la permet, mais ne la recommande pas. Il invite à mieux — pardonner et améliorer. Et la récompense de cet acte supérieur, Allah Lui-même la prend en charge — 'alā Allah. Phrase saisissante. Quand toi tu pardonnes au-delà de ce qui t'est dû, Allah se substitue à la dette. Tu deviens Son créancier. Cette logique est vertigineuse. Mais elle est exigeante. Pardonner à celui qui ne demande pas pardon n'est pas naturel. Il faut une force qui dépasse l'ego. Cette force, tu la demandes à Allah. Première phrase — alhimnī an a'fuwa 'amman lam yatlub 'afwī. Inspire-moi de pardonner à celui qui ne m'a pas demandé pardon. Le verbe ilhām — inspiration. Tu ne peux pas le décider — Lui doit le mettre en toi. Deuxième phrase — rajā'a 'afwika 'annī. Espérant Ton pardon pour moi. Tu donnes la raison. Tu pardonnes pour qu'Il pardonne. Tu fais ce que tu attends de Lui. Logique miroir. Le Prophète ﷺ a dit que celui qui ne fait pas miséricorde aux gens, Allah ne lui fait pas miséricorde. Inversement, celui qui fait miséricorde, reçoit la miséricorde. Tu pardonnes — tu reçois pardon. Tu maintiens la rancœur — la rancœur te maintient.</w:t>
       </w:r>
     </w:p>
     <w:p>
@@ -22377,7 +22377,7 @@
           <w:sz w:val="22"/>
           <w:szCs w:val="22"/>
         </w:rPr>
-        <w:t xml:space="preserve">Umm Salama rapporte du Prophète ﷺ : aucun musulman touché par un malheur ne dit ce qu'Allah a ordonné — Innā lillāhi wa innā ilayhi rāji'ūn. Allāhumma ajurnī fī musībatī wa akhlif lī khayran minhā — sans qu'Allah lui accorde mieux en remplacement. Et elle raconte sa propre histoire — son mari Abu Salama est mort. Elle a dit cette du'a en pleurant. Et elle ajoute : et qui peut être meilleur qu'Abu Salama pour moi ? Quelques mois plus tard, le Prophète ﷺ Lui-même est venu la demander en mariage. Allah avait accordé mieux. Promesse extraordinaire. Cette phrase précise, dite après un malheur sincèrement, déclenche le remplacement. Allah s'engage à donner mieux. Pas la même chose. Mieux. Trois mouvements dans la phrase. Premier — innā lillāhi wa innā ilayhi rāji'ūn. Nous sommes à Allah et nous retournons à Lui. Verset du Coran (2:156). C'est l'aveu théologique. Tu reconnais que tout ce qui t'a été donné appartient à Allah — y compris la personne perdue. Lui la reprend. Lui en a le droit. Deuxième — Allāhumma ajurnī fī musībatī. Accorde-moi récompense dans mon malheur. Tu demandes la conversion du malheur en récompense. Pas la suppression du malheur — il est arrivé. Mais que ce malheur produise de la récompense pour toi. Allah peut convertir le malheur en gain spirituel. Troisième — wa akhlif lī khayran minhā. Et remplace-le par mieux. Demande explicite du remplacement supérieur. Ce verbe akhlafa — donner en remplacement — est précisément ce qui déclenche la promesse. Tu Lui demandes ce qu'Il a promis de donner. Cette du'a est l'antidote à tous les deuils.</w:t>
+        <w:t xml:space="preserve">Umm Salama rapporte du Prophète ﷺ : aucun musulman touché par un malheur ne dit ce qu'Allah a ordonné — Innā lillāhi wa innā ilayhi rāji'ūn. Allahumma ajurnī fī musībatī wa akhlif lī khayran minhā — sans qu'Allah lui accorde mieux en remplacement. Et elle raconte sa propre histoire — son mari Abu Salama est mort. Elle a dit cette du'a en pleurant. Et elle ajoute : et qui peut être meilleur qu'Abu Salama pour moi ? Quelques mois plus tard, le Prophète ﷺ Lui-même est venu la demander en mariage. Allah avait accordé mieux. Promesse extraordinaire. Cette phrase précise, dite après un malheur sincèrement, déclenche le remplacement. Allah s'engage à donner mieux. Pas la même chose. Mieux. Trois mouvements dans la phrase. Premier — innā lillāhi wa innā ilayhi rāji'ūn. Nous sommes à Allah et nous retournons à Lui. Verset du Coran (2:156). C'est l'aveu théologique. Tu reconnais que tout ce qui t'a été donné appartient à Allah — y compris la personne perdue. Lui la reprend. Lui en a le droit. Deuxième — Allahumma ajurnī fī musībatī. Accorde-moi récompense dans mon malheur. Tu demandes la conversion du malheur en récompense. Pas la suppression du malheur — il est arrivé. Mais que ce malheur produise de la récompense pour toi. Allah peut convertir le malheur en gain spirituel. Troisième — wa akhlif lī khayran minhā. Et remplace-le par mieux. Demande explicite du remplacement supérieur. Ce verbe akhlafa — donner en remplacement — est précisément ce qui déclenche la promesse. Tu Lui demandes ce qu'Il a promis de donner. Cette du'a est l'antidote à tous les deuils.</w:t>
       </w:r>
     </w:p>
     <w:p>
@@ -22559,7 +22559,7 @@
           <w:sz w:val="22"/>
           <w:szCs w:val="22"/>
         </w:rPr>
-        <w:t xml:space="preserve">Phrase coranique tirée de la sourate An-Nisâ', verset 69. Le Coran décrit là les quatre catégories des bienheureux. Les prophètes — ceux qu'Allah a envoyés avec Sa parole. Les véridiques (siddīqīn) — les premiers compagnons des prophètes qui ont cru sans hésiter, comme Abu Bakr. Les martyrs (shuhadā') — ceux qui sont morts en témoignant la foi. Les vertueux (sālihīn) — ceux qui ont vécu droit, sans avoir atteint les trois premiers rangs. Ces quatre catégories forment l'élite des élus. Et le Coran promet que ceux qui obéissent à Allah et au Messager seront avec eux. Promesse vertigineuse. Tu peux, toi, simple croyant ordinaire, être en compagnie des prophètes au Paradis. Pas comme prophète — ils gardent leur rang. Mais dans leur compagnie. Dans leur cercle. Dans leur conversation. Combien est extraordinaire cette perspective. Tu pourrais converser avec Ibrahim, Mûsâ, Issa, Muhammad ﷺ. Tu pourrais voir leur visage, écouter leur parole, vivre dans leur lumière. Cette promesse, le Coran l'expose précisément pour que les croyants la demandent et la vivent. Cette du'a est la formulation directe de cette demande. Tu te places dans le verset. Tu réclames ce qu'Allah a promis. Allāhumma 'hshurnī ma'a alladhīna an'amta 'alayhim. Rassemble-moi avec ceux que Tu as comblés. Demande haute, juste, fondée sur Sa propre parole. Cette du'a est précieuse à toute fin de vie. Pour quelqu'un qui sent la fin approcher, elle pose le cadre final. Tu meurs avec dans le cœur le souhait de retrouver les meilleurs. Allah peut accorder.</w:t>
+        <w:t xml:space="preserve">Phrase coranique tirée de la sourate An-Nisâ', verset 69. Le Coran décrit là les quatre catégories des bienheureux. Les prophètes — ceux qu'Allah a envoyés avec Sa parole. Les véridiques (siddīqīn) — les premiers compagnons des prophètes qui ont cru sans hésiter, comme Abu Bakr. Les martyrs (shuhadā') — ceux qui sont morts en témoignant la foi. Les vertueux (sālihīn) — ceux qui ont vécu droit, sans avoir atteint les trois premiers rangs. Ces quatre catégories forment l'élite des élus. Et le Coran promet que ceux qui obéissent à Allah et au Messager seront avec eux. Promesse vertigineuse. Tu peux, toi, simple croyant ordinaire, être en compagnie des prophètes au Paradis. Pas comme prophète — ils gardent leur rang. Mais dans leur compagnie. Dans leur cercle. Dans leur conversation. Combien est extraordinaire cette perspective. Tu pourrais converser avec Ibrahim, Mûsâ, Issa, Muhammad ﷺ. Tu pourrais voir leur visage, écouter leur parole, vivre dans leur lumière. Cette promesse, le Coran l'expose précisément pour que les croyants la demandent et la vivent. Cette du'a est la formulation directe de cette demande. Tu te places dans le verset. Tu réclames ce qu'Allah a promis. Allahumma 'hshurnī ma'a alladhīna an'amta 'alayhim. Rassemble-moi avec ceux que Tu as comblés. Demande haute, juste, fondée sur Sa propre parole. Cette du'a est précieuse à toute fin de vie. Pour quelqu'un qui sent la fin approcher, elle pose le cadre final. Tu meurs avec dans le cœur le souhait de retrouver les meilleurs. Allah peut accorder.</w:t>
       </w:r>
     </w:p>
     <w:p>
@@ -23014,7 +23014,7 @@
           <w:sz w:val="22"/>
           <w:szCs w:val="22"/>
         </w:rPr>
-        <w:t xml:space="preserve">Du'a directement rapportée du Prophète ﷺ par Ammâr ibn Yâsir. C'est l'une des invocations les plus hautes du corpus prophétique. Elle vise le sommet absolu — la vision d'Allah au Paradis. La vision d'Allah — ru'yat Allāh — est la grâce suprême promise aux croyants au Paradis. Le Coran y fait référence : sur leurs visages ce jour-là il y aura la radiance, ils regarderont vers leur Seigneur. Verset précieux qui établit la doctrine. Et le Prophète ﷺ a dit qu'au Paradis, on verra Allah comme on voit la pleine lune sans nuage — clairement, distinctement, sans peine. Cette vision sera, selon de nombreux hadiths, la plus grande joie du Paradis. Plus grande que tout ce que le Paradis contient de jardins, fontaines, demeures, compagnons. La vision divine éclipse tout le reste. Voir Allah une fois — un instant — dépasse tout ce qu'un humain peut concevoir comme bonheur. Cette du'a demande cela. Première phrase — ladhdhata an-nazari ilā wajhik. La douceur de regarder Ton visage. Le mot ladhdha — délice, douceur intense. Tu demandes la jouissance de la vision. Pas juste voir — savourer la vision. Deuxième phrase — wa ash-shawqa ilā liqā'ik. Le désir ardent de Te rencontrer. Demande remarquable. Tu ne demandes pas seulement la rencontre. Tu demandes le shawq — le désir ardent. Pourquoi ? Parce que le désir lui-même est précieux. Sans désir, la rencontre serait moins douce. Le shawq prépare. Il oriente toute la vie. Quelqu'un qui désire ardemment rencontrer Allah ne peut pas vivre comme quelqu'un qui ne le désire pas. Le shawq est aussi grâce. Tu le demandes. Cette du'a est l'une des plus hautes que tu puisses prononcer. Au seuil de la fin du parcours, elle prend tout son sens.</w:t>
+        <w:t xml:space="preserve">Du'a directement rapportée du Prophète ﷺ par Ammâr ibn Yâsir. C'est l'une des invocations les plus hautes du corpus prophétique. Elle vise le sommet absolu — la vision d'Allah au Paradis. La vision d'Allah — ru'yat Allah — est la grâce suprême promise aux croyants au Paradis. Le Coran y fait référence : sur leurs visages ce jour-là il y aura la radiance, ils regarderont vers leur Seigneur. Verset précieux qui établit la doctrine. Et le Prophète ﷺ a dit qu'au Paradis, on verra Allah comme on voit la pleine lune sans nuage — clairement, distinctement, sans peine. Cette vision sera, selon de nombreux hadiths, la plus grande joie du Paradis. Plus grande que tout ce que le Paradis contient de jardins, fontaines, demeures, compagnons. La vision divine éclipse tout le reste. Voir Allah une fois — un instant — dépasse tout ce qu'un humain peut concevoir comme bonheur. Cette du'a demande cela. Première phrase — ladhdhata an-nazari ilā wajhik. La douceur de regarder Ton visage. Le mot ladhdha — délice, douceur intense. Tu demandes la jouissance de la vision. Pas juste voir — savourer la vision. Deuxième phrase — wa ash-shawqa ilā liqā'ik. Le désir ardent de Te rencontrer. Demande remarquable. Tu ne demandes pas seulement la rencontre. Tu demandes le shawq — le désir ardent. Pourquoi ? Parce que le désir lui-même est précieux. Sans désir, la rencontre serait moins douce. Le shawq prépare. Il oriente toute la vie. Quelqu'un qui désire ardemment rencontrer Allah ne peut pas vivre comme quelqu'un qui ne le désire pas. Le shawq est aussi grâce. Tu le demandes. Cette du'a est l'une des plus hautes que tu puisses prononcer. Au seuil de la fin du parcours, elle prend tout son sens.</w:t>
       </w:r>
     </w:p>
     <w:p>

</xml_diff>